<commit_message>
Update idRanges in app.json to extend the upper limit from 67148 to 50091
</commit_message>
<xml_diff>
--- a/ReportLayout/CustomerStatement.docx
+++ b/ReportLayout/CustomerStatement.docx
@@ -8,9 +8,9 @@
           <w:rFonts w:ascii="Segoe UI" w:hAnsi="Segoe UI" w:cs="Segoe UI"/>
         </w:rPr>
         <w:alias w:val="#Nav: /Customer"/>
-        <w:tag w:val="#Nav: CustomerStatement_Fairmont/67148"/>
+        <w:tag w:val="#Nav: CustomerStatement_Fairmont/50091"/>
         <w:id w:val="143635166"/>
-        <w15:dataBinding w:prefixMappings="xmlns:ns0='urn:microsoft-dynamics-nav/reports/CustomerStatement_Fairmont/67148/'" w:xpath="/ns0:NavWordReportXmlPart[1]/ns0:Customer" w:storeItemID="{E71A5C94-9D23-45CB-8C8A-976D20B4B572}"/>
+        <w15:dataBinding w:prefixMappings="xmlns:ns0='urn:microsoft-dynamics-nav/reports/CustomerStatement_Fairmont/50091/'" w:xpath="/ns0:NavWordReportXmlPart[1]/ns0:Customer" w:storeItemID="{E71A5C94-9D23-45CB-8C8A-976D20B4B572}"/>
         <w15:repeatingSection/>
       </w:sdtPr>
       <w:sdtContent>
@@ -77,12 +77,12 @@
                           <w:szCs w:val="16"/>
                         </w:rPr>
                         <w:alias w:val="#Nav: /Customer/Integer/DocDateCaption"/>
-                        <w:tag w:val="#Nav: CustomerStatement_Fairmont/67148"/>
+                        <w:tag w:val="#Nav: CustomerStatement_Fairmont/50091"/>
                         <w:id w:val="295188609"/>
                         <w:placeholder>
                           <w:docPart w:val="AFE0B840A07F454EA9F4AF42DE77CCF4"/>
                         </w:placeholder>
-                        <w:dataBinding w:prefixMappings="xmlns:ns0='urn:microsoft-dynamics-nav/reports/CustomerStatement_Fairmont/67148/'" w:xpath="/ns0:NavWordReportXmlPart[1]/ns0:Customer[1]/ns0:Integer[1]/ns0:DocDateCaption[1]" w:storeItemID="{E71A5C94-9D23-45CB-8C8A-976D20B4B572}"/>
+                        <w:dataBinding w:prefixMappings="xmlns:ns0='urn:microsoft-dynamics-nav/reports/CustomerStatement_Fairmont/50091/'" w:xpath="/ns0:NavWordReportXmlPart[1]/ns0:Customer[1]/ns0:Integer[1]/ns0:DocDateCaption[1]" w:storeItemID="{E71A5C94-9D23-45CB-8C8A-976D20B4B572}"/>
                         <w:text/>
                       </w:sdtPr>
                       <w:sdtContent>
@@ -134,12 +134,12 @@
                           <w:szCs w:val="16"/>
                         </w:rPr>
                         <w:alias w:val="#Nav: /Customer/Integer/TodayFormatted"/>
-                        <w:tag w:val="#Nav: CustomerStatement_Fairmont/67148"/>
+                        <w:tag w:val="#Nav: CustomerStatement_Fairmont/50091"/>
                         <w:id w:val="-2087989077"/>
                         <w:placeholder>
                           <w:docPart w:val="AFE0B840A07F454EA9F4AF42DE77CCF4"/>
                         </w:placeholder>
-                        <w:dataBinding w:prefixMappings="xmlns:ns0='urn:microsoft-dynamics-nav/reports/CustomerStatement_Fairmont/67148/'" w:xpath="/ns0:NavWordReportXmlPart[1]/ns0:Customer[1]/ns0:Integer[1]/ns0:TodayFormatted[1]" w:storeItemID="{E71A5C94-9D23-45CB-8C8A-976D20B4B572}"/>
+                        <w:dataBinding w:prefixMappings="xmlns:ns0='urn:microsoft-dynamics-nav/reports/CustomerStatement_Fairmont/50091/'" w:xpath="/ns0:NavWordReportXmlPart[1]/ns0:Customer[1]/ns0:Integer[1]/ns0:TodayFormatted[1]" w:storeItemID="{E71A5C94-9D23-45CB-8C8A-976D20B4B572}"/>
                         <w:text/>
                       </w:sdtPr>
                       <w:sdtContent>
@@ -179,12 +179,12 @@
                           <w:szCs w:val="16"/>
                         </w:rPr>
                         <w:alias w:val="#Nav: /Customer/Integer/StatementCaption"/>
-                        <w:tag w:val="#Nav: CustomerStatement_Fairmont/67148"/>
+                        <w:tag w:val="#Nav: CustomerStatement_Fairmont/50091"/>
                         <w:id w:val="-1095396463"/>
                         <w:placeholder>
                           <w:docPart w:val="AFE0B840A07F454EA9F4AF42DE77CCF4"/>
                         </w:placeholder>
-                        <w:dataBinding w:prefixMappings="xmlns:ns0='urn:microsoft-dynamics-nav/reports/CustomerStatement_Fairmont/67148/'" w:xpath="/ns0:NavWordReportXmlPart[1]/ns0:Customer[1]/ns0:Integer[1]/ns0:StatementCaption[1]" w:storeItemID="{E71A5C94-9D23-45CB-8C8A-976D20B4B572}"/>
+                        <w:dataBinding w:prefixMappings="xmlns:ns0='urn:microsoft-dynamics-nav/reports/CustomerStatement_Fairmont/50091/'" w:xpath="/ns0:NavWordReportXmlPart[1]/ns0:Customer[1]/ns0:Integer[1]/ns0:StatementCaption[1]" w:storeItemID="{E71A5C94-9D23-45CB-8C8A-976D20B4B572}"/>
                         <w:text/>
                       </w:sdtPr>
                       <w:sdtContent>
@@ -236,12 +236,12 @@
                           <w:szCs w:val="16"/>
                         </w:rPr>
                         <w:alias w:val="#Nav: /Customer/Integer/LastStatmntNo_Cust"/>
-                        <w:tag w:val="#Nav: CustomerStatement_Fairmont/67148"/>
+                        <w:tag w:val="#Nav: CustomerStatement_Fairmont/50091"/>
                         <w:id w:val="1269893032"/>
                         <w:placeholder>
                           <w:docPart w:val="AFE0B840A07F454EA9F4AF42DE77CCF4"/>
                         </w:placeholder>
-                        <w:dataBinding w:prefixMappings="xmlns:ns0='urn:microsoft-dynamics-nav/reports/CustomerStatement_Fairmont/67148/'" w:xpath="/ns0:NavWordReportXmlPart[1]/ns0:Customer[1]/ns0:Integer[1]/ns0:LastStatmntNo_Cust[1]" w:storeItemID="{E71A5C94-9D23-45CB-8C8A-976D20B4B572}"/>
+                        <w:dataBinding w:prefixMappings="xmlns:ns0='urn:microsoft-dynamics-nav/reports/CustomerStatement_Fairmont/50091/'" w:xpath="/ns0:NavWordReportXmlPart[1]/ns0:Customer[1]/ns0:Integer[1]/ns0:LastStatmntNo_Cust[1]" w:storeItemID="{E71A5C94-9D23-45CB-8C8A-976D20B4B572}"/>
                         <w:text/>
                       </w:sdtPr>
                       <w:sdtContent>
@@ -281,12 +281,12 @@
                           <w:szCs w:val="16"/>
                         </w:rPr>
                         <w:alias w:val="#Nav: /Customer/Integer/StartDateCaption"/>
-                        <w:tag w:val="#Nav: CustomerStatement_Fairmont/67148"/>
+                        <w:tag w:val="#Nav: CustomerStatement_Fairmont/50091"/>
                         <w:id w:val="1307980933"/>
                         <w:placeholder>
                           <w:docPart w:val="AFE0B840A07F454EA9F4AF42DE77CCF4"/>
                         </w:placeholder>
-                        <w:dataBinding w:prefixMappings="xmlns:ns0='urn:microsoft-dynamics-nav/reports/CustomerStatement_Fairmont/67148/'" w:xpath="/ns0:NavWordReportXmlPart[1]/ns0:Customer[1]/ns0:Integer[1]/ns0:StartDateCaption[1]" w:storeItemID="{E71A5C94-9D23-45CB-8C8A-976D20B4B572}"/>
+                        <w:dataBinding w:prefixMappings="xmlns:ns0='urn:microsoft-dynamics-nav/reports/CustomerStatement_Fairmont/50091/'" w:xpath="/ns0:NavWordReportXmlPart[1]/ns0:Customer[1]/ns0:Integer[1]/ns0:StartDateCaption[1]" w:storeItemID="{E71A5C94-9D23-45CB-8C8A-976D20B4B572}"/>
                         <w:text/>
                       </w:sdtPr>
                       <w:sdtContent>
@@ -338,12 +338,12 @@
                           <w:szCs w:val="16"/>
                         </w:rPr>
                         <w:alias w:val="#Nav: /Customer/Integer/StartDate"/>
-                        <w:tag w:val="#Nav: CustomerStatement_Fairmont/67148"/>
+                        <w:tag w:val="#Nav: CustomerStatement_Fairmont/50091"/>
                         <w:id w:val="877047657"/>
                         <w:placeholder>
                           <w:docPart w:val="AFE0B840A07F454EA9F4AF42DE77CCF4"/>
                         </w:placeholder>
-                        <w:dataBinding w:prefixMappings="xmlns:ns0='urn:microsoft-dynamics-nav/reports/CustomerStatement_Fairmont/67148/'" w:xpath="/ns0:NavWordReportXmlPart[1]/ns0:Customer[1]/ns0:Integer[1]/ns0:StartDate[1]" w:storeItemID="{E71A5C94-9D23-45CB-8C8A-976D20B4B572}"/>
+                        <w:dataBinding w:prefixMappings="xmlns:ns0='urn:microsoft-dynamics-nav/reports/CustomerStatement_Fairmont/50091/'" w:xpath="/ns0:NavWordReportXmlPart[1]/ns0:Customer[1]/ns0:Integer[1]/ns0:StartDate[1]" w:storeItemID="{E71A5C94-9D23-45CB-8C8A-976D20B4B572}"/>
                         <w:text/>
                       </w:sdtPr>
                       <w:sdtContent>
@@ -381,12 +381,12 @@
                           <w:szCs w:val="16"/>
                         </w:rPr>
                         <w:alias w:val="#Nav: /Customer/Integer/EndDateCaption"/>
-                        <w:tag w:val="#Nav: CustomerStatement_Fairmont/67148"/>
+                        <w:tag w:val="#Nav: CustomerStatement_Fairmont/50091"/>
                         <w:id w:val="-996348935"/>
                         <w:placeholder>
                           <w:docPart w:val="AFE0B840A07F454EA9F4AF42DE77CCF4"/>
                         </w:placeholder>
-                        <w:dataBinding w:prefixMappings="xmlns:ns0='urn:microsoft-dynamics-nav/reports/CustomerStatement_Fairmont/67148/'" w:xpath="/ns0:NavWordReportXmlPart[1]/ns0:Customer[1]/ns0:Integer[1]/ns0:EndDateCaption[1]" w:storeItemID="{E71A5C94-9D23-45CB-8C8A-976D20B4B572}"/>
+                        <w:dataBinding w:prefixMappings="xmlns:ns0='urn:microsoft-dynamics-nav/reports/CustomerStatement_Fairmont/50091/'" w:xpath="/ns0:NavWordReportXmlPart[1]/ns0:Customer[1]/ns0:Integer[1]/ns0:EndDateCaption[1]" w:storeItemID="{E71A5C94-9D23-45CB-8C8A-976D20B4B572}"/>
                         <w:text/>
                       </w:sdtPr>
                       <w:sdtContent>
@@ -438,12 +438,12 @@
                           <w:szCs w:val="16"/>
                         </w:rPr>
                         <w:alias w:val="#Nav: /Customer/Integer/EndDate"/>
-                        <w:tag w:val="#Nav: CustomerStatement_Fairmont/67148"/>
+                        <w:tag w:val="#Nav: CustomerStatement_Fairmont/50091"/>
                         <w:id w:val="272058076"/>
                         <w:placeholder>
                           <w:docPart w:val="AFE0B840A07F454EA9F4AF42DE77CCF4"/>
                         </w:placeholder>
-                        <w:dataBinding w:prefixMappings="xmlns:ns0='urn:microsoft-dynamics-nav/reports/CustomerStatement_Fairmont/67148/'" w:xpath="/ns0:NavWordReportXmlPart[1]/ns0:Customer[1]/ns0:Integer[1]/ns0:EndDate[1]" w:storeItemID="{E71A5C94-9D23-45CB-8C8A-976D20B4B572}"/>
+                        <w:dataBinding w:prefixMappings="xmlns:ns0='urn:microsoft-dynamics-nav/reports/CustomerStatement_Fairmont/50091/'" w:xpath="/ns0:NavWordReportXmlPart[1]/ns0:Customer[1]/ns0:Integer[1]/ns0:EndDate[1]" w:storeItemID="{E71A5C94-9D23-45CB-8C8A-976D20B4B572}"/>
                         <w:text/>
                       </w:sdtPr>
                       <w:sdtContent>
@@ -496,10 +496,10 @@
                           <w:szCs w:val="18"/>
                         </w:rPr>
                         <w:alias w:val="#Nav: /Customer/Integer/CompanyPicture"/>
-                        <w:tag w:val="#Nav: CustomerStatement_Fairmont/67148"/>
+                        <w:tag w:val="#Nav: CustomerStatement_Fairmont/50091"/>
                         <w:id w:val="-788196555"/>
                         <w:showingPlcHdr/>
-                        <w:dataBinding w:prefixMappings="xmlns:ns0='urn:microsoft-dynamics-nav/reports/CustomerStatement_Fairmont/67148/'" w:xpath="/ns0:NavWordReportXmlPart[1]/ns0:Customer[1]/ns0:Integer[1]/ns0:CompanyPicture[1]" w:storeItemID="{E71A5C94-9D23-45CB-8C8A-976D20B4B572}"/>
+                        <w:dataBinding w:prefixMappings="xmlns:ns0='urn:microsoft-dynamics-nav/reports/CustomerStatement_Fairmont/50091/'" w:xpath="/ns0:NavWordReportXmlPart[1]/ns0:Customer[1]/ns0:Integer[1]/ns0:CompanyPicture[1]" w:storeItemID="{E71A5C94-9D23-45CB-8C8A-976D20B4B572}"/>
                         <w:picture/>
                       </w:sdtPr>
                       <w:sdtContent>
@@ -603,12 +603,12 @@
                             <w:szCs w:val="18"/>
                           </w:rPr>
                           <w:alias w:val="#Nav: /Customer/Integer/CompanyAddr1"/>
-                          <w:tag w:val="#Nav: CustomerStatement_Fairmont/67148"/>
+                          <w:tag w:val="#Nav: CustomerStatement_Fairmont/50091"/>
                           <w:id w:val="-1677494167"/>
                           <w:placeholder>
                             <w:docPart w:val="5B3BD79EF35147138BA5AF67A4D31959"/>
                           </w:placeholder>
-                          <w:dataBinding w:prefixMappings="xmlns:ns0='urn:microsoft-dynamics-nav/reports/CustomerStatement_Fairmont/67148/'" w:xpath="/ns0:NavWordReportXmlPart[1]/ns0:Customer[1]/ns0:Integer[1]/ns0:CompanyAddr1[1]" w:storeItemID="{E71A5C94-9D23-45CB-8C8A-976D20B4B572}"/>
+                          <w:dataBinding w:prefixMappings="xmlns:ns0='urn:microsoft-dynamics-nav/reports/CustomerStatement_Fairmont/50091/'" w:xpath="/ns0:NavWordReportXmlPart[1]/ns0:Customer[1]/ns0:Integer[1]/ns0:CompanyAddr1[1]" w:storeItemID="{E71A5C94-9D23-45CB-8C8A-976D20B4B572}"/>
                           <w:text/>
                         </w:sdtPr>
                         <w:sdtContent>
@@ -646,12 +646,12 @@
                           <w:szCs w:val="18"/>
                         </w:rPr>
                         <w:alias w:val="#Nav: /Customer/Integer/CompanyAddr2"/>
-                        <w:tag w:val="#Nav: CustomerStatement_Fairmont/67148"/>
+                        <w:tag w:val="#Nav: CustomerStatement_Fairmont/50091"/>
                         <w:id w:val="-1164769234"/>
                         <w:placeholder>
                           <w:docPart w:val="5B3BD79EF35147138BA5AF67A4D31959"/>
                         </w:placeholder>
-                        <w:dataBinding w:prefixMappings="xmlns:ns0='urn:microsoft-dynamics-nav/reports/CustomerStatement_Fairmont/67148/'" w:xpath="/ns0:NavWordReportXmlPart[1]/ns0:Customer[1]/ns0:Integer[1]/ns0:CompanyAddr2[1]" w:storeItemID="{E71A5C94-9D23-45CB-8C8A-976D20B4B572}"/>
+                        <w:dataBinding w:prefixMappings="xmlns:ns0='urn:microsoft-dynamics-nav/reports/CustomerStatement_Fairmont/50091/'" w:xpath="/ns0:NavWordReportXmlPart[1]/ns0:Customer[1]/ns0:Integer[1]/ns0:CompanyAddr2[1]" w:storeItemID="{E71A5C94-9D23-45CB-8C8A-976D20B4B572}"/>
                         <w:text/>
                       </w:sdtPr>
                       <w:sdtContent>
@@ -706,12 +706,12 @@
                               <w:szCs w:val="18"/>
                             </w:rPr>
                             <w:alias w:val="#Nav: /Customer/Integer/CompanyAddr3"/>
-                            <w:tag w:val="#Nav: CustomerStatement_Fairmont/67148"/>
+                            <w:tag w:val="#Nav: CustomerStatement_Fairmont/50091"/>
                             <w:id w:val="633987185"/>
                             <w:placeholder>
                               <w:docPart w:val="5B3BD79EF35147138BA5AF67A4D31959"/>
                             </w:placeholder>
-                            <w:dataBinding w:prefixMappings="xmlns:ns0='urn:microsoft-dynamics-nav/reports/CustomerStatement_Fairmont/67148/'" w:xpath="/ns0:NavWordReportXmlPart[1]/ns0:Customer[1]/ns0:Integer[1]/ns0:CompanyAddr3[1]" w:storeItemID="{E71A5C94-9D23-45CB-8C8A-976D20B4B572}"/>
+                            <w:dataBinding w:prefixMappings="xmlns:ns0='urn:microsoft-dynamics-nav/reports/CustomerStatement_Fairmont/50091/'" w:xpath="/ns0:NavWordReportXmlPart[1]/ns0:Customer[1]/ns0:Integer[1]/ns0:CompanyAddr3[1]" w:storeItemID="{E71A5C94-9D23-45CB-8C8A-976D20B4B572}"/>
                             <w:text/>
                           </w:sdtPr>
                           <w:sdtContent>
@@ -741,12 +741,12 @@
                               <w:szCs w:val="18"/>
                             </w:rPr>
                             <w:alias w:val="#Nav: /Customer/Integer/CompanyAddr4"/>
-                            <w:tag w:val="#Nav: CustomerStatement_Fairmont/67148"/>
+                            <w:tag w:val="#Nav: CustomerStatement_Fairmont/50091"/>
                             <w:id w:val="-1446153461"/>
                             <w:placeholder>
                               <w:docPart w:val="5B3BD79EF35147138BA5AF67A4D31959"/>
                             </w:placeholder>
-                            <w:dataBinding w:prefixMappings="xmlns:ns0='urn:microsoft-dynamics-nav/reports/CustomerStatement_Fairmont/67148/'" w:xpath="/ns0:NavWordReportXmlPart[1]/ns0:Customer[1]/ns0:Integer[1]/ns0:CompanyAddr4[1]" w:storeItemID="{E71A5C94-9D23-45CB-8C8A-976D20B4B572}"/>
+                            <w:dataBinding w:prefixMappings="xmlns:ns0='urn:microsoft-dynamics-nav/reports/CustomerStatement_Fairmont/50091/'" w:xpath="/ns0:NavWordReportXmlPart[1]/ns0:Customer[1]/ns0:Integer[1]/ns0:CompanyAddr4[1]" w:storeItemID="{E71A5C94-9D23-45CB-8C8A-976D20B4B572}"/>
                             <w:text/>
                           </w:sdtPr>
                           <w:sdtContent>
@@ -813,12 +813,12 @@
                             <w:szCs w:val="18"/>
                           </w:rPr>
                           <w:alias w:val="#Nav: /Customer/Integer/CustAddr1"/>
-                          <w:tag w:val="#Nav: CustomerStatement_Fairmont/67148"/>
+                          <w:tag w:val="#Nav: CustomerStatement_Fairmont/50091"/>
                           <w:id w:val="1705982353"/>
                           <w:placeholder>
                             <w:docPart w:val="2B24AB563B404B9FB37517E78FCAC378"/>
                           </w:placeholder>
-                          <w:dataBinding w:prefixMappings="xmlns:ns0='urn:microsoft-dynamics-nav/reports/CustomerStatement_Fairmont/67148/'" w:xpath="/ns0:NavWordReportXmlPart[1]/ns0:Customer[1]/ns0:Integer[1]/ns0:CustAddr1[1]" w:storeItemID="{E71A5C94-9D23-45CB-8C8A-976D20B4B572}"/>
+                          <w:dataBinding w:prefixMappings="xmlns:ns0='urn:microsoft-dynamics-nav/reports/CustomerStatement_Fairmont/50091/'" w:xpath="/ns0:NavWordReportXmlPart[1]/ns0:Customer[1]/ns0:Integer[1]/ns0:CustAddr1[1]" w:storeItemID="{E71A5C94-9D23-45CB-8C8A-976D20B4B572}"/>
                           <w:text/>
                         </w:sdtPr>
                         <w:sdtContent>
@@ -853,12 +853,12 @@
                           <w:szCs w:val="18"/>
                         </w:rPr>
                         <w:alias w:val="#Nav: /Customer/Integer/CustAddr2"/>
-                        <w:tag w:val="#Nav: CustomerStatement_Fairmont/67148"/>
+                        <w:tag w:val="#Nav: CustomerStatement_Fairmont/50091"/>
                         <w:id w:val="-791128996"/>
                         <w:placeholder>
                           <w:docPart w:val="2B24AB563B404B9FB37517E78FCAC378"/>
                         </w:placeholder>
-                        <w:dataBinding w:prefixMappings="xmlns:ns0='urn:microsoft-dynamics-nav/reports/CustomerStatement_Fairmont/67148/'" w:xpath="/ns0:NavWordReportXmlPart[1]/ns0:Customer[1]/ns0:Integer[1]/ns0:CustAddr2[1]" w:storeItemID="{E71A5C94-9D23-45CB-8C8A-976D20B4B572}"/>
+                        <w:dataBinding w:prefixMappings="xmlns:ns0='urn:microsoft-dynamics-nav/reports/CustomerStatement_Fairmont/50091/'" w:xpath="/ns0:NavWordReportXmlPart[1]/ns0:Customer[1]/ns0:Integer[1]/ns0:CustAddr2[1]" w:storeItemID="{E71A5C94-9D23-45CB-8C8A-976D20B4B572}"/>
                         <w:text/>
                       </w:sdtPr>
                       <w:sdtContent>
@@ -897,12 +897,12 @@
                           <w:szCs w:val="18"/>
                         </w:rPr>
                         <w:alias w:val="#Nav: /Customer/Integer/CustAddr3"/>
-                        <w:tag w:val="#Nav: CustomerStatement_Fairmont/67148"/>
+                        <w:tag w:val="#Nav: CustomerStatement_Fairmont/50091"/>
                         <w:id w:val="-1298535516"/>
                         <w:placeholder>
                           <w:docPart w:val="2B24AB563B404B9FB37517E78FCAC378"/>
                         </w:placeholder>
-                        <w:dataBinding w:prefixMappings="xmlns:ns0='urn:microsoft-dynamics-nav/reports/CustomerStatement_Fairmont/67148/'" w:xpath="/ns0:NavWordReportXmlPart[1]/ns0:Customer[1]/ns0:Integer[1]/ns0:CustAddr3[1]" w:storeItemID="{E71A5C94-9D23-45CB-8C8A-976D20B4B572}"/>
+                        <w:dataBinding w:prefixMappings="xmlns:ns0='urn:microsoft-dynamics-nav/reports/CustomerStatement_Fairmont/50091/'" w:xpath="/ns0:NavWordReportXmlPart[1]/ns0:Customer[1]/ns0:Integer[1]/ns0:CustAddr3[1]" w:storeItemID="{E71A5C94-9D23-45CB-8C8A-976D20B4B572}"/>
                         <w:text/>
                       </w:sdtPr>
                       <w:sdtContent>
@@ -954,12 +954,12 @@
                               <w:szCs w:val="18"/>
                             </w:rPr>
                             <w:alias w:val="#Nav: /Customer/Integer/CustAddr4"/>
-                            <w:tag w:val="#Nav: CustomerStatement_Fairmont/67148"/>
+                            <w:tag w:val="#Nav: CustomerStatement_Fairmont/50091"/>
                             <w:id w:val="1749692430"/>
                             <w:placeholder>
                               <w:docPart w:val="2B24AB563B404B9FB37517E78FCAC378"/>
                             </w:placeholder>
-                            <w:dataBinding w:prefixMappings="xmlns:ns0='urn:microsoft-dynamics-nav/reports/CustomerStatement_Fairmont/67148/'" w:xpath="/ns0:NavWordReportXmlPart[1]/ns0:Customer[1]/ns0:Integer[1]/ns0:CustAddr4[1]" w:storeItemID="{E71A5C94-9D23-45CB-8C8A-976D20B4B572}"/>
+                            <w:dataBinding w:prefixMappings="xmlns:ns0='urn:microsoft-dynamics-nav/reports/CustomerStatement_Fairmont/50091/'" w:xpath="/ns0:NavWordReportXmlPart[1]/ns0:Customer[1]/ns0:Integer[1]/ns0:CustAddr4[1]" w:storeItemID="{E71A5C94-9D23-45CB-8C8A-976D20B4B572}"/>
                             <w:text/>
                           </w:sdtPr>
                           <w:sdtContent>
@@ -989,12 +989,12 @@
                               <w:szCs w:val="18"/>
                             </w:rPr>
                             <w:alias w:val="#Nav: /Customer/Integer/CustAddr5"/>
-                            <w:tag w:val="#Nav: CustomerStatement_Fairmont/67148"/>
+                            <w:tag w:val="#Nav: CustomerStatement_Fairmont/50091"/>
                             <w:id w:val="-346493200"/>
                             <w:placeholder>
                               <w:docPart w:val="2B24AB563B404B9FB37517E78FCAC378"/>
                             </w:placeholder>
-                            <w:dataBinding w:prefixMappings="xmlns:ns0='urn:microsoft-dynamics-nav/reports/CustomerStatement_Fairmont/67148/'" w:xpath="/ns0:NavWordReportXmlPart[1]/ns0:Customer[1]/ns0:Integer[1]/ns0:CustAddr5[1]" w:storeItemID="{E71A5C94-9D23-45CB-8C8A-976D20B4B572}"/>
+                            <w:dataBinding w:prefixMappings="xmlns:ns0='urn:microsoft-dynamics-nav/reports/CustomerStatement_Fairmont/50091/'" w:xpath="/ns0:NavWordReportXmlPart[1]/ns0:Customer[1]/ns0:Integer[1]/ns0:CustAddr5[1]" w:storeItemID="{E71A5C94-9D23-45CB-8C8A-976D20B4B572}"/>
                             <w:text/>
                           </w:sdtPr>
                           <w:sdtContent>
@@ -1041,12 +1041,12 @@
                               <w:szCs w:val="18"/>
                             </w:rPr>
                             <w:alias w:val="#Nav: /Customer/Integer/PhoneNo_CompanyInfoCaption"/>
-                            <w:tag w:val="#Nav: CustomerStatement_Fairmont/67148"/>
+                            <w:tag w:val="#Nav: CustomerStatement_Fairmont/50091"/>
                             <w:id w:val="657817227"/>
                             <w:placeholder>
                               <w:docPart w:val="2B24AB563B404B9FB37517E78FCAC378"/>
                             </w:placeholder>
-                            <w:dataBinding w:prefixMappings="xmlns:ns0='urn:microsoft-dynamics-nav/reports/CustomerStatement_Fairmont/67148/'" w:xpath="/ns0:NavWordReportXmlPart[1]/ns0:Customer[1]/ns0:Integer[1]/ns0:PhoneNo_CompanyInfoCaption[1]" w:storeItemID="{E71A5C94-9D23-45CB-8C8A-976D20B4B572}"/>
+                            <w:dataBinding w:prefixMappings="xmlns:ns0='urn:microsoft-dynamics-nav/reports/CustomerStatement_Fairmont/50091/'" w:xpath="/ns0:NavWordReportXmlPart[1]/ns0:Customer[1]/ns0:Integer[1]/ns0:PhoneNo_CompanyInfoCaption[1]" w:storeItemID="{E71A5C94-9D23-45CB-8C8A-976D20B4B572}"/>
                             <w:text/>
                           </w:sdtPr>
                           <w:sdtContent>
@@ -1078,12 +1078,12 @@
                               <w:szCs w:val="18"/>
                             </w:rPr>
                             <w:alias w:val="#Nav: /Customer/Integer/PhoneNo_CompanyInfo"/>
-                            <w:tag w:val="#Nav: CustomerStatement_Fairmont/67148"/>
+                            <w:tag w:val="#Nav: CustomerStatement_Fairmont/50091"/>
                             <w:id w:val="127444662"/>
                             <w:placeholder>
                               <w:docPart w:val="2B24AB563B404B9FB37517E78FCAC378"/>
                             </w:placeholder>
-                            <w:dataBinding w:prefixMappings="xmlns:ns0='urn:microsoft-dynamics-nav/reports/CustomerStatement_Fairmont/67148/'" w:xpath="/ns0:NavWordReportXmlPart[1]/ns0:Customer[1]/ns0:Integer[1]/ns0:PhoneNo_CompanyInfo[1]" w:storeItemID="{E71A5C94-9D23-45CB-8C8A-976D20B4B572}"/>
+                            <w:dataBinding w:prefixMappings="xmlns:ns0='urn:microsoft-dynamics-nav/reports/CustomerStatement_Fairmont/50091/'" w:xpath="/ns0:NavWordReportXmlPart[1]/ns0:Customer[1]/ns0:Integer[1]/ns0:PhoneNo_CompanyInfo[1]" w:storeItemID="{E71A5C94-9D23-45CB-8C8A-976D20B4B572}"/>
                             <w:text/>
                           </w:sdtPr>
                           <w:sdtContent>
@@ -1150,12 +1150,12 @@
                           <w:szCs w:val="18"/>
                         </w:rPr>
                         <w:alias w:val="#Nav: /Customer/Integer/PostDate_DtldCustLedgEntriesCaption"/>
-                        <w:tag w:val="#Nav: CustomerStatement_Fairmont/67148"/>
+                        <w:tag w:val="#Nav: CustomerStatement_Fairmont/50091"/>
                         <w:id w:val="-1521241388"/>
                         <w:placeholder>
                           <w:docPart w:val="2B24AB563B404B9FB37517E78FCAC378"/>
                         </w:placeholder>
-                        <w:dataBinding w:prefixMappings="xmlns:ns0='urn:microsoft-dynamics-nav/reports/CustomerStatement_Fairmont/67148/'" w:xpath="/ns0:NavWordReportXmlPart[1]/ns0:Customer[1]/ns0:Integer[1]/ns0:PostDate_DtldCustLedgEntriesCaption[1]" w:storeItemID="{E71A5C94-9D23-45CB-8C8A-976D20B4B572}"/>
+                        <w:dataBinding w:prefixMappings="xmlns:ns0='urn:microsoft-dynamics-nav/reports/CustomerStatement_Fairmont/50091/'" w:xpath="/ns0:NavWordReportXmlPart[1]/ns0:Customer[1]/ns0:Integer[1]/ns0:PostDate_DtldCustLedgEntriesCaption[1]" w:storeItemID="{E71A5C94-9D23-45CB-8C8A-976D20B4B572}"/>
                         <w:text/>
                       </w:sdtPr>
                       <w:sdtContent>
@@ -1196,12 +1196,12 @@
                           <w:szCs w:val="18"/>
                         </w:rPr>
                         <w:alias w:val="#Nav: /Customer/Integer/DocNo_DtldCustLedgEntriesCaption"/>
-                        <w:tag w:val="#Nav: CustomerStatement_Fairmont/67148"/>
+                        <w:tag w:val="#Nav: CustomerStatement_Fairmont/50091"/>
                         <w:id w:val="-575826100"/>
                         <w:placeholder>
                           <w:docPart w:val="2B24AB563B404B9FB37517E78FCAC378"/>
                         </w:placeholder>
-                        <w:dataBinding w:prefixMappings="xmlns:ns0='urn:microsoft-dynamics-nav/reports/CustomerStatement_Fairmont/67148/'" w:xpath="/ns0:NavWordReportXmlPart[1]/ns0:Customer[1]/ns0:Integer[1]/ns0:DocNo_DtldCustLedgEntriesCaption[1]" w:storeItemID="{E71A5C94-9D23-45CB-8C8A-976D20B4B572}"/>
+                        <w:dataBinding w:prefixMappings="xmlns:ns0='urn:microsoft-dynamics-nav/reports/CustomerStatement_Fairmont/50091/'" w:xpath="/ns0:NavWordReportXmlPart[1]/ns0:Customer[1]/ns0:Integer[1]/ns0:DocNo_DtldCustLedgEntriesCaption[1]" w:storeItemID="{E71A5C94-9D23-45CB-8C8A-976D20B4B572}"/>
                         <w:text/>
                       </w:sdtPr>
                       <w:sdtContent>
@@ -1241,12 +1241,12 @@
                           <w:szCs w:val="18"/>
                         </w:rPr>
                         <w:alias w:val="#Nav: /Customer/Integer/Desc_CustLedgEntry2Caption"/>
-                        <w:tag w:val="#Nav: CustomerStatement_Fairmont/67148"/>
+                        <w:tag w:val="#Nav: CustomerStatement_Fairmont/50091"/>
                         <w:id w:val="-1635870280"/>
                         <w:placeholder>
                           <w:docPart w:val="2B24AB563B404B9FB37517E78FCAC378"/>
                         </w:placeholder>
-                        <w:dataBinding w:prefixMappings="xmlns:ns0='urn:microsoft-dynamics-nav/reports/CustomerStatement_Fairmont/67148/'" w:xpath="/ns0:NavWordReportXmlPart[1]/ns0:Customer[1]/ns0:Integer[1]/ns0:Desc_CustLedgEntry2Caption[1]" w:storeItemID="{E71A5C94-9D23-45CB-8C8A-976D20B4B572}"/>
+                        <w:dataBinding w:prefixMappings="xmlns:ns0='urn:microsoft-dynamics-nav/reports/CustomerStatement_Fairmont/50091/'" w:xpath="/ns0:NavWordReportXmlPart[1]/ns0:Customer[1]/ns0:Integer[1]/ns0:Desc_CustLedgEntry2Caption[1]" w:storeItemID="{E71A5C94-9D23-45CB-8C8A-976D20B4B572}"/>
                         <w:text/>
                       </w:sdtPr>
                       <w:sdtContent>
@@ -1284,12 +1284,12 @@
                           <w:szCs w:val="18"/>
                         </w:rPr>
                         <w:alias w:val="#Nav: /Customer/Integer/DueDate_CustLedgEntry2Caption"/>
-                        <w:tag w:val="#Nav: CustomerStatement_Fairmont/67148"/>
+                        <w:tag w:val="#Nav: CustomerStatement_Fairmont/50091"/>
                         <w:id w:val="2044021084"/>
                         <w:placeholder>
                           <w:docPart w:val="2B24AB563B404B9FB37517E78FCAC378"/>
                         </w:placeholder>
-                        <w:dataBinding w:prefixMappings="xmlns:ns0='urn:microsoft-dynamics-nav/reports/CustomerStatement_Fairmont/67148/'" w:xpath="/ns0:NavWordReportXmlPart[1]/ns0:Customer[1]/ns0:Integer[1]/ns0:DueDate_CustLedgEntry2Caption[1]" w:storeItemID="{E71A5C94-9D23-45CB-8C8A-976D20B4B572}"/>
+                        <w:dataBinding w:prefixMappings="xmlns:ns0='urn:microsoft-dynamics-nav/reports/CustomerStatement_Fairmont/50091/'" w:xpath="/ns0:NavWordReportXmlPart[1]/ns0:Customer[1]/ns0:Integer[1]/ns0:DueDate_CustLedgEntry2Caption[1]" w:storeItemID="{E71A5C94-9D23-45CB-8C8A-976D20B4B572}"/>
                         <w:text/>
                       </w:sdtPr>
                       <w:sdtContent>
@@ -1328,12 +1328,12 @@
                           <w:szCs w:val="18"/>
                         </w:rPr>
                         <w:alias w:val="#Nav: /Customer/Integer/OriginalAmt_CustLedgEntry2Caption"/>
-                        <w:tag w:val="#Nav: CustomerStatement_Fairmont/67148"/>
+                        <w:tag w:val="#Nav: CustomerStatement_Fairmont/50091"/>
                         <w:id w:val="-1713727012"/>
                         <w:placeholder>
                           <w:docPart w:val="2B24AB563B404B9FB37517E78FCAC378"/>
                         </w:placeholder>
-                        <w:dataBinding w:prefixMappings="xmlns:ns0='urn:microsoft-dynamics-nav/reports/CustomerStatement_Fairmont/67148/'" w:xpath="/ns0:NavWordReportXmlPart[1]/ns0:Customer[1]/ns0:Integer[1]/ns0:OriginalAmt_CustLedgEntry2Caption[1]" w:storeItemID="{E71A5C94-9D23-45CB-8C8A-976D20B4B572}"/>
+                        <w:dataBinding w:prefixMappings="xmlns:ns0='urn:microsoft-dynamics-nav/reports/CustomerStatement_Fairmont/50091/'" w:xpath="/ns0:NavWordReportXmlPart[1]/ns0:Customer[1]/ns0:Integer[1]/ns0:OriginalAmt_CustLedgEntry2Caption[1]" w:storeItemID="{E71A5C94-9D23-45CB-8C8A-976D20B4B572}"/>
                         <w:text/>
                       </w:sdtPr>
                       <w:sdtContent>
@@ -1371,12 +1371,12 @@
                           <w:szCs w:val="18"/>
                         </w:rPr>
                         <w:alias w:val="#Nav: /Customer/Integer/RemainAmtCustLedgEntry2Caption"/>
-                        <w:tag w:val="#Nav: CustomerStatement_Fairmont/67148"/>
+                        <w:tag w:val="#Nav: CustomerStatement_Fairmont/50091"/>
                         <w:id w:val="-578204483"/>
                         <w:placeholder>
                           <w:docPart w:val="2B24AB563B404B9FB37517E78FCAC378"/>
                         </w:placeholder>
-                        <w:dataBinding w:prefixMappings="xmlns:ns0='urn:microsoft-dynamics-nav/reports/CustomerStatement_Fairmont/67148/'" w:xpath="/ns0:NavWordReportXmlPart[1]/ns0:Customer[1]/ns0:Integer[1]/ns0:RemainAmtCustLedgEntry2Caption[1]" w:storeItemID="{E71A5C94-9D23-45CB-8C8A-976D20B4B572}"/>
+                        <w:dataBinding w:prefixMappings="xmlns:ns0='urn:microsoft-dynamics-nav/reports/CustomerStatement_Fairmont/50091/'" w:xpath="/ns0:NavWordReportXmlPart[1]/ns0:Customer[1]/ns0:Integer[1]/ns0:RemainAmtCustLedgEntry2Caption[1]" w:storeItemID="{E71A5C94-9D23-45CB-8C8A-976D20B4B572}"/>
                         <w:text/>
                       </w:sdtPr>
                       <w:sdtContent>
@@ -1414,12 +1414,12 @@
                           <w:szCs w:val="18"/>
                         </w:rPr>
                         <w:alias w:val="#Nav: /Customer/Integer/CustBalanceCaption"/>
-                        <w:tag w:val="#Nav: CustomerStatement_Fairmont/67148"/>
+                        <w:tag w:val="#Nav: CustomerStatement_Fairmont/50091"/>
                         <w:id w:val="1422530791"/>
                         <w:placeholder>
                           <w:docPart w:val="2B24AB563B404B9FB37517E78FCAC378"/>
                         </w:placeholder>
-                        <w:dataBinding w:prefixMappings="xmlns:ns0='urn:microsoft-dynamics-nav/reports/CustomerStatement_Fairmont/67148/'" w:xpath="/ns0:NavWordReportXmlPart[1]/ns0:Customer[1]/ns0:Integer[1]/ns0:CustBalanceCaption[1]" w:storeItemID="{E71A5C94-9D23-45CB-8C8A-976D20B4B572}"/>
+                        <w:dataBinding w:prefixMappings="xmlns:ns0='urn:microsoft-dynamics-nav/reports/CustomerStatement_Fairmont/50091/'" w:xpath="/ns0:NavWordReportXmlPart[1]/ns0:Customer[1]/ns0:Integer[1]/ns0:CustBalanceCaption[1]" w:storeItemID="{E71A5C94-9D23-45CB-8C8A-976D20B4B572}"/>
                         <w:text/>
                       </w:sdtPr>
                       <w:sdtContent>
@@ -1462,9 +1462,9 @@
                         <w:szCs w:val="18"/>
                       </w:rPr>
                       <w:alias w:val="#Nav: /Customer/Integer/CurrencyLoop"/>
-                      <w:tag w:val="#Nav: CustomerStatement_Fairmont/67148"/>
+                      <w:tag w:val="#Nav: CustomerStatement_Fairmont/50091"/>
                       <w:id w:val="1014504409"/>
-                      <w15:dataBinding w:prefixMappings="xmlns:ns0='urn:microsoft-dynamics-nav/reports/CustomerStatement_Fairmont/67148/'" w:xpath="/ns0:NavWordReportXmlPart[1]/ns0:Customer[1]/ns0:Integer[1]/ns0:CurrencyLoop" w:storeItemID="{E71A5C94-9D23-45CB-8C8A-976D20B4B572}"/>
+                      <w15:dataBinding w:prefixMappings="xmlns:ns0='urn:microsoft-dynamics-nav/reports/CustomerStatement_Fairmont/50091/'" w:xpath="/ns0:NavWordReportXmlPart[1]/ns0:Customer[1]/ns0:Integer[1]/ns0:CurrencyLoop" w:storeItemID="{E71A5C94-9D23-45CB-8C8A-976D20B4B572}"/>
                       <w15:repeatingSection/>
                     </w:sdtPr>
                     <w:sdtContent>
@@ -1513,12 +1513,12 @@
                                       <w:szCs w:val="18"/>
                                     </w:rPr>
                                     <w:alias w:val="#Nav: /Customer/Integer/CurrencyLoop/CustLedgEntryHdr/Currency2Code_CustLedgEntryHdr"/>
-                                    <w:tag w:val="#Nav: CustomerStatement_Fairmont/67148"/>
+                                    <w:tag w:val="#Nav: CustomerStatement_Fairmont/50091"/>
                                     <w:id w:val="1149180939"/>
                                     <w:placeholder>
                                       <w:docPart w:val="0FFAD9EF9E2C4CFABFDF6D70F99DD4A8"/>
                                     </w:placeholder>
-                                    <w:dataBinding w:prefixMappings="xmlns:ns0='urn:microsoft-dynamics-nav/reports/CustomerStatement_Fairmont/67148/'" w:xpath="/ns0:NavWordReportXmlPart[1]/ns0:Customer[1]/ns0:Integer[1]/ns0:CurrencyLoop[1]/ns0:CustLedgEntryHdr[1]/ns0:Currency2Code_CustLedgEntryHdr[1]" w:storeItemID="{E71A5C94-9D23-45CB-8C8A-976D20B4B572}"/>
+                                    <w:dataBinding w:prefixMappings="xmlns:ns0='urn:microsoft-dynamics-nav/reports/CustomerStatement_Fairmont/50091/'" w:xpath="/ns0:NavWordReportXmlPart[1]/ns0:Customer[1]/ns0:Integer[1]/ns0:CurrencyLoop[1]/ns0:CustLedgEntryHdr[1]/ns0:Currency2Code_CustLedgEntryHdr[1]" w:storeItemID="{E71A5C94-9D23-45CB-8C8A-976D20B4B572}"/>
                                     <w:text/>
                                   </w:sdtPr>
                                   <w:sdtContent>
@@ -1538,12 +1538,12 @@
                             <w:sdt>
                               <w:sdtPr>
                                 <w:alias w:val="#Nav: /Customer/Integer/CurrencyLoop/CustLedgEntryHdr/StartBalance"/>
-                                <w:tag w:val="#Nav: CustomerStatement_Fairmont/67148"/>
+                                <w:tag w:val="#Nav: CustomerStatement_Fairmont/50091"/>
                                 <w:id w:val="302662349"/>
                                 <w:placeholder>
                                   <w:docPart w:val="DefaultPlaceholder_1081868574"/>
                                 </w:placeholder>
-                                <w:dataBinding w:prefixMappings="xmlns:ns0='urn:microsoft-dynamics-nav/reports/CustomerStatement_Fairmont/67148/'" w:xpath="/ns0:NavWordReportXmlPart[1]/ns0:Customer[1]/ns0:Integer[1]/ns0:CurrencyLoop[1]/ns0:CustLedgEntryHdr[1]/ns0:StartBalance[1]" w:storeItemID="{E71A5C94-9D23-45CB-8C8A-976D20B4B572}"/>
+                                <w:dataBinding w:prefixMappings="xmlns:ns0='urn:microsoft-dynamics-nav/reports/CustomerStatement_Fairmont/50091/'" w:xpath="/ns0:NavWordReportXmlPart[1]/ns0:Customer[1]/ns0:Integer[1]/ns0:CurrencyLoop[1]/ns0:CustLedgEntryHdr[1]/ns0:StartBalance[1]" w:storeItemID="{E71A5C94-9D23-45CB-8C8A-976D20B4B572}"/>
                                 <w:text/>
                               </w:sdtPr>
                               <w:sdtContent>
@@ -1577,9 +1577,9 @@
                                 <w:szCs w:val="18"/>
                               </w:rPr>
                               <w:alias w:val="#Nav: /Customer/Integer/CurrencyLoop/CustLedgEntryHdr/DtldCustLedgEntries"/>
-                              <w:tag w:val="#Nav: CustomerStatement_Fairmont/67148"/>
+                              <w:tag w:val="#Nav: CustomerStatement_Fairmont/50091"/>
                               <w:id w:val="-772240811"/>
-                              <w15:dataBinding w:prefixMappings="xmlns:ns0='urn:microsoft-dynamics-nav/reports/CustomerStatement_Fairmont/67148/'" w:xpath="/ns0:NavWordReportXmlPart[1]/ns0:Customer[1]/ns0:Integer[1]/ns0:CurrencyLoop[1]/ns0:CustLedgEntryHdr[1]/ns0:DtldCustLedgEntries" w:storeItemID="{E71A5C94-9D23-45CB-8C8A-976D20B4B572}"/>
+                              <w15:dataBinding w:prefixMappings="xmlns:ns0='urn:microsoft-dynamics-nav/reports/CustomerStatement_Fairmont/50091/'" w:xpath="/ns0:NavWordReportXmlPart[1]/ns0:Customer[1]/ns0:Integer[1]/ns0:CurrencyLoop[1]/ns0:CustLedgEntryHdr[1]/ns0:DtldCustLedgEntries" w:storeItemID="{E71A5C94-9D23-45CB-8C8A-976D20B4B572}"/>
                               <w15:repeatingSection/>
                             </w:sdtPr>
                             <w:sdtContent>
@@ -1610,12 +1610,12 @@
                                           <w:szCs w:val="18"/>
                                         </w:rPr>
                                         <w:alias w:val="#Nav: /Customer/Integer/CurrencyLoop/CustLedgEntryHdr/DtldCustLedgEntries/PostDate_DtldCustLedgEntries"/>
-                                        <w:tag w:val="#Nav: CustomerStatement_Fairmont/67148"/>
+                                        <w:tag w:val="#Nav: CustomerStatement_Fairmont/50091"/>
                                         <w:id w:val="-566484712"/>
                                         <w:placeholder>
                                           <w:docPart w:val="2B24AB563B404B9FB37517E78FCAC378"/>
                                         </w:placeholder>
-                                        <w:dataBinding w:prefixMappings="xmlns:ns0='urn:microsoft-dynamics-nav/reports/CustomerStatement_Fairmont/67148/'" w:xpath="/ns0:NavWordReportXmlPart[1]/ns0:Customer[1]/ns0:Integer[1]/ns0:CurrencyLoop[1]/ns0:CustLedgEntryHdr[1]/ns0:DtldCustLedgEntries[1]/ns0:PostDate_DtldCustLedgEntries[1]" w:storeItemID="{E71A5C94-9D23-45CB-8C8A-976D20B4B572}"/>
+                                        <w:dataBinding w:prefixMappings="xmlns:ns0='urn:microsoft-dynamics-nav/reports/CustomerStatement_Fairmont/50091/'" w:xpath="/ns0:NavWordReportXmlPart[1]/ns0:Customer[1]/ns0:Integer[1]/ns0:CurrencyLoop[1]/ns0:CustLedgEntryHdr[1]/ns0:DtldCustLedgEntries[1]/ns0:PostDate_DtldCustLedgEntries[1]" w:storeItemID="{E71A5C94-9D23-45CB-8C8A-976D20B4B572}"/>
                                         <w:text/>
                                       </w:sdtPr>
                                       <w:sdtContent>
@@ -1657,12 +1657,12 @@
                                           <w:szCs w:val="18"/>
                                         </w:rPr>
                                         <w:alias w:val="#Nav: /Customer/Integer/CurrencyLoop/CustLedgEntryHdr/DtldCustLedgEntries/DocNo_DtldCustLedgEntries"/>
-                                        <w:tag w:val="#Nav: CustomerStatement_Fairmont/67148"/>
+                                        <w:tag w:val="#Nav: CustomerStatement_Fairmont/50091"/>
                                         <w:id w:val="-677424365"/>
                                         <w:placeholder>
                                           <w:docPart w:val="2B24AB563B404B9FB37517E78FCAC378"/>
                                         </w:placeholder>
-                                        <w:dataBinding w:prefixMappings="xmlns:ns0='urn:microsoft-dynamics-nav/reports/CustomerStatement_Fairmont/67148/'" w:xpath="/ns0:NavWordReportXmlPart[1]/ns0:Customer[1]/ns0:Integer[1]/ns0:CurrencyLoop[1]/ns0:CustLedgEntryHdr[1]/ns0:DtldCustLedgEntries[1]/ns0:DocNo_DtldCustLedgEntries[1]" w:storeItemID="{E71A5C94-9D23-45CB-8C8A-976D20B4B572}"/>
+                                        <w:dataBinding w:prefixMappings="xmlns:ns0='urn:microsoft-dynamics-nav/reports/CustomerStatement_Fairmont/50091/'" w:xpath="/ns0:NavWordReportXmlPart[1]/ns0:Customer[1]/ns0:Integer[1]/ns0:CurrencyLoop[1]/ns0:CustLedgEntryHdr[1]/ns0:DtldCustLedgEntries[1]/ns0:DocNo_DtldCustLedgEntries[1]" w:storeItemID="{E71A5C94-9D23-45CB-8C8A-976D20B4B572}"/>
                                         <w:text/>
                                       </w:sdtPr>
                                       <w:sdtContent>
@@ -1702,12 +1702,12 @@
                                           <w:szCs w:val="18"/>
                                         </w:rPr>
                                         <w:alias w:val="#Nav: /Customer/Integer/CurrencyLoop/CustLedgEntryHdr/DtldCustLedgEntries/Description"/>
-                                        <w:tag w:val="#Nav: CustomerStatement_Fairmont/67148"/>
+                                        <w:tag w:val="#Nav: CustomerStatement_Fairmont/50091"/>
                                         <w:id w:val="1172993104"/>
                                         <w:placeholder>
                                           <w:docPart w:val="2B24AB563B404B9FB37517E78FCAC378"/>
                                         </w:placeholder>
-                                        <w:dataBinding w:prefixMappings="xmlns:ns0='urn:microsoft-dynamics-nav/reports/CustomerStatement_Fairmont/67148/'" w:xpath="/ns0:NavWordReportXmlPart[1]/ns0:Customer[1]/ns0:Integer[1]/ns0:CurrencyLoop[1]/ns0:CustLedgEntryHdr[1]/ns0:DtldCustLedgEntries[1]/ns0:Description[1]" w:storeItemID="{E71A5C94-9D23-45CB-8C8A-976D20B4B572}"/>
+                                        <w:dataBinding w:prefixMappings="xmlns:ns0='urn:microsoft-dynamics-nav/reports/CustomerStatement_Fairmont/50091/'" w:xpath="/ns0:NavWordReportXmlPart[1]/ns0:Customer[1]/ns0:Integer[1]/ns0:CurrencyLoop[1]/ns0:CustLedgEntryHdr[1]/ns0:DtldCustLedgEntries[1]/ns0:Description[1]" w:storeItemID="{E71A5C94-9D23-45CB-8C8A-976D20B4B572}"/>
                                         <w:text/>
                                       </w:sdtPr>
                                       <w:sdtContent>
@@ -1745,12 +1745,12 @@
                                           <w:szCs w:val="18"/>
                                         </w:rPr>
                                         <w:alias w:val="#Nav: /Customer/Integer/CurrencyLoop/CustLedgEntryHdr/DtldCustLedgEntries/DueDate_DtldCustLedgEntries"/>
-                                        <w:tag w:val="#Nav: CustomerStatement_Fairmont/67148"/>
+                                        <w:tag w:val="#Nav: CustomerStatement_Fairmont/50091"/>
                                         <w:id w:val="2091659995"/>
                                         <w:placeholder>
                                           <w:docPart w:val="2B24AB563B404B9FB37517E78FCAC378"/>
                                         </w:placeholder>
-                                        <w:dataBinding w:prefixMappings="xmlns:ns0='urn:microsoft-dynamics-nav/reports/CustomerStatement_Fairmont/67148/'" w:xpath="/ns0:NavWordReportXmlPart[1]/ns0:Customer[1]/ns0:Integer[1]/ns0:CurrencyLoop[1]/ns0:CustLedgEntryHdr[1]/ns0:DtldCustLedgEntries[1]/ns0:DueDate_DtldCustLedgEntries[1]" w:storeItemID="{E71A5C94-9D23-45CB-8C8A-976D20B4B572}"/>
+                                        <w:dataBinding w:prefixMappings="xmlns:ns0='urn:microsoft-dynamics-nav/reports/CustomerStatement_Fairmont/50091/'" w:xpath="/ns0:NavWordReportXmlPart[1]/ns0:Customer[1]/ns0:Integer[1]/ns0:CurrencyLoop[1]/ns0:CustLedgEntryHdr[1]/ns0:DtldCustLedgEntries[1]/ns0:DueDate_DtldCustLedgEntries[1]" w:storeItemID="{E71A5C94-9D23-45CB-8C8A-976D20B4B572}"/>
                                         <w:text/>
                                       </w:sdtPr>
                                       <w:sdtContent>
@@ -1791,12 +1791,12 @@
                                           <w:szCs w:val="18"/>
                                         </w:rPr>
                                         <w:alias w:val="#Nav: /Customer/Integer/CurrencyLoop/CustLedgEntryHdr/DtldCustLedgEntries/Amt_DtldCustLedgEntries"/>
-                                        <w:tag w:val="#Nav: CustomerStatement_Fairmont/67148"/>
+                                        <w:tag w:val="#Nav: CustomerStatement_Fairmont/50091"/>
                                         <w:id w:val="1358926495"/>
                                         <w:placeholder>
                                           <w:docPart w:val="2B24AB563B404B9FB37517E78FCAC378"/>
                                         </w:placeholder>
-                                        <w:dataBinding w:prefixMappings="xmlns:ns0='urn:microsoft-dynamics-nav/reports/CustomerStatement_Fairmont/67148/'" w:xpath="/ns0:NavWordReportXmlPart[1]/ns0:Customer[1]/ns0:Integer[1]/ns0:CurrencyLoop[1]/ns0:CustLedgEntryHdr[1]/ns0:DtldCustLedgEntries[1]/ns0:Amt_DtldCustLedgEntries[1]" w:storeItemID="{E71A5C94-9D23-45CB-8C8A-976D20B4B572}"/>
+                                        <w:dataBinding w:prefixMappings="xmlns:ns0='urn:microsoft-dynamics-nav/reports/CustomerStatement_Fairmont/50091/'" w:xpath="/ns0:NavWordReportXmlPart[1]/ns0:Customer[1]/ns0:Integer[1]/ns0:CurrencyLoop[1]/ns0:CustLedgEntryHdr[1]/ns0:DtldCustLedgEntries[1]/ns0:Amt_DtldCustLedgEntries[1]" w:storeItemID="{E71A5C94-9D23-45CB-8C8A-976D20B4B572}"/>
                                         <w:text/>
                                       </w:sdtPr>
                                       <w:sdtContent>
@@ -1836,12 +1836,12 @@
                                           <w:szCs w:val="18"/>
                                         </w:rPr>
                                         <w:alias w:val="#Nav: /Customer/Integer/CurrencyLoop/CustLedgEntryHdr/DtldCustLedgEntries/RemainAmt_DtldCustLedgEntries"/>
-                                        <w:tag w:val="#Nav: CustomerStatement_Fairmont/67148"/>
+                                        <w:tag w:val="#Nav: CustomerStatement_Fairmont/50091"/>
                                         <w:id w:val="1174157436"/>
                                         <w:placeholder>
                                           <w:docPart w:val="2B24AB563B404B9FB37517E78FCAC378"/>
                                         </w:placeholder>
-                                        <w:dataBinding w:prefixMappings="xmlns:ns0='urn:microsoft-dynamics-nav/reports/CustomerStatement_Fairmont/67148/'" w:xpath="/ns0:NavWordReportXmlPart[1]/ns0:Customer[1]/ns0:Integer[1]/ns0:CurrencyLoop[1]/ns0:CustLedgEntryHdr[1]/ns0:DtldCustLedgEntries[1]/ns0:RemainAmt_DtldCustLedgEntries[1]" w:storeItemID="{E71A5C94-9D23-45CB-8C8A-976D20B4B572}"/>
+                                        <w:dataBinding w:prefixMappings="xmlns:ns0='urn:microsoft-dynamics-nav/reports/CustomerStatement_Fairmont/50091/'" w:xpath="/ns0:NavWordReportXmlPart[1]/ns0:Customer[1]/ns0:Integer[1]/ns0:CurrencyLoop[1]/ns0:CustLedgEntryHdr[1]/ns0:DtldCustLedgEntries[1]/ns0:RemainAmt_DtldCustLedgEntries[1]" w:storeItemID="{E71A5C94-9D23-45CB-8C8A-976D20B4B572}"/>
                                         <w:text/>
                                       </w:sdtPr>
                                       <w:sdtContent>
@@ -1881,12 +1881,12 @@
                                           <w:szCs w:val="18"/>
                                         </w:rPr>
                                         <w:alias w:val="#Nav: /Customer/Integer/CurrencyLoop/CustLedgEntryHdr/DtldCustLedgEntries/CustBalance"/>
-                                        <w:tag w:val="#Nav: CustomerStatement_Fairmont/67148"/>
+                                        <w:tag w:val="#Nav: CustomerStatement_Fairmont/50091"/>
                                         <w:id w:val="858472207"/>
                                         <w:placeholder>
                                           <w:docPart w:val="2B24AB563B404B9FB37517E78FCAC378"/>
                                         </w:placeholder>
-                                        <w:dataBinding w:prefixMappings="xmlns:ns0='urn:microsoft-dynamics-nav/reports/CustomerStatement_Fairmont/67148/'" w:xpath="/ns0:NavWordReportXmlPart[1]/ns0:Customer[1]/ns0:Integer[1]/ns0:CurrencyLoop[1]/ns0:CustLedgEntryHdr[1]/ns0:DtldCustLedgEntries[1]/ns0:CustBalance[1]" w:storeItemID="{E71A5C94-9D23-45CB-8C8A-976D20B4B572}"/>
+                                        <w:dataBinding w:prefixMappings="xmlns:ns0='urn:microsoft-dynamics-nav/reports/CustomerStatement_Fairmont/50091/'" w:xpath="/ns0:NavWordReportXmlPart[1]/ns0:Customer[1]/ns0:Integer[1]/ns0:CurrencyLoop[1]/ns0:CustLedgEntryHdr[1]/ns0:DtldCustLedgEntries[1]/ns0:CustBalance[1]" w:storeItemID="{E71A5C94-9D23-45CB-8C8A-976D20B4B572}"/>
                                         <w:text/>
                                       </w:sdtPr>
                                       <w:sdtContent>
@@ -1971,12 +1971,12 @@
                                       <w:szCs w:val="18"/>
                                     </w:rPr>
                                     <w:alias w:val="#Nav: /Customer/Integer/CurrencyLoop/Total_Caption2"/>
-                                    <w:tag w:val="#Nav: CustomerStatement_Fairmont/67148"/>
+                                    <w:tag w:val="#Nav: CustomerStatement_Fairmont/50091"/>
                                     <w:id w:val="-862592733"/>
                                     <w:placeholder>
                                       <w:docPart w:val="DefaultPlaceholder_1081868574"/>
                                     </w:placeholder>
-                                    <w:dataBinding w:prefixMappings="xmlns:ns0='urn:microsoft-dynamics-nav/reports/CustomerStatement_Fairmont/67148/'" w:xpath="/ns0:NavWordReportXmlPart[1]/ns0:Customer[1]/ns0:Integer[1]/ns0:CurrencyLoop[1]/ns0:Total_Caption2[1]" w:storeItemID="{E71A5C94-9D23-45CB-8C8A-976D20B4B572}"/>
+                                    <w:dataBinding w:prefixMappings="xmlns:ns0='urn:microsoft-dynamics-nav/reports/CustomerStatement_Fairmont/50091/'" w:xpath="/ns0:NavWordReportXmlPart[1]/ns0:Customer[1]/ns0:Integer[1]/ns0:CurrencyLoop[1]/ns0:Total_Caption2[1]" w:storeItemID="{E71A5C94-9D23-45CB-8C8A-976D20B4B572}"/>
                                     <w:text/>
                                   </w:sdtPr>
                                   <w:sdtContent>
@@ -2009,12 +2009,12 @@
                                       <w:szCs w:val="18"/>
                                     </w:rPr>
                                     <w:alias w:val="#Nav: /Customer/Integer/CurrencyLoop/CustLedgEntryFooter/CurrencyCode3_CustLedgEntryFooter"/>
-                                    <w:tag w:val="#Nav: CustomerStatement_Fairmont/67148"/>
+                                    <w:tag w:val="#Nav: CustomerStatement_Fairmont/50091"/>
                                     <w:id w:val="-799453354"/>
                                     <w:placeholder>
                                       <w:docPart w:val="92676F36773A403AB760686F349DC35C"/>
                                     </w:placeholder>
-                                    <w:dataBinding w:prefixMappings="xmlns:ns0='urn:microsoft-dynamics-nav/reports/CustomerStatement_Fairmont/67148/'" w:xpath="/ns0:NavWordReportXmlPart[1]/ns0:Customer[1]/ns0:Integer[1]/ns0:CurrencyLoop[1]/ns0:CustLedgEntryFooter[1]/ns0:CurrencyCode3_CustLedgEntryFooter[1]" w:storeItemID="{E71A5C94-9D23-45CB-8C8A-976D20B4B572}"/>
+                                    <w:dataBinding w:prefixMappings="xmlns:ns0='urn:microsoft-dynamics-nav/reports/CustomerStatement_Fairmont/50091/'" w:xpath="/ns0:NavWordReportXmlPart[1]/ns0:Customer[1]/ns0:Integer[1]/ns0:CurrencyLoop[1]/ns0:CustLedgEntryFooter[1]/ns0:CurrencyCode3_CustLedgEntryFooter[1]" w:storeItemID="{E71A5C94-9D23-45CB-8C8A-976D20B4B572}"/>
                                     <w:text/>
                                   </w:sdtPr>
                                   <w:sdtContent>
@@ -2040,12 +2040,12 @@
                                   <w:szCs w:val="18"/>
                                 </w:rPr>
                                 <w:alias w:val="#Nav: /Customer/Integer/CurrencyLoop/CustLedgEntryFooter/CustBalance_CustLedgEntryHdrFooter"/>
-                                <w:tag w:val="#Nav: CustomerStatement_Fairmont/67148"/>
+                                <w:tag w:val="#Nav: CustomerStatement_Fairmont/50091"/>
                                 <w:id w:val="-831756158"/>
                                 <w:placeholder>
                                   <w:docPart w:val="DefaultPlaceholder_1081868574"/>
                                 </w:placeholder>
-                                <w:dataBinding w:prefixMappings="xmlns:ns0='urn:microsoft-dynamics-nav/reports/CustomerStatement_Fairmont/67148/'" w:xpath="/ns0:NavWordReportXmlPart[1]/ns0:Customer[1]/ns0:Integer[1]/ns0:CurrencyLoop[1]/ns0:CustLedgEntryFooter[1]/ns0:CustBalance_CustLedgEntryHdrFooter[1]" w:storeItemID="{E71A5C94-9D23-45CB-8C8A-976D20B4B572}"/>
+                                <w:dataBinding w:prefixMappings="xmlns:ns0='urn:microsoft-dynamics-nav/reports/CustomerStatement_Fairmont/50091/'" w:xpath="/ns0:NavWordReportXmlPart[1]/ns0:Customer[1]/ns0:Integer[1]/ns0:CurrencyLoop[1]/ns0:CustLedgEntryFooter[1]/ns0:CustBalance_CustLedgEntryHdrFooter[1]" w:storeItemID="{E71A5C94-9D23-45CB-8C8A-976D20B4B572}"/>
                                 <w:text/>
                               </w:sdtPr>
                               <w:sdtContent>
@@ -2120,9 +2120,9 @@
                         <w:szCs w:val="18"/>
                       </w:rPr>
                       <w:alias w:val="#Nav: /Customer/Integer/CurrencyLoop/OverdueVisible"/>
-                      <w:tag w:val="#Nav: CustomerStatement_Fairmont/67148"/>
+                      <w:tag w:val="#Nav: CustomerStatement_Fairmont/50091"/>
                       <w:id w:val="-1945292196"/>
-                      <w15:dataBinding w:prefixMappings="xmlns:ns0='urn:microsoft-dynamics-nav/reports/CustomerStatement_Fairmont/67148/'" w:xpath="/ns0:NavWordReportXmlPart[1]/ns0:Customer[1]/ns0:Integer[1]/ns0:CurrencyLoop[1]/ns0:OverdueVisible" w:storeItemID="{E71A5C94-9D23-45CB-8C8A-976D20B4B572}"/>
+                      <w15:dataBinding w:prefixMappings="xmlns:ns0='urn:microsoft-dynamics-nav/reports/CustomerStatement_Fairmont/50091/'" w:xpath="/ns0:NavWordReportXmlPart[1]/ns0:Customer[1]/ns0:Integer[1]/ns0:CurrencyLoop[1]/ns0:OverdueVisible" w:storeItemID="{E71A5C94-9D23-45CB-8C8A-976D20B4B572}"/>
                       <w15:repeatingSection/>
                     </w:sdtPr>
                     <w:sdtContent>
@@ -2158,12 +2158,12 @@
                                   <w:szCs w:val="18"/>
                                 </w:rPr>
                                 <w:alias w:val="#Nav: /Customer/Integer/CurrencyLoop/OverdueVisible/PostDate_DtldCustLedgEntriesCaption2"/>
-                                <w:tag w:val="#Nav: CustomerStatement_Fairmont/67148"/>
+                                <w:tag w:val="#Nav: CustomerStatement_Fairmont/50091"/>
                                 <w:id w:val="-1343390162"/>
                                 <w:placeholder>
                                   <w:docPart w:val="DefaultPlaceholder_1081868574"/>
                                 </w:placeholder>
-                                <w:dataBinding w:prefixMappings="xmlns:ns0='urn:microsoft-dynamics-nav/reports/CustomerStatement_Fairmont/67148/'" w:xpath="/ns0:NavWordReportXmlPart[1]/ns0:Customer[1]/ns0:Integer[1]/ns0:CurrencyLoop[1]/ns0:OverdueVisible[1]/ns0:PostDate_DtldCustLedgEntriesCaption2[1]" w:storeItemID="{E71A5C94-9D23-45CB-8C8A-976D20B4B572}"/>
+                                <w:dataBinding w:prefixMappings="xmlns:ns0='urn:microsoft-dynamics-nav/reports/CustomerStatement_Fairmont/50091/'" w:xpath="/ns0:NavWordReportXmlPart[1]/ns0:Customer[1]/ns0:Integer[1]/ns0:CurrencyLoop[1]/ns0:OverdueVisible[1]/ns0:PostDate_DtldCustLedgEntriesCaption2[1]" w:storeItemID="{E71A5C94-9D23-45CB-8C8A-976D20B4B572}"/>
                                 <w:text/>
                               </w:sdtPr>
                               <w:sdtEndPr>
@@ -2207,12 +2207,12 @@
                                   <w:szCs w:val="18"/>
                                 </w:rPr>
                                 <w:alias w:val="#Nav: /Customer/Integer/CurrencyLoop/OverdueVisible/DocNo_DtldCustLedgEntriesCaption2"/>
-                                <w:tag w:val="#Nav: CustomerStatement_Fairmont/67148"/>
+                                <w:tag w:val="#Nav: CustomerStatement_Fairmont/50091"/>
                                 <w:id w:val="919139622"/>
                                 <w:placeholder>
                                   <w:docPart w:val="DefaultPlaceholder_1081868574"/>
                                 </w:placeholder>
-                                <w:dataBinding w:prefixMappings="xmlns:ns0='urn:microsoft-dynamics-nav/reports/CustomerStatement_Fairmont/67148/'" w:xpath="/ns0:NavWordReportXmlPart[1]/ns0:Customer[1]/ns0:Integer[1]/ns0:CurrencyLoop[1]/ns0:OverdueVisible[1]/ns0:DocNo_DtldCustLedgEntriesCaption2[1]" w:storeItemID="{E71A5C94-9D23-45CB-8C8A-976D20B4B572}"/>
+                                <w:dataBinding w:prefixMappings="xmlns:ns0='urn:microsoft-dynamics-nav/reports/CustomerStatement_Fairmont/50091/'" w:xpath="/ns0:NavWordReportXmlPart[1]/ns0:Customer[1]/ns0:Integer[1]/ns0:CurrencyLoop[1]/ns0:OverdueVisible[1]/ns0:DocNo_DtldCustLedgEntriesCaption2[1]" w:storeItemID="{E71A5C94-9D23-45CB-8C8A-976D20B4B572}"/>
                                 <w:text/>
                               </w:sdtPr>
                               <w:sdtContent>
@@ -2250,12 +2250,12 @@
                                   <w:szCs w:val="18"/>
                                 </w:rPr>
                                 <w:alias w:val="#Nav: /Customer/Integer/CurrencyLoop/OverdueVisible/Desc_CustLedgEntry2Caption2"/>
-                                <w:tag w:val="#Nav: CustomerStatement_Fairmont/67148"/>
+                                <w:tag w:val="#Nav: CustomerStatement_Fairmont/50091"/>
                                 <w:id w:val="-1973196731"/>
                                 <w:placeholder>
                                   <w:docPart w:val="DefaultPlaceholder_1081868574"/>
                                 </w:placeholder>
-                                <w:dataBinding w:prefixMappings="xmlns:ns0='urn:microsoft-dynamics-nav/reports/CustomerStatement_Fairmont/67148/'" w:xpath="/ns0:NavWordReportXmlPart[1]/ns0:Customer[1]/ns0:Integer[1]/ns0:CurrencyLoop[1]/ns0:OverdueVisible[1]/ns0:Desc_CustLedgEntry2Caption2[1]" w:storeItemID="{E71A5C94-9D23-45CB-8C8A-976D20B4B572}"/>
+                                <w:dataBinding w:prefixMappings="xmlns:ns0='urn:microsoft-dynamics-nav/reports/CustomerStatement_Fairmont/50091/'" w:xpath="/ns0:NavWordReportXmlPart[1]/ns0:Customer[1]/ns0:Integer[1]/ns0:CurrencyLoop[1]/ns0:OverdueVisible[1]/ns0:Desc_CustLedgEntry2Caption2[1]" w:storeItemID="{E71A5C94-9D23-45CB-8C8A-976D20B4B572}"/>
                                 <w:text/>
                               </w:sdtPr>
                               <w:sdtContent>
@@ -2293,12 +2293,12 @@
                                   <w:szCs w:val="18"/>
                                 </w:rPr>
                                 <w:alias w:val="#Nav: /Customer/Integer/CurrencyLoop/OverdueVisible/DueDate_CustLedgEntry2Caption2"/>
-                                <w:tag w:val="#Nav: CustomerStatement_Fairmont/67148"/>
+                                <w:tag w:val="#Nav: CustomerStatement_Fairmont/50091"/>
                                 <w:id w:val="2068072881"/>
                                 <w:placeholder>
                                   <w:docPart w:val="DefaultPlaceholder_1081868574"/>
                                 </w:placeholder>
-                                <w:dataBinding w:prefixMappings="xmlns:ns0='urn:microsoft-dynamics-nav/reports/CustomerStatement_Fairmont/67148/'" w:xpath="/ns0:NavWordReportXmlPart[1]/ns0:Customer[1]/ns0:Integer[1]/ns0:CurrencyLoop[1]/ns0:OverdueVisible[1]/ns0:DueDate_CustLedgEntry2Caption2[1]" w:storeItemID="{E71A5C94-9D23-45CB-8C8A-976D20B4B572}"/>
+                                <w:dataBinding w:prefixMappings="xmlns:ns0='urn:microsoft-dynamics-nav/reports/CustomerStatement_Fairmont/50091/'" w:xpath="/ns0:NavWordReportXmlPart[1]/ns0:Customer[1]/ns0:Integer[1]/ns0:CurrencyLoop[1]/ns0:OverdueVisible[1]/ns0:DueDate_CustLedgEntry2Caption2[1]" w:storeItemID="{E71A5C94-9D23-45CB-8C8A-976D20B4B572}"/>
                                 <w:text/>
                               </w:sdtPr>
                               <w:sdtContent>
@@ -2336,12 +2336,12 @@
                                   <w:szCs w:val="18"/>
                                 </w:rPr>
                                 <w:alias w:val="#Nav: /Customer/Integer/CurrencyLoop/OverdueVisible/OriginalAmt_CustLedgEntry2Caption2"/>
-                                <w:tag w:val="#Nav: CustomerStatement_Fairmont/67148"/>
+                                <w:tag w:val="#Nav: CustomerStatement_Fairmont/50091"/>
                                 <w:id w:val="1032545067"/>
                                 <w:placeholder>
                                   <w:docPart w:val="DefaultPlaceholder_1081868574"/>
                                 </w:placeholder>
-                                <w:dataBinding w:prefixMappings="xmlns:ns0='urn:microsoft-dynamics-nav/reports/CustomerStatement_Fairmont/67148/'" w:xpath="/ns0:NavWordReportXmlPart[1]/ns0:Customer[1]/ns0:Integer[1]/ns0:CurrencyLoop[1]/ns0:OverdueVisible[1]/ns0:OriginalAmt_CustLedgEntry2Caption2[1]" w:storeItemID="{E71A5C94-9D23-45CB-8C8A-976D20B4B572}"/>
+                                <w:dataBinding w:prefixMappings="xmlns:ns0='urn:microsoft-dynamics-nav/reports/CustomerStatement_Fairmont/50091/'" w:xpath="/ns0:NavWordReportXmlPart[1]/ns0:Customer[1]/ns0:Integer[1]/ns0:CurrencyLoop[1]/ns0:OverdueVisible[1]/ns0:OriginalAmt_CustLedgEntry2Caption2[1]" w:storeItemID="{E71A5C94-9D23-45CB-8C8A-976D20B4B572}"/>
                                 <w:text/>
                               </w:sdtPr>
                               <w:sdtContent>
@@ -2379,12 +2379,12 @@
                                   <w:szCs w:val="18"/>
                                 </w:rPr>
                                 <w:alias w:val="#Nav: /Customer/Integer/CurrencyLoop/OverdueVisible/RemainAmtCustLedgEntry2Caption2"/>
-                                <w:tag w:val="#Nav: CustomerStatement_Fairmont/67148"/>
+                                <w:tag w:val="#Nav: CustomerStatement_Fairmont/50091"/>
                                 <w:id w:val="-561246524"/>
                                 <w:placeholder>
                                   <w:docPart w:val="DefaultPlaceholder_1081868574"/>
                                 </w:placeholder>
-                                <w:dataBinding w:prefixMappings="xmlns:ns0='urn:microsoft-dynamics-nav/reports/CustomerStatement_Fairmont/67148/'" w:xpath="/ns0:NavWordReportXmlPart[1]/ns0:Customer[1]/ns0:Integer[1]/ns0:CurrencyLoop[1]/ns0:OverdueVisible[1]/ns0:RemainAmtCustLedgEntry2Caption2[1]" w:storeItemID="{E71A5C94-9D23-45CB-8C8A-976D20B4B572}"/>
+                                <w:dataBinding w:prefixMappings="xmlns:ns0='urn:microsoft-dynamics-nav/reports/CustomerStatement_Fairmont/50091/'" w:xpath="/ns0:NavWordReportXmlPart[1]/ns0:Customer[1]/ns0:Integer[1]/ns0:CurrencyLoop[1]/ns0:OverdueVisible[1]/ns0:RemainAmtCustLedgEntry2Caption2[1]" w:storeItemID="{E71A5C94-9D23-45CB-8C8A-976D20B4B572}"/>
                                 <w:text/>
                               </w:sdtPr>
                               <w:sdtContent>
@@ -2430,9 +2430,9 @@
                         <w:szCs w:val="18"/>
                       </w:rPr>
                       <w:alias w:val="#Nav: /Customer/Integer/CurrencyLoop"/>
-                      <w:tag w:val="#Nav: CustomerStatement_Fairmont/67148"/>
+                      <w:tag w:val="#Nav: CustomerStatement_Fairmont/50091"/>
                       <w:id w:val="-1488938559"/>
-                      <w15:dataBinding w:prefixMappings="xmlns:ns0='urn:microsoft-dynamics-nav/reports/CustomerStatement_Fairmont/67148/'" w:xpath="/ns0:NavWordReportXmlPart[1]/ns0:Customer[1]/ns0:Integer[1]/ns0:CurrencyLoop" w:storeItemID="{E71A5C94-9D23-45CB-8C8A-976D20B4B572}"/>
+                      <w15:dataBinding w:prefixMappings="xmlns:ns0='urn:microsoft-dynamics-nav/reports/CustomerStatement_Fairmont/50091/'" w:xpath="/ns0:NavWordReportXmlPart[1]/ns0:Customer[1]/ns0:Integer[1]/ns0:CurrencyLoop" w:storeItemID="{E71A5C94-9D23-45CB-8C8A-976D20B4B572}"/>
                       <w15:repeatingSection/>
                     </w:sdtPr>
                     <w:sdtEndPr>
@@ -2472,9 +2472,9 @@
                                 <w:szCs w:val="18"/>
                               </w:rPr>
                               <w:alias w:val="#Nav: /Customer/Integer/CurrencyLoop/OverdueVisible"/>
-                              <w:tag w:val="#Nav: CustomerStatement_Fairmont/67148"/>
+                              <w:tag w:val="#Nav: CustomerStatement_Fairmont/50091"/>
                               <w:id w:val="-1783570720"/>
-                              <w15:dataBinding w:prefixMappings="xmlns:ns0='urn:microsoft-dynamics-nav/reports/CustomerStatement_Fairmont/67148/'" w:xpath="/ns0:NavWordReportXmlPart[1]/ns0:Customer[1]/ns0:Integer[1]/ns0:CurrencyLoop[1]/ns0:OverdueVisible" w:storeItemID="{E71A5C94-9D23-45CB-8C8A-976D20B4B572}"/>
+                              <w15:dataBinding w:prefixMappings="xmlns:ns0='urn:microsoft-dynamics-nav/reports/CustomerStatement_Fairmont/50091/'" w:xpath="/ns0:NavWordReportXmlPart[1]/ns0:Customer[1]/ns0:Integer[1]/ns0:CurrencyLoop[1]/ns0:OverdueVisible" w:storeItemID="{E71A5C94-9D23-45CB-8C8A-976D20B4B572}"/>
                               <w15:repeatingSection/>
                             </w:sdtPr>
                             <w:sdtEndPr>
@@ -2518,12 +2518,12 @@
                                           <w:szCs w:val="18"/>
                                         </w:rPr>
                                         <w:alias w:val="#Nav: /Customer/Integer/CurrencyLoop/OverdueVisible/CustLedgEntry2/OverDueEntries"/>
-                                        <w:tag w:val="#Nav: CustomerStatement_Fairmont/67148"/>
+                                        <w:tag w:val="#Nav: CustomerStatement_Fairmont/50091"/>
                                         <w:id w:val="-257672097"/>
                                         <w:placeholder>
                                           <w:docPart w:val="DefaultPlaceholder_1081868574"/>
                                         </w:placeholder>
-                                        <w:dataBinding w:prefixMappings="xmlns:ns0='urn:microsoft-dynamics-nav/reports/CustomerStatement_Fairmont/67148/'" w:xpath="/ns0:NavWordReportXmlPart[1]/ns0:Customer[1]/ns0:Integer[1]/ns0:CurrencyLoop[1]/ns0:OverdueVisible[1]/ns0:CustLedgEntry2[1]/ns0:OverDueEntries[1]" w:storeItemID="{E71A5C94-9D23-45CB-8C8A-976D20B4B572}"/>
+                                        <w:dataBinding w:prefixMappings="xmlns:ns0='urn:microsoft-dynamics-nav/reports/CustomerStatement_Fairmont/50091/'" w:xpath="/ns0:NavWordReportXmlPart[1]/ns0:Customer[1]/ns0:Integer[1]/ns0:CurrencyLoop[1]/ns0:OverdueVisible[1]/ns0:CustLedgEntry2[1]/ns0:OverDueEntries[1]" w:storeItemID="{E71A5C94-9D23-45CB-8C8A-976D20B4B572}"/>
                                         <w:text/>
                                       </w:sdtPr>
                                       <w:sdtEndPr>
@@ -2576,9 +2576,9 @@
                                         <w:szCs w:val="18"/>
                                       </w:rPr>
                                       <w:alias w:val="#Nav: /Customer/Integer/CurrencyLoop/OverdueVisible/CustLedgEntry2"/>
-                                      <w:tag w:val="#Nav: CustomerStatement_Fairmont/67148"/>
+                                      <w:tag w:val="#Nav: CustomerStatement_Fairmont/50091"/>
                                       <w:id w:val="2012786416"/>
-                                      <w15:dataBinding w:prefixMappings="xmlns:ns0='urn:microsoft-dynamics-nav/reports/CustomerStatement_Fairmont/67148/'" w:xpath="/ns0:NavWordReportXmlPart[1]/ns0:Customer[1]/ns0:Integer[1]/ns0:CurrencyLoop[1]/ns0:OverdueVisible[1]/ns0:CustLedgEntry2" w:storeItemID="{E71A5C94-9D23-45CB-8C8A-976D20B4B572}"/>
+                                      <w15:dataBinding w:prefixMappings="xmlns:ns0='urn:microsoft-dynamics-nav/reports/CustomerStatement_Fairmont/50091/'" w:xpath="/ns0:NavWordReportXmlPart[1]/ns0:Customer[1]/ns0:Integer[1]/ns0:CurrencyLoop[1]/ns0:OverdueVisible[1]/ns0:CustLedgEntry2" w:storeItemID="{E71A5C94-9D23-45CB-8C8A-976D20B4B572}"/>
                                       <w15:repeatingSection/>
                                     </w:sdtPr>
                                     <w:sdtContent>
@@ -2609,12 +2609,12 @@
                                                   <w:szCs w:val="18"/>
                                                 </w:rPr>
                                                 <w:alias w:val="#Nav: /Customer/Integer/CurrencyLoop/OverdueVisible/CustLedgEntry2/PostDate_CustLedgEntry2"/>
-                                                <w:tag w:val="#Nav: CustomerStatement_Fairmont/67148"/>
+                                                <w:tag w:val="#Nav: CustomerStatement_Fairmont/50091"/>
                                                 <w:id w:val="1024125593"/>
                                                 <w:placeholder>
                                                   <w:docPart w:val="DefaultPlaceholder_1081868574"/>
                                                 </w:placeholder>
-                                                <w:dataBinding w:prefixMappings="xmlns:ns0='urn:microsoft-dynamics-nav/reports/CustomerStatement_Fairmont/67148/'" w:xpath="/ns0:NavWordReportXmlPart[1]/ns0:Customer[1]/ns0:Integer[1]/ns0:CurrencyLoop[1]/ns0:OverdueVisible[1]/ns0:CustLedgEntry2[1]/ns0:PostDate_CustLedgEntry2[1]" w:storeItemID="{E71A5C94-9D23-45CB-8C8A-976D20B4B572}"/>
+                                                <w:dataBinding w:prefixMappings="xmlns:ns0='urn:microsoft-dynamics-nav/reports/CustomerStatement_Fairmont/50091/'" w:xpath="/ns0:NavWordReportXmlPart[1]/ns0:Customer[1]/ns0:Integer[1]/ns0:CurrencyLoop[1]/ns0:OverdueVisible[1]/ns0:CustLedgEntry2[1]/ns0:PostDate_CustLedgEntry2[1]" w:storeItemID="{E71A5C94-9D23-45CB-8C8A-976D20B4B572}"/>
                                                 <w:text/>
                                               </w:sdtPr>
                                               <w:sdtContent>
@@ -2654,12 +2654,12 @@
                                                   <w:szCs w:val="18"/>
                                                 </w:rPr>
                                                 <w:alias w:val="#Nav: /Customer/Integer/CurrencyLoop/OverdueVisible/CustLedgEntry2/DocNo_CustLedgEntry2"/>
-                                                <w:tag w:val="#Nav: CustomerStatement_Fairmont/67148"/>
+                                                <w:tag w:val="#Nav: CustomerStatement_Fairmont/50091"/>
                                                 <w:id w:val="575325811"/>
                                                 <w:placeholder>
                                                   <w:docPart w:val="DefaultPlaceholder_1081868574"/>
                                                 </w:placeholder>
-                                                <w:dataBinding w:prefixMappings="xmlns:ns0='urn:microsoft-dynamics-nav/reports/CustomerStatement_Fairmont/67148/'" w:xpath="/ns0:NavWordReportXmlPart[1]/ns0:Customer[1]/ns0:Integer[1]/ns0:CurrencyLoop[1]/ns0:OverdueVisible[1]/ns0:CustLedgEntry2[1]/ns0:DocNo_CustLedgEntry2[1]" w:storeItemID="{E71A5C94-9D23-45CB-8C8A-976D20B4B572}"/>
+                                                <w:dataBinding w:prefixMappings="xmlns:ns0='urn:microsoft-dynamics-nav/reports/CustomerStatement_Fairmont/50091/'" w:xpath="/ns0:NavWordReportXmlPart[1]/ns0:Customer[1]/ns0:Integer[1]/ns0:CurrencyLoop[1]/ns0:OverdueVisible[1]/ns0:CustLedgEntry2[1]/ns0:DocNo_CustLedgEntry2[1]" w:storeItemID="{E71A5C94-9D23-45CB-8C8A-976D20B4B572}"/>
                                                 <w:text/>
                                               </w:sdtPr>
                                               <w:sdtContent>
@@ -2697,12 +2697,12 @@
                                                   <w:szCs w:val="18"/>
                                                 </w:rPr>
                                                 <w:alias w:val="#Nav: /Customer/Integer/CurrencyLoop/OverdueVisible/CustLedgEntry2/Desc_CustLedgEntry2"/>
-                                                <w:tag w:val="#Nav: CustomerStatement_Fairmont/67148"/>
+                                                <w:tag w:val="#Nav: CustomerStatement_Fairmont/50091"/>
                                                 <w:id w:val="-1268923736"/>
                                                 <w:placeholder>
                                                   <w:docPart w:val="DefaultPlaceholder_1081868574"/>
                                                 </w:placeholder>
-                                                <w:dataBinding w:prefixMappings="xmlns:ns0='urn:microsoft-dynamics-nav/reports/CustomerStatement_Fairmont/67148/'" w:xpath="/ns0:NavWordReportXmlPart[1]/ns0:Customer[1]/ns0:Integer[1]/ns0:CurrencyLoop[1]/ns0:OverdueVisible[1]/ns0:CustLedgEntry2[1]/ns0:Desc_CustLedgEntry2[1]" w:storeItemID="{E71A5C94-9D23-45CB-8C8A-976D20B4B572}"/>
+                                                <w:dataBinding w:prefixMappings="xmlns:ns0='urn:microsoft-dynamics-nav/reports/CustomerStatement_Fairmont/50091/'" w:xpath="/ns0:NavWordReportXmlPart[1]/ns0:Customer[1]/ns0:Integer[1]/ns0:CurrencyLoop[1]/ns0:OverdueVisible[1]/ns0:CustLedgEntry2[1]/ns0:Desc_CustLedgEntry2[1]" w:storeItemID="{E71A5C94-9D23-45CB-8C8A-976D20B4B572}"/>
                                                 <w:text/>
                                               </w:sdtPr>
                                               <w:sdtContent>
@@ -2740,12 +2740,12 @@
                                                   <w:szCs w:val="18"/>
                                                 </w:rPr>
                                                 <w:alias w:val="#Nav: /Customer/Integer/CurrencyLoop/OverdueVisible/CustLedgEntry2/DueDate_CustLedgEntry2"/>
-                                                <w:tag w:val="#Nav: CustomerStatement_Fairmont/67148"/>
+                                                <w:tag w:val="#Nav: CustomerStatement_Fairmont/50091"/>
                                                 <w:id w:val="449526944"/>
                                                 <w:placeholder>
                                                   <w:docPart w:val="DefaultPlaceholder_1081868574"/>
                                                 </w:placeholder>
-                                                <w:dataBinding w:prefixMappings="xmlns:ns0='urn:microsoft-dynamics-nav/reports/CustomerStatement_Fairmont/67148/'" w:xpath="/ns0:NavWordReportXmlPart[1]/ns0:Customer[1]/ns0:Integer[1]/ns0:CurrencyLoop[1]/ns0:OverdueVisible[1]/ns0:CustLedgEntry2[1]/ns0:DueDate_CustLedgEntry2[1]" w:storeItemID="{E71A5C94-9D23-45CB-8C8A-976D20B4B572}"/>
+                                                <w:dataBinding w:prefixMappings="xmlns:ns0='urn:microsoft-dynamics-nav/reports/CustomerStatement_Fairmont/50091/'" w:xpath="/ns0:NavWordReportXmlPart[1]/ns0:Customer[1]/ns0:Integer[1]/ns0:CurrencyLoop[1]/ns0:OverdueVisible[1]/ns0:CustLedgEntry2[1]/ns0:DueDate_CustLedgEntry2[1]" w:storeItemID="{E71A5C94-9D23-45CB-8C8A-976D20B4B572}"/>
                                                 <w:text/>
                                               </w:sdtPr>
                                               <w:sdtContent>
@@ -2783,12 +2783,12 @@
                                                   <w:szCs w:val="18"/>
                                                 </w:rPr>
                                                 <w:alias w:val="#Nav: /Customer/Integer/CurrencyLoop/OverdueVisible/CustLedgEntry2/OriginalAmt_CustLedgEntry2"/>
-                                                <w:tag w:val="#Nav: CustomerStatement_Fairmont/67148"/>
+                                                <w:tag w:val="#Nav: CustomerStatement_Fairmont/50091"/>
                                                 <w:id w:val="-2093068206"/>
                                                 <w:placeholder>
                                                   <w:docPart w:val="DefaultPlaceholder_1081868574"/>
                                                 </w:placeholder>
-                                                <w:dataBinding w:prefixMappings="xmlns:ns0='urn:microsoft-dynamics-nav/reports/CustomerStatement_Fairmont/67148/'" w:xpath="/ns0:NavWordReportXmlPart[1]/ns0:Customer[1]/ns0:Integer[1]/ns0:CurrencyLoop[1]/ns0:OverdueVisible[1]/ns0:CustLedgEntry2[1]/ns0:OriginalAmt_CustLedgEntry2[1]" w:storeItemID="{E71A5C94-9D23-45CB-8C8A-976D20B4B572}"/>
+                                                <w:dataBinding w:prefixMappings="xmlns:ns0='urn:microsoft-dynamics-nav/reports/CustomerStatement_Fairmont/50091/'" w:xpath="/ns0:NavWordReportXmlPart[1]/ns0:Customer[1]/ns0:Integer[1]/ns0:CurrencyLoop[1]/ns0:OverdueVisible[1]/ns0:CustLedgEntry2[1]/ns0:OriginalAmt_CustLedgEntry2[1]" w:storeItemID="{E71A5C94-9D23-45CB-8C8A-976D20B4B572}"/>
                                                 <w:text/>
                                               </w:sdtPr>
                                               <w:sdtContent>
@@ -2826,12 +2826,12 @@
                                                   <w:szCs w:val="18"/>
                                                 </w:rPr>
                                                 <w:alias w:val="#Nav: /Customer/Integer/CurrencyLoop/OverdueVisible/CustLedgEntry2/RemainAmt_CustLedgEntry2"/>
-                                                <w:tag w:val="#Nav: CustomerStatement_Fairmont/67148"/>
+                                                <w:tag w:val="#Nav: CustomerStatement_Fairmont/50091"/>
                                                 <w:id w:val="-1408762425"/>
                                                 <w:placeholder>
                                                   <w:docPart w:val="DefaultPlaceholder_1081868574"/>
                                                 </w:placeholder>
-                                                <w:dataBinding w:prefixMappings="xmlns:ns0='urn:microsoft-dynamics-nav/reports/CustomerStatement_Fairmont/67148/'" w:xpath="/ns0:NavWordReportXmlPart[1]/ns0:Customer[1]/ns0:Integer[1]/ns0:CurrencyLoop[1]/ns0:OverdueVisible[1]/ns0:CustLedgEntry2[1]/ns0:RemainAmt_CustLedgEntry2[1]" w:storeItemID="{E71A5C94-9D23-45CB-8C8A-976D20B4B572}"/>
+                                                <w:dataBinding w:prefixMappings="xmlns:ns0='urn:microsoft-dynamics-nav/reports/CustomerStatement_Fairmont/50091/'" w:xpath="/ns0:NavWordReportXmlPart[1]/ns0:Customer[1]/ns0:Integer[1]/ns0:CurrencyLoop[1]/ns0:OverdueVisible[1]/ns0:CustLedgEntry2[1]/ns0:RemainAmt_CustLedgEntry2[1]" w:storeItemID="{E71A5C94-9D23-45CB-8C8A-976D20B4B572}"/>
                                                 <w:text/>
                                               </w:sdtPr>
                                               <w:sdtContent>
@@ -2925,12 +2925,12 @@
                                               <w:szCs w:val="18"/>
                                             </w:rPr>
                                             <w:alias w:val="#Nav: /Customer/Integer/CurrencyLoop/OverdueVisible/Total_Caption3"/>
-                                            <w:tag w:val="#Nav: CustomerStatement_Fairmont/67148"/>
+                                            <w:tag w:val="#Nav: CustomerStatement_Fairmont/50091"/>
                                             <w:id w:val="301891210"/>
                                             <w:placeholder>
                                               <w:docPart w:val="DefaultPlaceholder_1081868574"/>
                                             </w:placeholder>
-                                            <w:dataBinding w:prefixMappings="xmlns:ns0='urn:microsoft-dynamics-nav/reports/CustomerStatement_Fairmont/67148/'" w:xpath="/ns0:NavWordReportXmlPart[1]/ns0:Customer[1]/ns0:Integer[1]/ns0:CurrencyLoop[1]/ns0:OverdueVisible[1]/ns0:Total_Caption3[1]" w:storeItemID="{E71A5C94-9D23-45CB-8C8A-976D20B4B572}"/>
+                                            <w:dataBinding w:prefixMappings="xmlns:ns0='urn:microsoft-dynamics-nav/reports/CustomerStatement_Fairmont/50091/'" w:xpath="/ns0:NavWordReportXmlPart[1]/ns0:Customer[1]/ns0:Integer[1]/ns0:CurrencyLoop[1]/ns0:OverdueVisible[1]/ns0:Total_Caption3[1]" w:storeItemID="{E71A5C94-9D23-45CB-8C8A-976D20B4B572}"/>
                                             <w:text/>
                                           </w:sdtPr>
                                           <w:sdtContent>
@@ -2963,12 +2963,12 @@
                                               <w:szCs w:val="18"/>
                                             </w:rPr>
                                             <w:alias w:val="#Nav: /Customer/Integer/CurrencyLoop/OverdueVisible/CustLedgEntry2/CurrencyCode3_CustLedgEntry2"/>
-                                            <w:tag w:val="#Nav: CustomerStatement_Fairmont/67148"/>
+                                            <w:tag w:val="#Nav: CustomerStatement_Fairmont/50091"/>
                                             <w:id w:val="-1505823757"/>
                                             <w:placeholder>
                                               <w:docPart w:val="DefaultPlaceholder_1081868574"/>
                                             </w:placeholder>
-                                            <w:dataBinding w:prefixMappings="xmlns:ns0='urn:microsoft-dynamics-nav/reports/CustomerStatement_Fairmont/67148/'" w:xpath="/ns0:NavWordReportXmlPart[1]/ns0:Customer[1]/ns0:Integer[1]/ns0:CurrencyLoop[1]/ns0:OverdueVisible[1]/ns0:CustLedgEntry2[1]/ns0:CurrencyCode3_CustLedgEntry2[1]" w:storeItemID="{E71A5C94-9D23-45CB-8C8A-976D20B4B572}"/>
+                                            <w:dataBinding w:prefixMappings="xmlns:ns0='urn:microsoft-dynamics-nav/reports/CustomerStatement_Fairmont/50091/'" w:xpath="/ns0:NavWordReportXmlPart[1]/ns0:Customer[1]/ns0:Integer[1]/ns0:CurrencyLoop[1]/ns0:OverdueVisible[1]/ns0:CustLedgEntry2[1]/ns0:CurrencyCode3_CustLedgEntry2[1]" w:storeItemID="{E71A5C94-9D23-45CB-8C8A-976D20B4B572}"/>
                                             <w:text/>
                                           </w:sdtPr>
                                           <w:sdtContent>
@@ -2994,12 +2994,12 @@
                                           <w:szCs w:val="18"/>
                                         </w:rPr>
                                         <w:alias w:val="#Nav: /Customer/Integer/CurrencyLoop/OverdueVisible/OverdueEntryFooder/OverdueBalance"/>
-                                        <w:tag w:val="#Nav: CustomerStatement_Fairmont/67148"/>
+                                        <w:tag w:val="#Nav: CustomerStatement_Fairmont/50091"/>
                                         <w:id w:val="-1330047758"/>
                                         <w:placeholder>
                                           <w:docPart w:val="DefaultPlaceholder_1081868574"/>
                                         </w:placeholder>
-                                        <w:dataBinding w:prefixMappings="xmlns:ns0='urn:microsoft-dynamics-nav/reports/CustomerStatement_Fairmont/67148/'" w:xpath="/ns0:NavWordReportXmlPart[1]/ns0:Customer[1]/ns0:Integer[1]/ns0:CurrencyLoop[1]/ns0:OverdueVisible[1]/ns0:OverdueEntryFooder[1]/ns0:OverdueBalance[1]" w:storeItemID="{E71A5C94-9D23-45CB-8C8A-976D20B4B572}"/>
+                                        <w:dataBinding w:prefixMappings="xmlns:ns0='urn:microsoft-dynamics-nav/reports/CustomerStatement_Fairmont/50091/'" w:xpath="/ns0:NavWordReportXmlPart[1]/ns0:Customer[1]/ns0:Integer[1]/ns0:CurrencyLoop[1]/ns0:OverdueVisible[1]/ns0:OverdueEntryFooder[1]/ns0:OverdueBalance[1]" w:storeItemID="{E71A5C94-9D23-45CB-8C8A-976D20B4B572}"/>
                                         <w:text/>
                                       </w:sdtPr>
                                       <w:sdtContent>
@@ -3059,9 +3059,9 @@
                       <w:szCs w:val="18"/>
                     </w:rPr>
                     <w:alias w:val="#Nav: /Customer/Integer/AgingBandVisible"/>
-                    <w:tag w:val="#Nav: CustomerStatement_Fairmont/67148"/>
+                    <w:tag w:val="#Nav: CustomerStatement_Fairmont/50091"/>
                     <w:id w:val="1363945228"/>
-                    <w15:dataBinding w:prefixMappings="xmlns:ns0='urn:microsoft-dynamics-nav/reports/CustomerStatement_Fairmont/67148/'" w:xpath="/ns0:NavWordReportXmlPart[1]/ns0:Customer[1]/ns0:Integer[1]/ns0:AgingBandVisible" w:storeItemID="{E71A5C94-9D23-45CB-8C8A-976D20B4B572}"/>
+                    <w15:dataBinding w:prefixMappings="xmlns:ns0='urn:microsoft-dynamics-nav/reports/CustomerStatement_Fairmont/50091/'" w:xpath="/ns0:NavWordReportXmlPart[1]/ns0:Customer[1]/ns0:Integer[1]/ns0:AgingBandVisible" w:storeItemID="{E71A5C94-9D23-45CB-8C8A-976D20B4B572}"/>
                     <w15:repeatingSection/>
                   </w:sdtPr>
                   <w:sdtContent>
@@ -3087,12 +3087,12 @@
                               <w:szCs w:val="18"/>
                             </w:rPr>
                             <w:alias w:val="#Nav: /Customer/Integer/AgingBandVisible/AgingBandLoop/AgingBandEndingDate"/>
-                            <w:tag w:val="#Nav: CustomerStatement_Fairmont/67148"/>
+                            <w:tag w:val="#Nav: CustomerStatement_Fairmont/50091"/>
                             <w:id w:val="-1456399055"/>
                             <w:placeholder>
                               <w:docPart w:val="DefaultPlaceholder_1081868574"/>
                             </w:placeholder>
-                            <w:dataBinding w:prefixMappings="xmlns:ns0='urn:microsoft-dynamics-nav/reports/CustomerStatement_Fairmont/67148/'" w:xpath="/ns0:NavWordReportXmlPart[1]/ns0:Customer[1]/ns0:Integer[1]/ns0:AgingBandVisible[1]/ns0:AgingBandLoop[1]/ns0:AgingBandEndingDate[1]" w:storeItemID="{E71A5C94-9D23-45CB-8C8A-976D20B4B572}"/>
+                            <w:dataBinding w:prefixMappings="xmlns:ns0='urn:microsoft-dynamics-nav/reports/CustomerStatement_Fairmont/50091/'" w:xpath="/ns0:NavWordReportXmlPart[1]/ns0:Customer[1]/ns0:Integer[1]/ns0:AgingBandVisible[1]/ns0:AgingBandLoop[1]/ns0:AgingBandEndingDate[1]" w:storeItemID="{E71A5C94-9D23-45CB-8C8A-976D20B4B572}"/>
                             <w:text/>
                           </w:sdtPr>
                           <w:sdtContent>
@@ -3148,9 +3148,9 @@
                         <w:szCs w:val="18"/>
                       </w:rPr>
                       <w:alias w:val="#Nav: /Customer/Integer/AgingBandVisible"/>
-                      <w:tag w:val="#Nav: CustomerStatement_Fairmont/67148"/>
+                      <w:tag w:val="#Nav: CustomerStatement_Fairmont/50091"/>
                       <w:id w:val="-38051641"/>
-                      <w15:dataBinding w:prefixMappings="xmlns:ns0='urn:microsoft-dynamics-nav/reports/CustomerStatement_Fairmont/67148/'" w:xpath="/ns0:NavWordReportXmlPart[1]/ns0:Customer[1]/ns0:Integer[1]/ns0:AgingBandVisible" w:storeItemID="{E71A5C94-9D23-45CB-8C8A-976D20B4B572}"/>
+                      <w15:dataBinding w:prefixMappings="xmlns:ns0='urn:microsoft-dynamics-nav/reports/CustomerStatement_Fairmont/50091/'" w:xpath="/ns0:NavWordReportXmlPart[1]/ns0:Customer[1]/ns0:Integer[1]/ns0:AgingBandVisible" w:storeItemID="{E71A5C94-9D23-45CB-8C8A-976D20B4B572}"/>
                       <w15:repeatingSection/>
                     </w:sdtPr>
                     <w:sdtContent>
@@ -3205,12 +3205,12 @@
                                     <w:szCs w:val="18"/>
                                   </w:rPr>
                                   <w:alias w:val="#Nav: /Customer/Integer/AgingBandVisible/AgingBandLoop/AgingDate41"/>
-                                  <w:tag w:val="#Nav: CustomerStatement_Fairmont/67148"/>
+                                  <w:tag w:val="#Nav: CustomerStatement_Fairmont/50091"/>
                                   <w:id w:val="-1406606911"/>
                                   <w:placeholder>
                                     <w:docPart w:val="ECC82D957D094C2ABCAE3BC1FB380EC8"/>
                                   </w:placeholder>
-                                  <w:dataBinding w:prefixMappings="xmlns:ns0='urn:microsoft-dynamics-nav/reports/CustomerStatement_Fairmont/67148/'" w:xpath="/ns0:NavWordReportXmlPart[1]/ns0:Customer[1]/ns0:Integer[1]/ns0:AgingBandVisible[1]/ns0:AgingBandLoop[1]/ns0:AgingDate41[1]" w:storeItemID="{E71A5C94-9D23-45CB-8C8A-976D20B4B572}"/>
+                                  <w:dataBinding w:prefixMappings="xmlns:ns0='urn:microsoft-dynamics-nav/reports/CustomerStatement_Fairmont/50091/'" w:xpath="/ns0:NavWordReportXmlPart[1]/ns0:Customer[1]/ns0:Integer[1]/ns0:AgingBandVisible[1]/ns0:AgingBandLoop[1]/ns0:AgingDate41[1]" w:storeItemID="{E71A5C94-9D23-45CB-8C8A-976D20B4B572}"/>
                                   <w:text/>
                                 </w:sdtPr>
                                 <w:sdtContent>
@@ -3243,12 +3243,12 @@
                                     <w:szCs w:val="18"/>
                                   </w:rPr>
                                   <w:alias w:val="#Nav: /Customer/Integer/AgingBandVisible/AgingBandLoop/AgingDate5"/>
-                                  <w:tag w:val="#Nav: CustomerStatement_Fairmont/67148"/>
+                                  <w:tag w:val="#Nav: CustomerStatement_Fairmont/50091"/>
                                   <w:id w:val="-653370629"/>
                                   <w:placeholder>
                                     <w:docPart w:val="ECC82D957D094C2ABCAE3BC1FB380EC8"/>
                                   </w:placeholder>
-                                  <w:dataBinding w:prefixMappings="xmlns:ns0='urn:microsoft-dynamics-nav/reports/CustomerStatement_Fairmont/67148/'" w:xpath="/ns0:NavWordReportXmlPart[1]/ns0:Customer[1]/ns0:Integer[1]/ns0:AgingBandVisible[1]/ns0:AgingBandLoop[1]/ns0:AgingDate5[1]" w:storeItemID="{E71A5C94-9D23-45CB-8C8A-976D20B4B572}"/>
+                                  <w:dataBinding w:prefixMappings="xmlns:ns0='urn:microsoft-dynamics-nav/reports/CustomerStatement_Fairmont/50091/'" w:xpath="/ns0:NavWordReportXmlPart[1]/ns0:Customer[1]/ns0:Integer[1]/ns0:AgingBandVisible[1]/ns0:AgingBandLoop[1]/ns0:AgingDate5[1]" w:storeItemID="{E71A5C94-9D23-45CB-8C8A-976D20B4B572}"/>
                                   <w:text/>
                                 </w:sdtPr>
                                 <w:sdtContent>
@@ -3286,12 +3286,12 @@
                                     <w:szCs w:val="18"/>
                                   </w:rPr>
                                   <w:alias w:val="#Nav: /Customer/Integer/AgingBandVisible/AgingBandLoop/AgingDate31"/>
-                                  <w:tag w:val="#Nav: CustomerStatement_Fairmont/67148"/>
+                                  <w:tag w:val="#Nav: CustomerStatement_Fairmont/50091"/>
                                   <w:id w:val="1515878199"/>
                                   <w:placeholder>
                                     <w:docPart w:val="ECC82D957D094C2ABCAE3BC1FB380EC8"/>
                                   </w:placeholder>
-                                  <w:dataBinding w:prefixMappings="xmlns:ns0='urn:microsoft-dynamics-nav/reports/CustomerStatement_Fairmont/67148/'" w:xpath="/ns0:NavWordReportXmlPart[1]/ns0:Customer[1]/ns0:Integer[1]/ns0:AgingBandVisible[1]/ns0:AgingBandLoop[1]/ns0:AgingDate31[1]" w:storeItemID="{E71A5C94-9D23-45CB-8C8A-976D20B4B572}"/>
+                                  <w:dataBinding w:prefixMappings="xmlns:ns0='urn:microsoft-dynamics-nav/reports/CustomerStatement_Fairmont/50091/'" w:xpath="/ns0:NavWordReportXmlPart[1]/ns0:Customer[1]/ns0:Integer[1]/ns0:AgingBandVisible[1]/ns0:AgingBandLoop[1]/ns0:AgingDate31[1]" w:storeItemID="{E71A5C94-9D23-45CB-8C8A-976D20B4B572}"/>
                                   <w:text/>
                                 </w:sdtPr>
                                 <w:sdtContent>
@@ -3324,12 +3324,12 @@
                                     <w:szCs w:val="18"/>
                                   </w:rPr>
                                   <w:alias w:val="#Nav: /Customer/Integer/AgingBandVisible/AgingBandLoop/AgingDate4"/>
-                                  <w:tag w:val="#Nav: CustomerStatement_Fairmont/67148"/>
+                                  <w:tag w:val="#Nav: CustomerStatement_Fairmont/50091"/>
                                   <w:id w:val="503014985"/>
                                   <w:placeholder>
                                     <w:docPart w:val="ECC82D957D094C2ABCAE3BC1FB380EC8"/>
                                   </w:placeholder>
-                                  <w:dataBinding w:prefixMappings="xmlns:ns0='urn:microsoft-dynamics-nav/reports/CustomerStatement_Fairmont/67148/'" w:xpath="/ns0:NavWordReportXmlPart[1]/ns0:Customer[1]/ns0:Integer[1]/ns0:AgingBandVisible[1]/ns0:AgingBandLoop[1]/ns0:AgingDate4[1]" w:storeItemID="{E71A5C94-9D23-45CB-8C8A-976D20B4B572}"/>
+                                  <w:dataBinding w:prefixMappings="xmlns:ns0='urn:microsoft-dynamics-nav/reports/CustomerStatement_Fairmont/50091/'" w:xpath="/ns0:NavWordReportXmlPart[1]/ns0:Customer[1]/ns0:Integer[1]/ns0:AgingBandVisible[1]/ns0:AgingBandLoop[1]/ns0:AgingDate4[1]" w:storeItemID="{E71A5C94-9D23-45CB-8C8A-976D20B4B572}"/>
                                   <w:text/>
                                 </w:sdtPr>
                                 <w:sdtContent>
@@ -3367,12 +3367,12 @@
                                     <w:szCs w:val="18"/>
                                   </w:rPr>
                                   <w:alias w:val="#Nav: /Customer/Integer/AgingBandVisible/AgingBandLoop/AgingDate21"/>
-                                  <w:tag w:val="#Nav: CustomerStatement_Fairmont/67148"/>
+                                  <w:tag w:val="#Nav: CustomerStatement_Fairmont/50091"/>
                                   <w:id w:val="2000923207"/>
                                   <w:placeholder>
                                     <w:docPart w:val="ECC82D957D094C2ABCAE3BC1FB380EC8"/>
                                   </w:placeholder>
-                                  <w:dataBinding w:prefixMappings="xmlns:ns0='urn:microsoft-dynamics-nav/reports/CustomerStatement_Fairmont/67148/'" w:xpath="/ns0:NavWordReportXmlPart[1]/ns0:Customer[1]/ns0:Integer[1]/ns0:AgingBandVisible[1]/ns0:AgingBandLoop[1]/ns0:AgingDate21[1]" w:storeItemID="{E71A5C94-9D23-45CB-8C8A-976D20B4B572}"/>
+                                  <w:dataBinding w:prefixMappings="xmlns:ns0='urn:microsoft-dynamics-nav/reports/CustomerStatement_Fairmont/50091/'" w:xpath="/ns0:NavWordReportXmlPart[1]/ns0:Customer[1]/ns0:Integer[1]/ns0:AgingBandVisible[1]/ns0:AgingBandLoop[1]/ns0:AgingDate21[1]" w:storeItemID="{E71A5C94-9D23-45CB-8C8A-976D20B4B572}"/>
                                   <w:text/>
                                 </w:sdtPr>
                                 <w:sdtContent>
@@ -3405,12 +3405,12 @@
                                     <w:szCs w:val="18"/>
                                   </w:rPr>
                                   <w:alias w:val="#Nav: /Customer/Integer/AgingBandVisible/AgingBandLoop/AgingDate3"/>
-                                  <w:tag w:val="#Nav: CustomerStatement_Fairmont/67148"/>
+                                  <w:tag w:val="#Nav: CustomerStatement_Fairmont/50091"/>
                                   <w:id w:val="-869538741"/>
                                   <w:placeholder>
                                     <w:docPart w:val="ECC82D957D094C2ABCAE3BC1FB380EC8"/>
                                   </w:placeholder>
-                                  <w:dataBinding w:prefixMappings="xmlns:ns0='urn:microsoft-dynamics-nav/reports/CustomerStatement_Fairmont/67148/'" w:xpath="/ns0:NavWordReportXmlPart[1]/ns0:Customer[1]/ns0:Integer[1]/ns0:AgingBandVisible[1]/ns0:AgingBandLoop[1]/ns0:AgingDate3[1]" w:storeItemID="{E71A5C94-9D23-45CB-8C8A-976D20B4B572}"/>
+                                  <w:dataBinding w:prefixMappings="xmlns:ns0='urn:microsoft-dynamics-nav/reports/CustomerStatement_Fairmont/50091/'" w:xpath="/ns0:NavWordReportXmlPart[1]/ns0:Customer[1]/ns0:Integer[1]/ns0:AgingBandVisible[1]/ns0:AgingBandLoop[1]/ns0:AgingDate3[1]" w:storeItemID="{E71A5C94-9D23-45CB-8C8A-976D20B4B572}"/>
                                   <w:text/>
                                 </w:sdtPr>
                                 <w:sdtContent>
@@ -3448,12 +3448,12 @@
                                     <w:szCs w:val="18"/>
                                   </w:rPr>
                                   <w:alias w:val="#Nav: /Customer/Integer/AgingBandVisible/AgingBandLoop/AgingDate1"/>
-                                  <w:tag w:val="#Nav: CustomerStatement_Fairmont/67148"/>
+                                  <w:tag w:val="#Nav: CustomerStatement_Fairmont/50091"/>
                                   <w:id w:val="1015430542"/>
                                   <w:placeholder>
                                     <w:docPart w:val="57B98E6055D04AB2886C1F74E98DFF58"/>
                                   </w:placeholder>
-                                  <w:dataBinding w:prefixMappings="xmlns:ns0='urn:microsoft-dynamics-nav/reports/CustomerStatement_Fairmont/67148/'" w:xpath="/ns0:NavWordReportXmlPart[1]/ns0:Customer[1]/ns0:Integer[1]/ns0:AgingBandVisible[1]/ns0:AgingBandLoop[1]/ns0:AgingDate1[1]" w:storeItemID="{E71A5C94-9D23-45CB-8C8A-976D20B4B572}"/>
+                                  <w:dataBinding w:prefixMappings="xmlns:ns0='urn:microsoft-dynamics-nav/reports/CustomerStatement_Fairmont/50091/'" w:xpath="/ns0:NavWordReportXmlPart[1]/ns0:Customer[1]/ns0:Integer[1]/ns0:AgingBandVisible[1]/ns0:AgingBandLoop[1]/ns0:AgingDate1[1]" w:storeItemID="{E71A5C94-9D23-45CB-8C8A-976D20B4B572}"/>
                                   <w:text/>
                                 </w:sdtPr>
                                 <w:sdtContent>
@@ -3486,12 +3486,12 @@
                                     <w:szCs w:val="18"/>
                                   </w:rPr>
                                   <w:alias w:val="#Nav: /Customer/Integer/AgingBandVisible/AgingBandLoop/AgingDate2"/>
-                                  <w:tag w:val="#Nav: CustomerStatement_Fairmont/67148"/>
+                                  <w:tag w:val="#Nav: CustomerStatement_Fairmont/50091"/>
                                   <w:id w:val="1006324691"/>
                                   <w:placeholder>
                                     <w:docPart w:val="57B98E6055D04AB2886C1F74E98DFF58"/>
                                   </w:placeholder>
-                                  <w:dataBinding w:prefixMappings="xmlns:ns0='urn:microsoft-dynamics-nav/reports/CustomerStatement_Fairmont/67148/'" w:xpath="/ns0:NavWordReportXmlPart[1]/ns0:Customer[1]/ns0:Integer[1]/ns0:AgingBandVisible[1]/ns0:AgingBandLoop[1]/ns0:AgingDate2[1]" w:storeItemID="{E71A5C94-9D23-45CB-8C8A-976D20B4B572}"/>
+                                  <w:dataBinding w:prefixMappings="xmlns:ns0='urn:microsoft-dynamics-nav/reports/CustomerStatement_Fairmont/50091/'" w:xpath="/ns0:NavWordReportXmlPart[1]/ns0:Customer[1]/ns0:Integer[1]/ns0:AgingBandVisible[1]/ns0:AgingBandLoop[1]/ns0:AgingDate2[1]" w:storeItemID="{E71A5C94-9D23-45CB-8C8A-976D20B4B572}"/>
                                   <w:text/>
                                 </w:sdtPr>
                                 <w:sdtContent>
@@ -3525,12 +3525,12 @@
                                   <w:szCs w:val="18"/>
                                 </w:rPr>
                                 <w:alias w:val="#Nav: /Customer/Integer/AgingBandVisible/AgingBandLoop/beforeCaption"/>
-                                <w:tag w:val="#Nav: CustomerStatement_Fairmont/67148"/>
+                                <w:tag w:val="#Nav: CustomerStatement_Fairmont/50091"/>
                                 <w:id w:val="-1913837829"/>
                                 <w:placeholder>
                                   <w:docPart w:val="F94FE720535B423DBF60BA1A8809AEB2"/>
                                 </w:placeholder>
-                                <w:dataBinding w:prefixMappings="xmlns:ns0='urn:microsoft-dynamics-nav/reports/CustomerStatement_Fairmont/67148/'" w:xpath="/ns0:NavWordReportXmlPart[1]/ns0:Customer[1]/ns0:Integer[1]/ns0:AgingBandVisible[1]/ns0:AgingBandLoop[1]/ns0:beforeCaption[1]" w:storeItemID="{E71A5C94-9D23-45CB-8C8A-976D20B4B572}"/>
+                                <w:dataBinding w:prefixMappings="xmlns:ns0='urn:microsoft-dynamics-nav/reports/CustomerStatement_Fairmont/50091/'" w:xpath="/ns0:NavWordReportXmlPart[1]/ns0:Customer[1]/ns0:Integer[1]/ns0:AgingBandVisible[1]/ns0:AgingBandLoop[1]/ns0:beforeCaption[1]" w:storeItemID="{E71A5C94-9D23-45CB-8C8A-976D20B4B572}"/>
                                 <w:text/>
                               </w:sdtPr>
                               <w:sdtContent>
@@ -3577,9 +3577,9 @@
                         <w:szCs w:val="18"/>
                       </w:rPr>
                       <w:alias w:val="#Nav: /Customer/Integer/AgingBandVisible/AgingBandLoop"/>
-                      <w:tag w:val="#Nav: CustomerStatement_Fairmont/67148"/>
+                      <w:tag w:val="#Nav: CustomerStatement_Fairmont/50091"/>
                       <w:id w:val="1867410406"/>
-                      <w15:dataBinding w:prefixMappings="xmlns:ns0='urn:microsoft-dynamics-nav/reports/CustomerStatement_Fairmont/67148/'" w:xpath="/ns0:NavWordReportXmlPart[1]/ns0:Customer[1]/ns0:Integer[1]/ns0:AgingBandVisible[1]/ns0:AgingBandLoop" w:storeItemID="{E71A5C94-9D23-45CB-8C8A-976D20B4B572}"/>
+                      <w15:dataBinding w:prefixMappings="xmlns:ns0='urn:microsoft-dynamics-nav/reports/CustomerStatement_Fairmont/50091/'" w:xpath="/ns0:NavWordReportXmlPart[1]/ns0:Customer[1]/ns0:Integer[1]/ns0:AgingBandVisible[1]/ns0:AgingBandLoop" w:storeItemID="{E71A5C94-9D23-45CB-8C8A-976D20B4B572}"/>
                       <w15:repeatingSection/>
                     </w:sdtPr>
                     <w:sdtContent>
@@ -3613,12 +3613,12 @@
                                   <w:szCs w:val="18"/>
                                 </w:rPr>
                                 <w:alias w:val="#Nav: /Customer/Integer/AgingBandVisible/AgingBandLoop/AgingBandCurrencyCode"/>
-                                <w:tag w:val="#Nav: CustomerStatement_Fairmont/67148"/>
+                                <w:tag w:val="#Nav: CustomerStatement_Fairmont/50091"/>
                                 <w:id w:val="-1108120679"/>
                                 <w:placeholder>
                                   <w:docPart w:val="57B98E6055D04AB2886C1F74E98DFF58"/>
                                 </w:placeholder>
-                                <w:dataBinding w:prefixMappings="xmlns:ns0='urn:microsoft-dynamics-nav/reports/CustomerStatement_Fairmont/67148/'" w:xpath="/ns0:NavWordReportXmlPart[1]/ns0:Customer[1]/ns0:Integer[1]/ns0:AgingBandVisible[1]/ns0:AgingBandLoop[1]/ns0:AgingBandCurrencyCode[1]" w:storeItemID="{E71A5C94-9D23-45CB-8C8A-976D20B4B572}"/>
+                                <w:dataBinding w:prefixMappings="xmlns:ns0='urn:microsoft-dynamics-nav/reports/CustomerStatement_Fairmont/50091/'" w:xpath="/ns0:NavWordReportXmlPart[1]/ns0:Customer[1]/ns0:Integer[1]/ns0:AgingBandVisible[1]/ns0:AgingBandLoop[1]/ns0:AgingBandCurrencyCode[1]" w:storeItemID="{E71A5C94-9D23-45CB-8C8A-976D20B4B572}"/>
                                 <w:text/>
                               </w:sdtPr>
                               <w:sdtEndPr>
@@ -3666,12 +3666,12 @@
                                   <w:szCs w:val="18"/>
                                 </w:rPr>
                                 <w:alias w:val="#Nav: /Customer/Integer/AgingBandVisible/AgingBandLoop/AgingBandBufCol5Amt"/>
-                                <w:tag w:val="#Nav: CustomerStatement_Fairmont/67148"/>
+                                <w:tag w:val="#Nav: CustomerStatement_Fairmont/50091"/>
                                 <w:id w:val="902568639"/>
                                 <w:placeholder>
                                   <w:docPart w:val="57B98E6055D04AB2886C1F74E98DFF58"/>
                                 </w:placeholder>
-                                <w:dataBinding w:prefixMappings="xmlns:ns0='urn:microsoft-dynamics-nav/reports/CustomerStatement_Fairmont/67148/'" w:xpath="/ns0:NavWordReportXmlPart[1]/ns0:Customer[1]/ns0:Integer[1]/ns0:AgingBandVisible[1]/ns0:AgingBandLoop[1]/ns0:AgingBandBufCol5Amt[1]" w:storeItemID="{E71A5C94-9D23-45CB-8C8A-976D20B4B572}"/>
+                                <w:dataBinding w:prefixMappings="xmlns:ns0='urn:microsoft-dynamics-nav/reports/CustomerStatement_Fairmont/50091/'" w:xpath="/ns0:NavWordReportXmlPart[1]/ns0:Customer[1]/ns0:Integer[1]/ns0:AgingBandVisible[1]/ns0:AgingBandLoop[1]/ns0:AgingBandBufCol5Amt[1]" w:storeItemID="{E71A5C94-9D23-45CB-8C8A-976D20B4B572}"/>
                                 <w:text/>
                               </w:sdtPr>
                               <w:sdtContent>
@@ -3709,12 +3709,12 @@
                                   <w:szCs w:val="18"/>
                                 </w:rPr>
                                 <w:alias w:val="#Nav: /Customer/Integer/AgingBandVisible/AgingBandLoop/AgingBandBufCol4Amt"/>
-                                <w:tag w:val="#Nav: CustomerStatement_Fairmont/67148"/>
+                                <w:tag w:val="#Nav: CustomerStatement_Fairmont/50091"/>
                                 <w:id w:val="1384825051"/>
                                 <w:placeholder>
                                   <w:docPart w:val="57B98E6055D04AB2886C1F74E98DFF58"/>
                                 </w:placeholder>
-                                <w:dataBinding w:prefixMappings="xmlns:ns0='urn:microsoft-dynamics-nav/reports/CustomerStatement_Fairmont/67148/'" w:xpath="/ns0:NavWordReportXmlPart[1]/ns0:Customer[1]/ns0:Integer[1]/ns0:AgingBandVisible[1]/ns0:AgingBandLoop[1]/ns0:AgingBandBufCol4Amt[1]" w:storeItemID="{E71A5C94-9D23-45CB-8C8A-976D20B4B572}"/>
+                                <w:dataBinding w:prefixMappings="xmlns:ns0='urn:microsoft-dynamics-nav/reports/CustomerStatement_Fairmont/50091/'" w:xpath="/ns0:NavWordReportXmlPart[1]/ns0:Customer[1]/ns0:Integer[1]/ns0:AgingBandVisible[1]/ns0:AgingBandLoop[1]/ns0:AgingBandBufCol4Amt[1]" w:storeItemID="{E71A5C94-9D23-45CB-8C8A-976D20B4B572}"/>
                                 <w:text/>
                               </w:sdtPr>
                               <w:sdtContent>
@@ -3752,12 +3752,12 @@
                                   <w:szCs w:val="18"/>
                                 </w:rPr>
                                 <w:alias w:val="#Nav: /Customer/Integer/AgingBandVisible/AgingBandLoop/AgingBandBufCol3Amt"/>
-                                <w:tag w:val="#Nav: CustomerStatement_Fairmont/67148"/>
+                                <w:tag w:val="#Nav: CustomerStatement_Fairmont/50091"/>
                                 <w:id w:val="50436426"/>
                                 <w:placeholder>
                                   <w:docPart w:val="57B98E6055D04AB2886C1F74E98DFF58"/>
                                 </w:placeholder>
-                                <w:dataBinding w:prefixMappings="xmlns:ns0='urn:microsoft-dynamics-nav/reports/CustomerStatement_Fairmont/67148/'" w:xpath="/ns0:NavWordReportXmlPart[1]/ns0:Customer[1]/ns0:Integer[1]/ns0:AgingBandVisible[1]/ns0:AgingBandLoop[1]/ns0:AgingBandBufCol3Amt[1]" w:storeItemID="{E71A5C94-9D23-45CB-8C8A-976D20B4B572}"/>
+                                <w:dataBinding w:prefixMappings="xmlns:ns0='urn:microsoft-dynamics-nav/reports/CustomerStatement_Fairmont/50091/'" w:xpath="/ns0:NavWordReportXmlPart[1]/ns0:Customer[1]/ns0:Integer[1]/ns0:AgingBandVisible[1]/ns0:AgingBandLoop[1]/ns0:AgingBandBufCol3Amt[1]" w:storeItemID="{E71A5C94-9D23-45CB-8C8A-976D20B4B572}"/>
                                 <w:text/>
                               </w:sdtPr>
                               <w:sdtContent>
@@ -3795,12 +3795,12 @@
                                   <w:szCs w:val="18"/>
                                 </w:rPr>
                                 <w:alias w:val="#Nav: /Customer/Integer/AgingBandVisible/AgingBandLoop/AgingBandBufCol2Amt"/>
-                                <w:tag w:val="#Nav: CustomerStatement_Fairmont/67148"/>
+                                <w:tag w:val="#Nav: CustomerStatement_Fairmont/50091"/>
                                 <w:id w:val="-51153109"/>
                                 <w:placeholder>
                                   <w:docPart w:val="57B98E6055D04AB2886C1F74E98DFF58"/>
                                 </w:placeholder>
-                                <w:dataBinding w:prefixMappings="xmlns:ns0='urn:microsoft-dynamics-nav/reports/CustomerStatement_Fairmont/67148/'" w:xpath="/ns0:NavWordReportXmlPart[1]/ns0:Customer[1]/ns0:Integer[1]/ns0:AgingBandVisible[1]/ns0:AgingBandLoop[1]/ns0:AgingBandBufCol2Amt[1]" w:storeItemID="{E71A5C94-9D23-45CB-8C8A-976D20B4B572}"/>
+                                <w:dataBinding w:prefixMappings="xmlns:ns0='urn:microsoft-dynamics-nav/reports/CustomerStatement_Fairmont/50091/'" w:xpath="/ns0:NavWordReportXmlPart[1]/ns0:Customer[1]/ns0:Integer[1]/ns0:AgingBandVisible[1]/ns0:AgingBandLoop[1]/ns0:AgingBandBufCol2Amt[1]" w:storeItemID="{E71A5C94-9D23-45CB-8C8A-976D20B4B572}"/>
                                 <w:text/>
                               </w:sdtPr>
                               <w:sdtContent>
@@ -3838,12 +3838,12 @@
                                   <w:szCs w:val="18"/>
                                 </w:rPr>
                                 <w:alias w:val="#Nav: /Customer/Integer/AgingBandVisible/AgingBandLoop/AgingBandBufCol1Amt"/>
-                                <w:tag w:val="#Nav: CustomerStatement_Fairmont/67148"/>
+                                <w:tag w:val="#Nav: CustomerStatement_Fairmont/50091"/>
                                 <w:id w:val="412830405"/>
                                 <w:placeholder>
                                   <w:docPart w:val="57B98E6055D04AB2886C1F74E98DFF58"/>
                                 </w:placeholder>
-                                <w:dataBinding w:prefixMappings="xmlns:ns0='urn:microsoft-dynamics-nav/reports/CustomerStatement_Fairmont/67148/'" w:xpath="/ns0:NavWordReportXmlPart[1]/ns0:Customer[1]/ns0:Integer[1]/ns0:AgingBandVisible[1]/ns0:AgingBandLoop[1]/ns0:AgingBandBufCol1Amt[1]" w:storeItemID="{E71A5C94-9D23-45CB-8C8A-976D20B4B572}"/>
+                                <w:dataBinding w:prefixMappings="xmlns:ns0='urn:microsoft-dynamics-nav/reports/CustomerStatement_Fairmont/50091/'" w:xpath="/ns0:NavWordReportXmlPart[1]/ns0:Customer[1]/ns0:Integer[1]/ns0:AgingBandVisible[1]/ns0:AgingBandLoop[1]/ns0:AgingBandBufCol1Amt[1]" w:storeItemID="{E71A5C94-9D23-45CB-8C8A-976D20B4B572}"/>
                                 <w:text/>
                               </w:sdtPr>
                               <w:sdtContent>
@@ -4438,12 +4438,12 @@
               <w:szCs w:val="36"/>
             </w:rPr>
             <w:alias w:val="#Nav: /Customer/Integer/StatementCaption"/>
-            <w:tag w:val="#Nav: CustomerStatement_Fairmont/67148"/>
+            <w:tag w:val="#Nav: CustomerStatement_Fairmont/50091"/>
             <w:id w:val="-544907461"/>
             <w:placeholder>
               <w:docPart w:val="295D3EA6597A4A6EB3C8866896C65878"/>
             </w:placeholder>
-            <w:dataBinding w:prefixMappings="xmlns:ns0='urn:microsoft-dynamics-nav/reports/CustomerStatement_Fairmont/67148/'" w:xpath="/ns0:NavWordReportXmlPart[1]/ns0:Customer[1]/ns0:Integer[1]/ns0:StatementCaption[1]" w:storeItemID="{E71A5C94-9D23-45CB-8C8A-976D20B4B572}"/>
+            <w:dataBinding w:prefixMappings="xmlns:ns0='urn:microsoft-dynamics-nav/reports/CustomerStatement_Fairmont/50091/'" w:xpath="/ns0:NavWordReportXmlPart[1]/ns0:Customer[1]/ns0:Integer[1]/ns0:StatementCaption[1]" w:storeItemID="{E71A5C94-9D23-45CB-8C8A-976D20B4B572}"/>
             <w:text/>
           </w:sdtPr>
           <w:sdtContent>
@@ -6748,235 +6748,237 @@
 <b:Sources xmlns:b="http://schemas.openxmlformats.org/officeDocument/2006/bibliography" xmlns="http://schemas.openxmlformats.org/officeDocument/2006/bibliography" SelectedStyle="\apasixtheditionofficeonline.xsl" StyleName="APA" Version="6"/>
 </file>
 
-<file path=customXml/item3.xml>��< ? x m l   v e r s i o n = " 1 . 0 "   e n c o d i n g = " u t f - 1 6 " ? > - 
- < N a v W o r d R e p o r t X m l P a r t   x m l n s = " u r n : m i c r o s o f t - d y n a m i c s - n a v / r e p o r t s / C u s t o m e r S t a t e m e n t _ F a i r m o n t / 6 7 1 4 8 / " > - 
-     < C u s t o m e r > - 
-         < N o _ C u s t > N o _ C u s t < / N o _ C u s t > - 
-         < I n t e g e r > - 
-             < B a n k A c c N o _ C o m p a n y I n f o > B a n k A c c N o _ C o m p a n y I n f o < / B a n k A c c N o _ C o m p a n y I n f o > - 
-             < B a n k A c c N o _ C o m p a n y I n f o C a p t i o n > B a n k A c c N o _ C o m p a n y I n f o C a p t i o n < / B a n k A c c N o _ C o m p a n y I n f o C a p t i o n > - 
-             < B a n k N a m e _ C o m p a n y I n f o > B a n k N a m e _ C o m p a n y I n f o < / B a n k N a m e _ C o m p a n y I n f o > - 
-             < B a n k N a m e _ C o m p a n y I n f o C a p t i o n > B a n k N a m e _ C o m p a n y I n f o C a p t i o n < / B a n k N a m e _ C o m p a n y I n f o C a p t i o n > - 
-             < C o m p a n y A d d r 1 > C o m p a n y A d d r 1 < / C o m p a n y A d d r 1 > - 
-             < C o m p a n y A d d r 2 > C o m p a n y A d d r 2 < / C o m p a n y A d d r 2 > - 
-             < C o m p a n y A d d r 3 > C o m p a n y A d d r 3 < / C o m p a n y A d d r 3 > - 
-             < C o m p a n y A d d r 4 > C o m p a n y A d d r 4 < / C o m p a n y A d d r 4 > - 
-             < C o m p a n y A d d r 5 > C o m p a n y A d d r 5 < / C o m p a n y A d d r 5 > - 
-             < C o m p a n y A d d r 6 > C o m p a n y A d d r 6 < / C o m p a n y A d d r 6 > - 
-             < C o m p a n y A d d r 7 > C o m p a n y A d d r 7 < / C o m p a n y A d d r 7 > - 
-             < C o m p a n y A d d r 8 > C o m p a n y A d d r 8 < / C o m p a n y A d d r 8 > - 
-             < C o m p a n y I n f o 1 P i c t u r e   / > - 
-             < C o m p a n y I n f o 2 P i c t u r e   / > - 
-             < C o m p a n y I n f o 3 P i c t u r e   / > - 
-             < C o m p a n y I n f o E m a i l > C o m p a n y I n f o E m a i l < / C o m p a n y I n f o E m a i l > - 
-             < C o m p a n y I n f o E m a i l C a p t i o n > C o m p a n y I n f o E m a i l C a p t i o n < / C o m p a n y I n f o E m a i l C a p t i o n > - 
-             < C o m p a n y I n f o H o m e P a g e > C o m p a n y I n f o H o m e P a g e < / C o m p a n y I n f o H o m e P a g e > - 
-             < C o m p a n y I n f o H o m e p a g e C a p t i o n > C o m p a n y I n f o H o m e p a g e C a p t i o n < / C o m p a n y I n f o H o m e p a g e C a p t i o n > - 
-             < C o m p a n y L e g a l O f f i c e > C o m p a n y L e g a l O f f i c e < / C o m p a n y L e g a l O f f i c e > - 
-             < C o m p a n y L e g a l O f f i c e _ L b l > C o m p a n y L e g a l O f f i c e _ L b l < / C o m p a n y L e g a l O f f i c e _ L b l > - 
-             < C o m p a n y P i c t u r e   / > - 
-             < C u r r R e p o r t P a g e N o C a p t i o n > C u r r R e p o r t P a g e N o C a p t i o n < / C u r r R e p o r t P a g e N o C a p t i o n > - 
-             < C u s t A d d r 1 > C u s t A d d r 1 < / C u s t A d d r 1 > - 
-             < C u s t A d d r 2 > C u s t A d d r 2 < / C u s t A d d r 2 > - 
-             < C u s t A d d r 3 > C u s t A d d r 3 < / C u s t A d d r 3 > - 
-             < C u s t A d d r 4 > C u s t A d d r 4 < / C u s t A d d r 4 > - 
-             < C u s t A d d r 5 > C u s t A d d r 5 < / C u s t A d d r 5 > - 
-             < C u s t A d d r 6 > C u s t A d d r 6 < / C u s t A d d r 6 > - 
-             < C u s t A d d r 7 > C u s t A d d r 7 < / C u s t A d d r 7 > - 
-             < C u s t A d d r 8 > C u s t A d d r 8 < / C u s t A d d r 8 > - 
-             < C u s t B a l a n c e C a p t i o n > C u s t B a l a n c e C a p t i o n < / C u s t B a l a n c e C a p t i o n > - 
-             < D e s c _ C u s t L e d g E n t r y 2 C a p t i o n > D e s c _ C u s t L e d g E n t r y 2 C a p t i o n < / D e s c _ C u s t L e d g E n t r y 2 C a p t i o n > - 
-             < D o c D a t e C a p t i o n > D o c D a t e C a p t i o n < / D o c D a t e C a p t i o n > - 
-             < D o c N o _ D t l d C u s t L e d g E n t r i e s C a p t i o n > D o c N o _ D t l d C u s t L e d g E n t r i e s C a p t i o n < / D o c N o _ D t l d C u s t L e d g E n t r i e s C a p t i o n > - 
-             < D u e D a t e _ C u s t L e d g E n t r y 2 C a p t i o n > D u e D a t e _ C u s t L e d g E n t r y 2 C a p t i o n < / D u e D a t e _ C u s t L e d g E n t r y 2 C a p t i o n > - 
-             < E n d D a t e > E n d D a t e < / E n d D a t e > - 
-             < E n d D a t e C a p t i o n > E n d D a t e C a p t i o n < / E n d D a t e C a p t i o n > - 
-             < G i r o N o _ C o m p a n y I n f o > G i r o N o _ C o m p a n y I n f o < / G i r o N o _ C o m p a n y I n f o > - 
-             < G i r o N o _ C o m p a n y I n f o C a p t i o n > G i r o N o _ C o m p a n y I n f o C a p t i o n < / G i r o N o _ C o m p a n y I n f o C a p t i o n > - 
-             < L a s t S t a t m n t N o _ C u s t > L a s t S t a t m n t N o _ C u s t < / L a s t S t a t m n t N o _ C u s t > - 
-             < L a s t S t a t m n t N o _ C u s t C a p t i o n > L a s t S t a t m n t N o _ C u s t C a p t i o n < / L a s t S t a t m n t N o _ C u s t C a p t i o n > - 
-             < N o 1 _ C u s t > N o 1 _ C u s t < / N o 1 _ C u s t > - 
-             < N o 1 _ C u s t C a p t i o n > N o 1 _ C u s t C a p t i o n < / N o 1 _ C u s t C a p t i o n > - 
-             < O r i g i n a l A m t _ C u s t L e d g E n t r y 2 C a p t i o n > O r i g i n a l A m t _ C u s t L e d g E n t r y 2 C a p t i o n < / O r i g i n a l A m t _ C u s t L e d g E n t r y 2 C a p t i o n > - 
-             < P h o n e N o _ C o m p a n y I n f o > P h o n e N o _ C o m p a n y I n f o < / P h o n e N o _ C o m p a n y I n f o > - 
-             < P h o n e N o _ C o m p a n y I n f o C a p t i o n > P h o n e N o _ C o m p a n y I n f o C a p t i o n < / P h o n e N o _ C o m p a n y I n f o C a p t i o n > - 
-             < P o s t D a t e _ D t l d C u s t L e d g E n t r i e s C a p t i o n > P o s t D a t e _ D t l d C u s t L e d g E n t r i e s C a p t i o n < / P o s t D a t e _ D t l d C u s t L e d g E n t r i e s C a p t i o n > - 
-             < R e m a i n A m t C u s t L e d g E n t r y 2 C a p t i o n > R e m a i n A m t C u s t L e d g E n t r y 2 C a p t i o n < / R e m a i n A m t C u s t L e d g E n t r y 2 C a p t i o n > - 
-             < S t a r t D a t e > S t a r t D a t e < / S t a r t D a t e > - 
-             < S t a r t D a t e C a p t i o n > S t a r t D a t e C a p t i o n < / S t a r t D a t e C a p t i o n > - 
-             < S t a t e m e n t C a p t i o n > S t a t e m e n t C a p t i o n < / S t a t e m e n t C a p t i o n > - 
-             < T o d a y F o r m a t t e d > T o d a y F o r m a t t e d < / T o d a y F o r m a t t e d > - 
-             < V A T R e g N o _ C o m p a n y I n f o > V A T R e g N o _ C o m p a n y I n f o < / V A T R e g N o _ C o m p a n y I n f o > - 
-             < V A T R e g N o _ C o m p a n y I n f o C a p t i o n > V A T R e g N o _ C o m p a n y I n f o C a p t i o n < / V A T R e g N o _ C o m p a n y I n f o C a p t i o n > - 
-             < C u r r e n c y L o o p > - 
-                 < T o t a l _ C a p t i o n 2 > T o t a l _ C a p t i o n 2 < / T o t a l _ C a p t i o n 2 > - 
-                 < C u s t L e d g E n t r y H d r > - 
-                     < C u r r e n c y 2 C o d e _ C u s t L e d g E n t r y H d r > C u r r e n c y 2 C o d e _ C u s t L e d g E n t r y H d r < / C u r r e n c y 2 C o d e _ C u s t L e d g E n t r y H d r > - 
-                     < C u r r e n c y C o d e 3 > C u r r e n c y C o d e 3 < / C u r r e n c y C o d e 3 > - 
-                     < C u s t B a l a n c e _ C u s t L e d g E n t r y H d r > C u s t B a l a n c e _ C u s t L e d g E n t r y H d r < / C u s t B a l a n c e _ C u s t L e d g E n t r y H d r > - 
-                     < D t l d C u s t L e d g E n t r y T y p e > D t l d C u s t L e d g E n t r y T y p e < / D t l d C u s t L e d g E n t r y T y p e > - 
-                     < E n t r i e s E x i s t s > E n t r i e s E x i s t s < / E n t r i e s E x i s t s > - 
-                     < I s N e w C u s t C u r r e n c y G r o u p > I s N e w C u s t C u r r e n c y G r o u p < / I s N e w C u s t C u r r e n c y G r o u p > - 
-                     < P r i n t L i n e > P r i n t L i n e < / P r i n t L i n e > - 
-                     < S t a r t B a l a n c e > S t a r t B a l a n c e < / S t a r t B a l a n c e > - 
-                     < D t l d C u s t L e d g E n t r i e s > - 
-                         < A m t _ D t l d C u s t L e d g E n t r i e s > A m t _ D t l d C u s t L e d g E n t r i e s < / A m t _ D t l d C u s t L e d g E n t r i e s > - 
-                         < C u r r C o d e _ D t l d C u s t L e d g E n t r i e s > C u r r C o d e _ D t l d C u s t L e d g E n t r i e s < / C u r r C o d e _ D t l d C u s t L e d g E n t r i e s > - 
-                         < C u r r e n c y 2 C o d e > C u r r e n c y 2 C o d e < / C u r r e n c y 2 C o d e > - 
-                         < C u s t B a l a n c e > C u s t B a l a n c e < / C u s t B a l a n c e > - 
-                         < D e s c r i p t i o n > D e s c r i p t i o n < / D e s c r i p t i o n > - 
-                         < D o c N o _ D t l d C u s t L e d g E n t r i e s > D o c N o _ D t l d C u s t L e d g E n t r i e s < / D o c N o _ D t l d C u s t L e d g E n t r i e s > - 
-                         < D u e D a t e _ D t l d C u s t L e d g E n t r i e s > D u e D a t e _ D t l d C u s t L e d g E n t r i e s < / D u e D a t e _ D t l d C u s t L e d g E n t r i e s > - 
-                         < P o s t D a t e _ D t l d C u s t L e d g E n t r i e s > P o s t D a t e _ D t l d C u s t L e d g E n t r i e s < / P o s t D a t e _ D t l d C u s t L e d g E n t r i e s > - 
-                         < R e m a i n A m t _ D t l d C u s t L e d g E n t r i e s > R e m a i n A m t _ D t l d C u s t L e d g E n t r i e s < / R e m a i n A m t _ D t l d C u s t L e d g E n t r i e s > - 
-                         < Y o u r R e f e r e n c e _ D t l d C u s t L e d g E n t r i e s > Y o u r R e f e r e n c e _ D t l d C u s t L e d g E n t r i e s < / Y o u r R e f e r e n c e _ D t l d C u s t L e d g E n t r i e s > +<file path=customXml/item4.xml>��< ? x m l   v e r s i o n = " 1 . 0 "   e n c o d i n g = " u t f - 1 6 " ? > + 
+ < N a v W o r d R e p o r t X m l P a r t   x m l n s = " u r n : m i c r o s o f t - d y n a m i c s - b u s i n e s s c e n t r a l / i n t e r n a l / e x t e n d e d / r e p o r t s / C u s t o m e r S t a t e m e n t _ F a i r m o n t / 5 0 0 9 1 / " > + 
+     < T o o l t i p s   / > + 
+     < C u s t o m e r   E l e m e n t T y p e = " D a t a I t e m "   E l e m e n t I d = " 1 5 2 5 1 9 1 9 9 " > + 
+         < N o _ C u s t   E l e m e n t T y p e = " C o l u m n "   E l e m e n t I d = " 6 0 3 9 7 0 8 4 6 "   D a t a T y p e = " C o d e " > N o _ C u s t < / N o _ C u s t > + 
+         < I n t e g e r   E l e m e n t T y p e = " D a t a I t e m "   E l e m e n t I d = " 1 7 3 5 6 9 8 6 1 9 " > + 
+             < B a n k A c c N o _ C o m p a n y I n f o   E l e m e n t T y p e = " C o l u m n "   E l e m e n t I d = " 8 6 4 5 4 5 9 0 7 "   D a t a T y p e = " T e x t " > B a n k A c c N o _ C o m p a n y I n f o < / B a n k A c c N o _ C o m p a n y I n f o > + 
+             < B a n k A c c N o _ C o m p a n y I n f o C a p t i o n   E l e m e n t T y p e = " C o l u m n "   E l e m e n t I d = " 1 9 1 8 8 5 3 8 1 3 "   D a t a T y p e = " L a b e l " > B a n k A c c N o _ C o m p a n y I n f o C a p t i o n < / B a n k A c c N o _ C o m p a n y I n f o C a p t i o n > + 
+             < B a n k N a m e _ C o m p a n y I n f o   E l e m e n t T y p e = " C o l u m n "   E l e m e n t I d = " 1 9 1 7 2 0 2 0 4 2 "   D a t a T y p e = " T e x t " > B a n k N a m e _ C o m p a n y I n f o < / B a n k N a m e _ C o m p a n y I n f o > + 
+             < B a n k N a m e _ C o m p a n y I n f o C a p t i o n   E l e m e n t T y p e = " C o l u m n "   E l e m e n t I d = " 1 6 0 4 3 0 7 5 8 8 "   D a t a T y p e = " L a b e l " > B a n k N a m e _ C o m p a n y I n f o C a p t i o n < / B a n k N a m e _ C o m p a n y I n f o C a p t i o n > + 
+             < C o m p a n y A d d r 1   E l e m e n t T y p e = " C o l u m n "   E l e m e n t I d = " 8 8 5 0 9 6 1 0 4 "   D a t a T y p e = " T e x t " > C o m p a n y A d d r 1 < / C o m p a n y A d d r 1 > + 
+             < C o m p a n y A d d r 2   E l e m e n t T y p e = " C o l u m n "   E l e m e n t I d = " 1 0 2 7 9 9 3 7 4 7 "   D a t a T y p e = " T e x t " > C o m p a n y A d d r 2 < / C o m p a n y A d d r 2 > + 
+             < C o m p a n y A d d r 3   E l e m e n t T y p e = " C o l u m n "   E l e m e n t I d = " 3 9 0 2 9 7 1 3 0 "   D a t a T y p e = " T e x t " > C o m p a n y A d d r 3 < / C o m p a n y A d d r 3 > + 
+             < C o m p a n y A d d r 4   E l e m e n t T y p e = " C o l u m n "   E l e m e n t I d = " 1 9 9 1 5 8 0 3 1 5 "   D a t a T y p e = " T e x t " > C o m p a n y A d d r 4 < / C o m p a n y A d d r 4 > + 
+             < C o m p a n y A d d r 5   E l e m e n t T y p e = " C o l u m n "   E l e m e n t I d = " 1 6 6 5 6 9 0 3 6 4 "   D a t a T y p e = " T e x t " > C o m p a n y A d d r 5 < / C o m p a n y A d d r 5 > + 
+             < C o m p a n y A d d r 6   E l e m e n t T y p e = " C o l u m n "   E l e m e n t I d = " 7 1 6 1 8 7 0 8 1 "   D a t a T y p e = " T e x t " > C o m p a n y A d d r 6 < / C o m p a n y A d d r 6 > + 
+             < C o m p a n y A d d r 7   E l e m e n t T y p e = " C o l u m n "   E l e m e n t I d = " 1 3 5 3 8 8 3 6 9 8 "   D a t a T y p e = " T e x t " > C o m p a n y A d d r 7 < / C o m p a n y A d d r 7 > + 
+             < C o m p a n y A d d r 8   E l e m e n t T y p e = " C o l u m n "   E l e m e n t I d = " 1 0 5 4 0 0 5 1 2 7 "   D a t a T y p e = " T e x t " > C o m p a n y A d d r 8 < / C o m p a n y A d d r 8 > + 
+             < C o m p a n y I n f o 1 P i c t u r e   E l e m e n t T y p e = " C o l u m n "   E l e m e n t I d = " 1 0 1 8 2 0 6 5 0 3 "   D a t a T y p e = " B l o b "   / > + 
+             < C o m p a n y I n f o 2 P i c t u r e   E l e m e n t T y p e = " C o l u m n "   E l e m e n t I d = " 9 8 9 6 7 0 4 7 4 "   D a t a T y p e = " B l o b "   / > + 
+             < C o m p a n y I n f o 3 P i c t u r e   E l e m e n t T y p e = " C o l u m n "   E l e m e n t I d = " 5 7 9 7 0 4 0 5 9 "   D a t a T y p e = " B l o b "   / > + 
+             < C o m p a n y I n f o E m a i l   E l e m e n t T y p e = " C o l u m n "   E l e m e n t I d = " 9 1 4 8 1 2 2 4 0 "   D a t a T y p e = " T e x t " > C o m p a n y I n f o E m a i l < / C o m p a n y I n f o E m a i l > + 
+             < C o m p a n y I n f o E m a i l C a p t i o n   E l e m e n t T y p e = " C o l u m n "   E l e m e n t I d = " 1 5 5 2 1 6 7 2 3 0 "   D a t a T y p e = " L a b e l " > C o m p a n y I n f o E m a i l C a p t i o n < / C o m p a n y I n f o E m a i l C a p t i o n > + 
+             < C o m p a n y I n f o H o m e P a g e   E l e m e n t T y p e = " C o l u m n "   E l e m e n t I d = " 1 5 3 0 3 1 7 4 4 0 "   D a t a T y p e = " T e x t " > C o m p a n y I n f o H o m e P a g e < / C o m p a n y I n f o H o m e P a g e > + 
+             < C o m p a n y I n f o H o m e p a g e C a p t i o n   E l e m e n t T y p e = " C o l u m n "   E l e m e n t I d = " 1 5 2 9 8 2 3 8 6 "   D a t a T y p e = " L a b e l " > C o m p a n y I n f o H o m e p a g e C a p t i o n < / C o m p a n y I n f o H o m e p a g e C a p t i o n > + 
+             < C o m p a n y L e g a l O f f i c e   E l e m e n t T y p e = " C o l u m n "   E l e m e n t I d = " 7 1 4 2 5 8 1 1 1 "   D a t a T y p e = " T e x t " > C o m p a n y L e g a l O f f i c e < / C o m p a n y L e g a l O f f i c e > + 
+             < C o m p a n y L e g a l O f f i c e _ L b l   E l e m e n t T y p e = " C o l u m n "   E l e m e n t I d = " 1 5 3 3 1 7 5 1 0 8 "   D a t a T y p e = " T e x t " > C o m p a n y L e g a l O f f i c e _ L b l < / C o m p a n y L e g a l O f f i c e _ L b l > + 
+             < C o m p a n y P i c t u r e   E l e m e n t T y p e = " C o l u m n "   E l e m e n t I d = " 1 3 9 7 4 1 1 0 7 4 "   D a t a T y p e = " B l o b "   / > + 
+             < C u r r R e p o r t P a g e N o C a p t i o n   E l e m e n t T y p e = " C o l u m n "   E l e m e n t I d = " 2 0 2 2 2 2 5 3 5 1 "   D a t a T y p e = " L a b e l " > C u r r R e p o r t P a g e N o C a p t i o n < / C u r r R e p o r t P a g e N o C a p t i o n > + 
+             < C u s t A d d r 1   E l e m e n t T y p e = " C o l u m n "   E l e m e n t I d = " 1 3 6 8 0 2 7 5 2 2 "   D a t a T y p e = " T e x t " > C u s t A d d r 1 < / C u s t A d d r 1 > + 
+             < C u s t A d d r 2   E l e m e n t T y p e = " C o l u m n "   E l e m e n t I d = " 2 0 0 5 7 2 4 1 3 9 "   D a t a T y p e = " T e x t " > C u s t A d d r 2 < / C u s t A d d r 2 > + 
+             < C u s t A d d r 3   E l e m e n t T y p e = " C o l u m n "   E l e m e n t I d = " 1 6 5 1 5 4 6 5 4 0 "   D a t a T y p e = " T e x t " > C u s t A d d r 3 < / C u s t A d d r 3 > + 
+             < C u s t A d d r 4   E l e m e n t T y p e = " C o l u m n "   E l e m e n t I d = " 1 0 1 3 8 4 9 9 2 3 "   D a t a T y p e = " T e x t " > C u s t A d d r 4 < / C u s t A d d r 4 > + 
+             < C u s t A d d r 5   E l e m e n t T y p e = " C o l u m n "   E l e m e n t I d = " 3 7 6 1 5 3 3 0 6 "   D a t a T y p e = " T e x t " > C u s t A d d r 5 < / C u s t A d d r 5 > + 
+             < C u s t A d d r 6   E l e m e n t T y p e = " C o l u m n "   E l e m e n t I d = " 2 6 1 5 4 3 3 1 1 "   D a t a T y p e = " T e x t " > C u s t A d d r 6 < / C u s t A d d r 6 > + 
+             < C u s t A d d r 7   E l e m e n t T y p e = " C o l u m n "   E l e m e n t I d = " 8 9 9 2 3 9 9 2 8 "   D a t a T y p e = " T e x t " > C u s t A d d r 7 < / C u s t A d d r 7 > + 
+             < C u s t A d d r 8   E l e m e n t T y p e = " C o l u m n "   E l e m e n t I d = " 1 5 3 6 9 3 6 5 4 5 "   D a t a T y p e = " T e x t " > C u s t A d d r 8 < / C u s t A d d r 8 > + 
+             < C u s t B a l a n c e C a p t i o n   E l e m e n t T y p e = " C o l u m n "   E l e m e n t I d = " 6 0 8 6 6 1 8 8 4 "   D a t a T y p e = " L a b e l " > C u s t B a l a n c e C a p t i o n < / C u s t B a l a n c e C a p t i o n > + 
+             < D e s c _ C u s t L e d g E n t r y 2 C a p t i o n   E l e m e n t T y p e = " C o l u m n "   E l e m e n t I d = " 1 8 7 4 4 3 7 6 7 2 "   D a t a T y p e = " S t r i n g " > D e s c _ C u s t L e d g E n t r y 2 C a p t i o n < / D e s c _ C u s t L e d g E n t r y 2 C a p t i o n > + 
+             < D o c D a t e C a p t i o n   E l e m e n t T y p e = " C o l u m n "   E l e m e n t I d = " 1 1 5 7 6 2 1 5 3 7 "   D a t a T y p e = " L a b e l " > D o c D a t e C a p t i o n < / D o c D a t e C a p t i o n > + 
+             < D o c N o _ D t l d C u s t L e d g E n t r i e s C a p t i o n   E l e m e n t T y p e = " C o l u m n "   E l e m e n t I d = " 6 0 1 5 1 5 5 5 6 "   D a t a T y p e = " S t r i n g " > D o c N o _ D t l d C u s t L e d g E n t r i e s C a p t i o n < / D o c N o _ D t l d C u s t L e d g E n t r i e s C a p t i o n > + 
+             < D u e D a t e _ C u s t L e d g E n t r y 2 C a p t i o n   E l e m e n t T y p e = " C o l u m n "   E l e m e n t I d = " 8 1 9 2 8 5 8 5 "   D a t a T y p e = " L a b e l " > D u e D a t e _ C u s t L e d g E n t r y 2 C a p t i o n < / D u e D a t e _ C u s t L e d g E n t r y 2 C a p t i o n > + 
+             < E n d D a t e   E l e m e n t T y p e = " C o l u m n "   E l e m e n t I d = " 1 3 0 2 0 8 2 6 1 0 "   D a t a T y p e = " S t r i n g " > E n d D a t e < / E n d D a t e > + 
+             < E n d D a t e C a p t i o n   E l e m e n t T y p e = " C o l u m n "   E l e m e n t I d = " 1 3 5 3 1 9 2 8 0 "   D a t a T y p e = " L a b e l " > E n d D a t e C a p t i o n < / E n d D a t e C a p t i o n > + 
+             < G i r o N o _ C o m p a n y I n f o   E l e m e n t T y p e = " C o l u m n "   E l e m e n t I d = " 5 6 5 4 8 5 5 1 9 "   D a t a T y p e = " T e x t " > G i r o N o _ C o m p a n y I n f o < / G i r o N o _ C o m p a n y I n f o > + 
+             < G i r o N o _ C o m p a n y I n f o C a p t i o n   E l e m e n t T y p e = " C o l u m n "   E l e m e n t I d = " 1 6 5 8 5 3 3 3 6 9 "   D a t a T y p e = " L a b e l " > G i r o N o _ C o m p a n y I n f o C a p t i o n < / G i r o N o _ C o m p a n y I n f o C a p t i o n > + 
+             < L a s t S t a t m n t N o _ C u s t   E l e m e n t T y p e = " C o l u m n "   E l e m e n t I d = " 1 3 8 8 0 8 0 0 2 9 "   D a t a T y p e = " S t r i n g " > L a s t S t a t m n t N o _ C u s t < / L a s t S t a t m n t N o _ C u s t > + 
+             < L a s t S t a t m n t N o _ C u s t C a p t i o n   E l e m e n t T y p e = " C o l u m n "   E l e m e n t I d = " 8 9 2 5 6 7 8 3 5 "   D a t a T y p e = " L a b e l " > L a s t S t a t m n t N o _ C u s t C a p t i o n < / L a s t S t a t m n t N o _ C u s t C a p t i o n > + 
+             < N o 1 _ C u s t   E l e m e n t T y p e = " C o l u m n "   E l e m e n t I d = " 9 1 2 7 7 0 5 0 9 "   D a t a T y p e = " C o d e " > N o 1 _ C u s t < / N o 1 _ C u s t > + 
+             < N o 1 _ C u s t C a p t i o n   E l e m e n t T y p e = " C o l u m n "   E l e m e n t I d = " 1 6 6 1 8 9 3 3 9 7 "   D a t a T y p e = " L a b e l " > N o 1 _ C u s t C a p t i o n < / N o 1 _ C u s t C a p t i o n > + 
+             < O r i g i n a l A m t _ C u s t L e d g E n t r y 2 C a p t i o n   E l e m e n t T y p e = " C o l u m n "   E l e m e n t I d = " 8 4 8 8 4 4 3 9 2 "   D a t a T y p e = " S t r i n g " > O r i g i n a l A m t _ C u s t L e d g E n t r y 2 C a p t i o n < / O r i g i n a l A m t _ C u s t L e d g E n t r y 2 C a p t i o n > + 
+             < P h o n e N o _ C o m p a n y I n f o   E l e m e n t T y p e = " C o l u m n "   E l e m e n t I d = " 1 6 0 6 4 2 8 3 9 4 "   D a t a T y p e = " T e x t " > P h o n e N o _ C o m p a n y I n f o < / P h o n e N o _ C o m p a n y I n f o > + 
+             < P h o n e N o _ C o m p a n y I n f o C a p t i o n   E l e m e n t T y p e = " C o l u m n "   E l e m e n t I d = " 1 8 7 6 0 4 7 7 0 4 "   D a t a T y p e = " L a b e l " > P h o n e N o _ C o m p a n y I n f o C a p t i o n < / P h o n e N o _ C o m p a n y I n f o C a p t i o n > + 
+             < P o s t D a t e _ D t l d C u s t L e d g E n t r i e s C a p t i o n   E l e m e n t T y p e = " C o l u m n "   E l e m e n t I d = " 1 0 3 3 1 2 5 4 2 5 "   D a t a T y p e = " L a b e l " > P o s t D a t e _ D t l d C u s t L e d g E n t r i e s C a p t i o n < / P o s t D a t e _ D t l d C u s t L e d g E n t r i e s C a p t i o n > + 
+             < R e m a i n A m t C u s t L e d g E n t r y 2 C a p t i o n   E l e m e n t T y p e = " C o l u m n "   E l e m e n t I d = " 1 6 3 2 7 0 6 4 0 6 "   D a t a T y p e = " S t r i n g " > R e m a i n A m t C u s t L e d g E n t r y 2 C a p t i o n < / R e m a i n A m t C u s t L e d g E n t r y 2 C a p t i o n > + 
+             < S t a r t D a t e   E l e m e n t T y p e = " C o l u m n "   E l e m e n t I d = " 1 4 5 7 6 6 9 4 1 7 "   D a t a T y p e = " S t r i n g " > S t a r t D a t e < / S t a r t D a t e > + 
+             < S t a r t D a t e C a p t i o n   E l e m e n t T y p e = " C o l u m n "   E l e m e n t I d = " 1 9 8 0 7 4 5 8 7 1 "   D a t a T y p e = " L a b e l " > S t a r t D a t e C a p t i o n < / S t a r t D a t e C a p t i o n > + 
+             < S t a t e m e n t C a p t i o n   E l e m e n t T y p e = " C o l u m n "   E l e m e n t I d = " 2 3 9 3 8 2 "   D a t a T y p e = " L a b e l " > S t a t e m e n t C a p t i o n < / S t a t e m e n t C a p t i o n > + 
+             < T o d a y F o r m a t t e d   E l e m e n t T y p e = " C o l u m n "   E l e m e n t I d = " 2 7 0 4 5 1 4 0 "   D a t a T y p e = " S t r i n g " > T o d a y F o r m a t t e d < / T o d a y F o r m a t t e d > + 
+             < V A T R e g N o _ C o m p a n y I n f o   E l e m e n t T y p e = " C o l u m n "   E l e m e n t I d = " 9 4 4 0 2 9 3 7 7 "   D a t a T y p e = " T e x t " > V A T R e g N o _ C o m p a n y I n f o < / V A T R e g N o _ C o m p a n y I n f o > + 
+             < V A T R e g N o _ C o m p a n y I n f o C a p t i o n   E l e m e n t T y p e = " C o l u m n "   E l e m e n t I d = " 1 1 9 3 2 7 6 3 7 5 "   D a t a T y p e = " L a b e l " > V A T R e g N o _ C o m p a n y I n f o C a p t i o n < / V A T R e g N o _ C o m p a n y I n f o C a p t i o n > + 
+             < C u r r e n c y L o o p   E l e m e n t T y p e = " D a t a I t e m "   E l e m e n t I d = " 1 3 0 4 5 2 2 1 9 8 " > + 
+                 < T o t a l _ C a p t i o n 2   E l e m e n t T y p e = " C o l u m n "   E l e m e n t I d = " 1 9 9 1 3 0 2 6 0 "   D a t a T y p e = " L a b e l " > T o t a l _ C a p t i o n 2 < / T o t a l _ C a p t i o n 2 > + 
+                 < C u s t L e d g E n t r y H d r   E l e m e n t T y p e = " D a t a I t e m "   E l e m e n t I d = " 9 4 2 7 0 7 9 3 2 " > + 
+                     < C u r r e n c y 2 C o d e _ C u s t L e d g E n t r y H d r   E l e m e n t T y p e = " C o l u m n "   E l e m e n t I d = " 1 3 4 9 2 7 9 6 1 1 "   D a t a T y p e = " S t r i n g " > C u r r e n c y 2 C o d e _ C u s t L e d g E n t r y H d r < / C u r r e n c y 2 C o d e _ C u s t L e d g E n t r y H d r > + 
+                     < C u r r e n c y C o d e 3   E l e m e n t T y p e = " C o l u m n "   E l e m e n t I d = " 6 1 8 1 4 2 9 0 8 "   D a t a T y p e = " C o d e " > C u r r e n c y C o d e 3 < / C u r r e n c y C o d e 3 > + 
+                     < C u s t B a l a n c e _ C u s t L e d g E n t r y H d r   E l e m e n t T y p e = " C o l u m n "   E l e m e n t I d = " 4 9 7 1 9 1 3 5 6 "   D a t a T y p e = " D e c i m a l " > C u s t B a l a n c e _ C u s t L e d g E n t r y H d r < / C u s t B a l a n c e _ C u s t L e d g E n t r y H d r > + 
+                     < D t l d C u s t L e d g E n t r y T y p e   E l e m e n t T y p e = " C o l u m n "   E l e m e n t I d = " 8 9 2 0 6 7 4 8 6 "   D a t a T y p e = " S t r i n g " > D t l d C u s t L e d g E n t r y T y p e < / D t l d C u s t L e d g E n t r y T y p e > + 
+                     < E n t r i e s E x i s t s   E l e m e n t T y p e = " C o l u m n "   E l e m e n t I d = " 1 8 9 9 2 2 0 4 1 "   D a t a T y p e = " B o o l e a n " > E n t r i e s E x i s t s < / E n t r i e s E x i s t s > + 
+                     < I s N e w C u s t C u r r e n c y G r o u p   E l e m e n t T y p e = " C o l u m n "   E l e m e n t I d = " 1 1 6 2 5 3 5 5 3 8 "   D a t a T y p e = " B o o l e a n " > I s N e w C u s t C u r r e n c y G r o u p < / I s N e w C u s t C u r r e n c y G r o u p > + 
+                     < P r i n t L i n e   E l e m e n t T y p e = " C o l u m n "   E l e m e n t I d = " 5 9 8 4 7 9 9 9 0 "   D a t a T y p e = " B o o l e a n " > P r i n t L i n e < / P r i n t L i n e > + 
+                     < S t a r t B a l a n c e   E l e m e n t T y p e = " C o l u m n "   E l e m e n t I d = " 3 2 9 4 8 3 5 7 9 "   D a t a T y p e = " D e c i m a l " > S t a r t B a l a n c e < / S t a r t B a l a n c e > + 
+                     < D t l d C u s t L e d g E n t r i e s   E l e m e n t T y p e = " D a t a I t e m "   E l e m e n t I d = " 1 1 1 1 4 6 3 1 7 2 " > + 
+                         < A m t _ D t l d C u s t L e d g E n t r i e s   E l e m e n t T y p e = " C o l u m n "   E l e m e n t I d = " 8 9 7 9 8 5 1 7 9 "   D a t a T y p e = " D e c i m a l " > A m t _ D t l d C u s t L e d g E n t r i e s < / A m t _ D t l d C u s t L e d g E n t r i e s > + 
+                         < C u r r C o d e _ D t l d C u s t L e d g E n t r i e s   E l e m e n t T y p e = " C o l u m n "   E l e m e n t I d = " 3 2 7 0 9 9 9 8 4 "   D a t a T y p e = " C o d e " > C u r r C o d e _ D t l d C u s t L e d g E n t r i e s < / C u r r C o d e _ D t l d C u s t L e d g E n t r i e s > + 
+                         < C u r r e n c y 2 C o d e   E l e m e n t T y p e = " C o l u m n "   E l e m e n t I d = " 4 6 5 9 9 3 8 2 7 "   D a t a T y p e = " C o d e " > C u r r e n c y 2 C o d e < / C u r r e n c y 2 C o d e > + 
+                         < C u s t B a l a n c e   E l e m e n t T y p e = " C o l u m n "   E l e m e n t I d = " 1 4 1 3 7 0 1 5 0 2 "   D a t a T y p e = " D e c i m a l " > C u s t B a l a n c e < / C u s t B a l a n c e > + 
+                         < D e s c r i p t i o n   E l e m e n t T y p e = " C o l u m n "   E l e m e n t I d = " 1 3 1 4 3 5 1 3 0 7 "   D a t a T y p e = " T e x t " > D e s c r i p t i o n < / D e s c r i p t i o n > + 
+                         < D o c N o _ D t l d C u s t L e d g E n t r i e s   E l e m e n t T y p e = " C o l u m n "   E l e m e n t I d = " 2 2 4 2 9 8 6 5 4 "   D a t a T y p e = " C o d e " > D o c N o _ D t l d C u s t L e d g E n t r i e s < / D o c N o _ D t l d C u s t L e d g E n t r i e s > + 
+                         < D u e D a t e _ D t l d C u s t L e d g E n t r i e s   E l e m e n t T y p e = " C o l u m n "   E l e m e n t I d = " 1 4 1 7 8 6 1 6 0 3 "   D a t a T y p e = " S t r i n g " > D u e D a t e _ D t l d C u s t L e d g E n t r i e s < / D u e D a t e _ D t l d C u s t L e d g E n t r i e s > + 
+                         < P o s t D a t e _ D t l d C u s t L e d g E n t r i e s   E l e m e n t T y p e = " C o l u m n "   E l e m e n t I d = " 1 6 8 8 2 9 9 9 1 3 "   D a t a T y p e = " S t r i n g " > P o s t D a t e _ D t l d C u s t L e d g E n t r i e s < / P o s t D a t e _ D t l d C u s t L e d g E n t r i e s > + 
+                         < R e m a i n A m t _ D t l d C u s t L e d g E n t r i e s   E l e m e n t T y p e = " C o l u m n "   E l e m e n t I d = " 1 4 5 7 2 4 8 8 2 5 "   D a t a T y p e = " D e c i m a l " > R e m a i n A m t _ D t l d C u s t L e d g E n t r i e s < / R e m a i n A m t _ D t l d C u s t L e d g E n t r i e s > + 
+                         < Y o u r R e f e r e n c e _ D t l d C u s t L e d g E n t r i e s   E l e m e n t T y p e = " C o l u m n "   E l e m e n t I d = " 6 7 5 1 3 6 1 6 7 "   D a t a T y p e = " T e x t " > Y o u r R e f e r e n c e _ D t l d C u s t L e d g E n t r i e s < / Y o u r R e f e r e n c e _ D t l d C u s t L e d g E n t r i e s >   
                      < / D t l d C u s t L e d g E n t r i e s >   
                  < / C u s t L e d g E n t r y H d r >   
-                 < C u s t L e d g E n t r y F o o t e r > - 
-                     < C u r r e n c y C o d e 3 _ C u s t L e d g E n t r y F o o t e r > C u r r e n c y C o d e 3 _ C u s t L e d g E n t r y F o o t e r < / C u r r e n c y C o d e 3 _ C u s t L e d g E n t r y F o o t e r > - 
-                     < C u s t B a l a n c e _ C u s t L e d g E n t r y H d r F o o t e r > C u s t B a l a n c e _ C u s t L e d g E n t r y H d r F o o t e r < / C u s t B a l a n c e _ C u s t L e d g E n t r y H d r F o o t e r > - 
-                     < E n t r i e s E x i s t s l _ C u s t L e d g E n t r y F o o t e r C a p t i o n > E n t r i e s E x i s t s l _ C u s t L e d g E n t r y F o o t e r C a p t i o n < / E n t r i e s E x i s t s l _ C u s t L e d g E n t r y F o o t e r C a p t i o n > - 
-                     < T o t a l _ C a p t i o n > T o t a l _ C a p t i o n < / T o t a l _ C a p t i o n > +                 < C u s t L e d g E n t r y F o o t e r   E l e m e n t T y p e = " D a t a I t e m "   E l e m e n t I d = " 9 2 5 1 1 8 7 3 5 " > + 
+                     < C u r r e n c y C o d e 3 _ C u s t L e d g E n t r y F o o t e r   E l e m e n t T y p e = " C o l u m n "   E l e m e n t I d = " 1 7 6 5 6 9 2 8 1 "   D a t a T y p e = " C o d e " > C u r r e n c y C o d e 3 _ C u s t L e d g E n t r y F o o t e r < / C u r r e n c y C o d e 3 _ C u s t L e d g E n t r y F o o t e r > + 
+                     < C u s t B a l a n c e _ C u s t L e d g E n t r y H d r F o o t e r   E l e m e n t T y p e = " C o l u m n "   E l e m e n t I d = " 1 3 6 7 2 1 4 5 9 3 "   D a t a T y p e = " D e c i m a l " > C u s t B a l a n c e _ C u s t L e d g E n t r y H d r F o o t e r < / C u s t B a l a n c e _ C u s t L e d g E n t r y H d r F o o t e r > + 
+                     < E n t r i e s E x i s t s l _ C u s t L e d g E n t r y F o o t e r C a p t i o n   E l e m e n t T y p e = " C o l u m n "   E l e m e n t I d = " 1 1 7 7 0 6 9 2 3 2 "   D a t a T y p e = " B o o l e a n " > E n t r i e s E x i s t s l _ C u s t L e d g E n t r y F o o t e r C a p t i o n < / E n t r i e s E x i s t s l _ C u s t L e d g E n t r y F o o t e r C a p t i o n > + 
+                     < T o t a l _ C a p t i o n   E l e m e n t T y p e = " C o l u m n "   E l e m e n t I d = " 6 1 1 5 9 7 6 3 4 "   D a t a T y p e = " L a b e l " > T o t a l _ C a p t i o n < / T o t a l _ C a p t i o n >   
                  < / C u s t L e d g E n t r y F o o t e r >   
-                 < O v e r d u e V i s i b l e > - 
-                     < C u r r e n c y C o d e 3 _ C u s t L e d g E n t r y 2 > C u r r e n c y C o d e 3 _ C u s t L e d g E n t r y 2 < / C u r r e n c y C o d e 3 _ C u s t L e d g E n t r y 2 > - 
-                     < D e s c _ C u s t L e d g E n t r y 2 C a p t i o n 2 > D e s c _ C u s t L e d g E n t r y 2 C a p t i o n 2 < / D e s c _ C u s t L e d g E n t r y 2 C a p t i o n 2 > - 
-                     < D o c N o _ D t l d C u s t L e d g E n t r i e s C a p t i o n 2 > D o c N o _ D t l d C u s t L e d g E n t r i e s C a p t i o n 2 < / D o c N o _ D t l d C u s t L e d g E n t r i e s C a p t i o n 2 > - 
-                     < D u e D a t e _ C u s t L e d g E n t r y 2 C a p t i o n 2 > D u e D a t e _ C u s t L e d g E n t r y 2 C a p t i o n 2 < / D u e D a t e _ C u s t L e d g E n t r y 2 C a p t i o n 2 > - 
-                     < O r i g i n a l A m t _ C u s t L e d g E n t r y 2 C a p t i o n 2 > O r i g i n a l A m t _ C u s t L e d g E n t r y 2 C a p t i o n 2 < / O r i g i n a l A m t _ C u s t L e d g E n t r y 2 C a p t i o n 2 > - 
-                     < O v e r D u e E n t r i e s > O v e r D u e E n t r i e s < / O v e r D u e E n t r i e s > - 
-                     < P o s t D a t e _ D t l d C u s t L e d g E n t r i e s C a p t i o n 2 > P o s t D a t e _ D t l d C u s t L e d g E n t r i e s C a p t i o n 2 < / P o s t D a t e _ D t l d C u s t L e d g E n t r i e s C a p t i o n 2 > - 
-                     < R e m a i n A m t C u s t L e d g E n t r y 2 C a p t i o n 2 > R e m a i n A m t C u s t L e d g E n t r y 2 C a p t i o n 2 < / R e m a i n A m t C u s t L e d g E n t r y 2 C a p t i o n 2 > - 
-                     < T o t a l _ C a p t i o n 3 > T o t a l _ C a p t i o n 3 < / T o t a l _ C a p t i o n 3 > - 
-                     < C u s t L e d g E n t r y 2 > - 
-                         < C u r r C o d e _ C u s t L e d g E n t r y 2 > C u r r C o d e _ C u s t L e d g E n t r y 2 < / C u r r C o d e _ C u s t L e d g E n t r y 2 > - 
-                         < C u r r e n c y 2 C o d e _ C u s t L e d g E n t r y 2 > C u r r e n c y 2 C o d e _ C u s t L e d g E n t r y 2 < / C u r r e n c y 2 C o d e _ C u s t L e d g E n t r y 2 > - 
-                         < C u s t N o _ C u s t L e d g E n t r y 2 > C u s t N o _ C u s t L e d g E n t r y 2 < / C u s t N o _ C u s t L e d g E n t r y 2 > - 
-                         < D e s c _ C u s t L e d g E n t r y 2 > D e s c _ C u s t L e d g E n t r y 2 < / D e s c _ C u s t L e d g E n t r y 2 > - 
-                         < D o c N o _ C u s t L e d g E n t r y 2 > D o c N o _ C u s t L e d g E n t r y 2 < / D o c N o _ C u s t L e d g E n t r y 2 > - 
-                         < D u e D a t e _ C u s t L e d g E n t r y 2 > D u e D a t e _ C u s t L e d g E n t r y 2 < / D u e D a t e _ C u s t L e d g E n t r y 2 > - 
-                         < O r i g i n a l A m t _ C u s t L e d g E n t r y 2 > O r i g i n a l A m t _ C u s t L e d g E n t r y 2 < / O r i g i n a l A m t _ C u s t L e d g E n t r y 2 > - 
-                         < P o s t D a t e _ C u s t L e d g E n t r y 2 > P o s t D a t e _ C u s t L e d g E n t r y 2 < / P o s t D a t e _ C u s t L e d g E n t r y 2 > - 
-                         < P r i n t E n t r i e s D u e > P r i n t E n t r i e s D u e < / P r i n t E n t r i e s D u e > - 
-                         < R e m a i n A m t _ C u s t L e d g E n t r y 2 > R e m a i n A m t _ C u s t L e d g E n t r y 2 < / R e m a i n A m t _ C u s t L e d g E n t r y 2 > - 
-                         < Y o u r R e f e r e n c e _ C u s t L e d g E n t r y 2 > Y o u r R e f e r e n c e _ C u s t L e d g E n t r y 2 < / Y o u r R e f e r e n c e _ C u s t L e d g E n t r y 2 > +                 < O v e r d u e V i s i b l e   E l e m e n t T y p e = " D a t a I t e m "   E l e m e n t I d = " 1 4 2 6 6 4 4 0 8 7 " > + 
+                     < C u r r e n c y C o d e 3 _ C u s t L e d g E n t r y 2   E l e m e n t T y p e = " C o l u m n "   E l e m e n t I d = " 1 4 9 4 2 9 8 6 2 2 "   D a t a T y p e = " C o d e " > C u r r e n c y C o d e 3 _ C u s t L e d g E n t r y 2 < / C u r r e n c y C o d e 3 _ C u s t L e d g E n t r y 2 > + 
+                     < D e s c _ C u s t L e d g E n t r y 2 C a p t i o n 2   E l e m e n t T y p e = " C o l u m n "   E l e m e n t I d = " 1 9 5 4 6 4 5 1 6 2 "   D a t a T y p e = " S t r i n g " > D e s c _ C u s t L e d g E n t r y 2 C a p t i o n 2 < / D e s c _ C u s t L e d g E n t r y 2 C a p t i o n 2 > + 
+                     < D o c N o _ D t l d C u s t L e d g E n t r i e s C a p t i o n 2   E l e m e n t T y p e = " C o l u m n "   E l e m e n t I d = " 1 0 9 6 5 7 7 3 7 8 "   D a t a T y p e = " S t r i n g " > D o c N o _ D t l d C u s t L e d g E n t r i e s C a p t i o n 2 < / D o c N o _ D t l d C u s t L e d g E n t r i e s C a p t i o n 2 > + 
+                     < D u e D a t e _ C u s t L e d g E n t r y 2 C a p t i o n 2   E l e m e n t T y p e = " C o l u m n "   E l e m e n t I d = " 9 0 1 1 8 8 6 8 5 "   D a t a T y p e = " L a b e l " > D u e D a t e _ C u s t L e d g E n t r y 2 C a p t i o n 2 < / D u e D a t e _ C u s t L e d g E n t r y 2 C a p t i o n 2 > + 
+                     < O r i g i n a l A m t _ C u s t L e d g E n t r y 2 C a p t i o n 2   E l e m e n t T y p e = " C o l u m n "   E l e m e n t I d = " 1 6 4 9 8 2 3 4 6 6 "   D a t a T y p e = " S t r i n g " > O r i g i n a l A m t _ C u s t L e d g E n t r y 2 C a p t i o n 2 < / O r i g i n a l A m t _ C u s t L e d g E n t r y 2 C a p t i o n 2 > + 
+                     < O v e r D u e E n t r i e s   E l e m e n t T y p e = " C o l u m n "   E l e m e n t I d = " 2 3 9 2 5 5 2 1 3 "   D a t a T y p e = " S t r i n g " > O v e r D u e E n t r i e s < / O v e r D u e E n t r i e s > + 
+                     < P o s t D a t e _ D t l d C u s t L e d g E n t r i e s C a p t i o n 2   E l e m e n t T y p e = " C o l u m n "   E l e m e n t I d = " 7 1 5 0 7 2 1 9 7 "   D a t a T y p e = " L a b e l " > P o s t D a t e _ D t l d C u s t L e d g E n t r i e s C a p t i o n 2 < / P o s t D a t e _ D t l d C u s t L e d g E n t r i e s C a p t i o n 2 > + 
+                     < R e m a i n A m t C u s t L e d g E n t r y 2 C a p t i o n 2   E l e m e n t T y p e = " C o l u m n "   E l e m e n t I d = " 5 0 5 0 3 3 9 6 0 "   D a t a T y p e = " S t r i n g " > R e m a i n A m t C u s t L e d g E n t r y 2 C a p t i o n 2 < / R e m a i n A m t C u s t L e d g E n t r y 2 C a p t i o n 2 > + 
+                     < T o t a l _ C a p t i o n 3   E l e m e n t T y p e = " C o l u m n "   E l e m e n t I d = " 4 3 8 5 6 6 3 5 7 "   D a t a T y p e = " L a b e l " > T o t a l _ C a p t i o n 3 < / T o t a l _ C a p t i o n 3 > + 
+                     < C u s t L e d g E n t r y 2   E l e m e n t T y p e = " D a t a I t e m "   E l e m e n t I d = " 1 3 7 2 6 3 7 0 0 8 " > + 
+                         < C u r r C o d e _ C u s t L e d g E n t r y 2   E l e m e n t T y p e = " C o l u m n "   E l e m e n t I d = " 1 5 8 9 5 4 6 2 6 8 "   D a t a T y p e = " C o d e " > C u r r C o d e _ C u s t L e d g E n t r y 2 < / C u r r C o d e _ C u s t L e d g E n t r y 2 > + 
+                         < C u r r e n c y 2 C o d e _ C u s t L e d g E n t r y 2   E l e m e n t T y p e = " C o l u m n "   E l e m e n t I d = " 1 4 2 6 8 6 9 3 0 3 "   D a t a T y p e = " C o d e " > C u r r e n c y 2 C o d e _ C u s t L e d g E n t r y 2 < / C u r r e n c y 2 C o d e _ C u s t L e d g E n t r y 2 > + 
+                         < C u s t N o _ C u s t L e d g E n t r y 2   E l e m e n t T y p e = " C o l u m n "   E l e m e n t I d = " 1 3 5 3 0 8 9 7 4 5 "   D a t a T y p e = " C o d e " > C u s t N o _ C u s t L e d g E n t r y 2 < / C u s t N o _ C u s t L e d g E n t r y 2 > + 
+                         < D e s c _ C u s t L e d g E n t r y 2   E l e m e n t T y p e = " C o l u m n "   E l e m e n t I d = " 4 0 4 4 4 3 7 9 8 "   D a t a T y p e = " T e x t " > D e s c _ C u s t L e d g E n t r y 2 < / D e s c _ C u s t L e d g E n t r y 2 > + 
+                         < D o c N o _ C u s t L e d g E n t r y 2   E l e m e n t T y p e = " C o l u m n "   E l e m e n t I d = " 5 1 0 9 1 4 9 4 "   D a t a T y p e = " C o d e " > D o c N o _ C u s t L e d g E n t r y 2 < / D o c N o _ C u s t L e d g E n t r y 2 > + 
+                         < D u e D a t e _ C u s t L e d g E n t r y 2   E l e m e n t T y p e = " C o l u m n "   E l e m e n t I d = " 1 6 3 5 3 6 3 6 4 7 "   D a t a T y p e = " S t r i n g " > D u e D a t e _ C u s t L e d g E n t r y 2 < / D u e D a t e _ C u s t L e d g E n t r y 2 > + 
+                         < O r i g i n a l A m t _ C u s t L e d g E n t r y 2   E l e m e n t T y p e = " C o l u m n "   E l e m e n t I d = " 6 5 4 0 4 5 0 9 8 "   D a t a T y p e = " D e c i m a l " > O r i g i n a l A m t _ C u s t L e d g E n t r y 2 < / O r i g i n a l A m t _ C u s t L e d g E n t r y 2 > + 
+                         < P o s t D a t e _ C u s t L e d g E n t r y 2   E l e m e n t T y p e = " C o l u m n "   E l e m e n t I d = " 1 8 1 7 1 9 2 0 4 3 "   D a t a T y p e = " S t r i n g " > P o s t D a t e _ C u s t L e d g E n t r y 2 < / P o s t D a t e _ C u s t L e d g E n t r y 2 > + 
+                         < P r i n t E n t r i e s D u e   E l e m e n t T y p e = " C o l u m n "   E l e m e n t I d = " 6 9 3 7 0 0 1 2 6 "   D a t a T y p e = " B o o l e a n " > P r i n t E n t r i e s D u e < / P r i n t E n t r i e s D u e > + 
+                         < R e m a i n A m t _ C u s t L e d g E n t r y 2   E l e m e n t T y p e = " C o l u m n "   E l e m e n t I d = " 7 5 6 3 4 5 4 1 3 "   D a t a T y p e = " D e c i m a l " > R e m a i n A m t _ C u s t L e d g E n t r y 2 < / R e m a i n A m t _ C u s t L e d g E n t r y 2 > + 
+                         < Y o u r R e f e r e n c e _ C u s t L e d g E n t r y 2   E l e m e n t T y p e = " C o l u m n "   E l e m e n t I d = " 2 0 5 5 4 0 4 3 9 5 "   D a t a T y p e = " T e x t " > Y o u r R e f e r e n c e _ C u s t L e d g E n t r y 2 < / Y o u r R e f e r e n c e _ C u s t L e d g E n t r y 2 >   
                      < / C u s t L e d g E n t r y 2 >   
-                     < O v e r d u e E n t r y F o o d e r > - 
-                         < O v e r d u e B a l a n c e > O v e r d u e B a l a n c e < / O v e r d u e B a l a n c e > +                     < O v e r d u e E n t r y F o o d e r   E l e m e n t T y p e = " D a t a I t e m "   E l e m e n t I d = " 1 6 5 9 2 3 5 9 3 4 " > + 
+                         < O v e r d u e B a l a n c e   E l e m e n t T y p e = " C o l u m n "   E l e m e n t I d = " 1 1 8 6 1 4 8 4 3 9 "   D a t a T y p e = " D e c i m a l " > O v e r d u e B a l a n c e < / O v e r d u e B a l a n c e >   
                      < / O v e r d u e E n t r y F o o d e r >   
@@ -6984,51 +6986,51 @@
  
              < / C u r r e n c y L o o p >   
-             < A g i n g B a n d V i s i b l e > - 
-                 < A g i n g C u s t L e d g E n t r y   / > - 
-                 < A g i n g B a n d L o o p > - 
-                     < A g i n g B a n d B u f C o l 1 A m t > A g i n g B a n d B u f C o l 1 A m t < / A g i n g B a n d B u f C o l 1 A m t > - 
-                     < A g i n g B a n d B u f C o l 2 A m t > A g i n g B a n d B u f C o l 2 A m t < / A g i n g B a n d B u f C o l 2 A m t > - 
-                     < A g i n g B a n d B u f C o l 3 A m t > A g i n g B a n d B u f C o l 3 A m t < / A g i n g B a n d B u f C o l 3 A m t > - 
-                     < A g i n g B a n d B u f C o l 4 A m t > A g i n g B a n d B u f C o l 4 A m t < / A g i n g B a n d B u f C o l 4 A m t > - 
-                     < A g i n g B a n d B u f C o l 5 A m t > A g i n g B a n d B u f C o l 5 A m t < / A g i n g B a n d B u f C o l 5 A m t > - 
-                     < A g i n g B a n d C u r r e n c y C o d e > A g i n g B a n d C u r r e n c y C o d e < / A g i n g B a n d C u r r e n c y C o d e > - 
-                     < A g i n g B a n d E n d i n g D a t e > A g i n g B a n d E n d i n g D a t e < / A g i n g B a n d E n d i n g D a t e > - 
-                     < A g i n g D a t e 1 > A g i n g D a t e 1 < / A g i n g D a t e 1 > - 
-                     < A g i n g D a t e 2 > A g i n g D a t e 2 < / A g i n g D a t e 2 > - 
-                     < A g i n g D a t e 2 1 > A g i n g D a t e 2 1 < / A g i n g D a t e 2 1 > - 
-                     < A g i n g D a t e 3 > A g i n g D a t e 3 < / A g i n g D a t e 3 > - 
-                     < A g i n g D a t e 3 1 > A g i n g D a t e 3 1 < / A g i n g D a t e 3 1 > - 
-                     < A g i n g D a t e 4 > A g i n g D a t e 4 < / A g i n g D a t e 4 > - 
-                     < A g i n g D a t e 4 1 > A g i n g D a t e 4 1 < / A g i n g D a t e 4 1 > - 
-                     < A g i n g D a t e 5 > A g i n g D a t e 5 < / A g i n g D a t e 5 > - 
-                     < A g i n g D a t e H e a d e r 1 > A g i n g D a t e H e a d e r 1 < / A g i n g D a t e H e a d e r 1 > - 
-                     < A g i n g D a t e H e a d e r 2 > A g i n g D a t e H e a d e r 2 < / A g i n g D a t e H e a d e r 2 > - 
-                     < A g i n g D a t e H e a d e r 3 > A g i n g D a t e H e a d e r 3 < / A g i n g D a t e H e a d e r 3 > - 
-                     < A g i n g D a t e H e a d e r 4 > A g i n g D a t e H e a d e r 4 < / A g i n g D a t e H e a d e r 4 > - 
-                     < b e f o r e C a p t i o n > b e f o r e C a p t i o n < / b e f o r e C a p t i o n > +             < A g i n g B a n d V i s i b l e   E l e m e n t T y p e = " D a t a I t e m "   E l e m e n t I d = " 1 9 4 1 7 6 5 1 4 0 " > + 
+                 < A g i n g C u s t L e d g E n t r y   E l e m e n t T y p e = " D a t a I t e m "   E l e m e n t I d = " 7 0 4 1 6 5 1 3 2 "   / > + 
+                 < A g i n g B a n d L o o p   E l e m e n t T y p e = " D a t a I t e m "   E l e m e n t I d = " 1 5 2 9 3 9 4 0 2 2 " > + 
+                     < A g i n g B a n d B u f C o l 1 A m t   E l e m e n t T y p e = " C o l u m n "   E l e m e n t I d = " 1 9 4 8 7 4 9 4 5 4 "   D a t a T y p e = " D e c i m a l " > A g i n g B a n d B u f C o l 1 A m t < / A g i n g B a n d B u f C o l 1 A m t > + 
+                     < A g i n g B a n d B u f C o l 2 A m t   E l e m e n t T y p e = " C o l u m n "   E l e m e n t I d = " 1 9 5 6 4 3 5 6 1 5 "   D a t a T y p e = " D e c i m a l " > A g i n g B a n d B u f C o l 2 A m t < / A g i n g B a n d B u f C o l 2 A m t > + 
+                     < A g i n g B a n d B u f C o l 3 A m t   E l e m e n t T y p e = " C o l u m n "   E l e m e n t I d = " 9 7 5 6 7 9 1 5 2 "   D a t a T y p e = " D e c i m a l " > A g i n g B a n d B u f C o l 3 A m t < / A g i n g B a n d B u f C o l 3 A m t > + 
+                     < A g i n g B a n d B u f C o l 4 A m t   E l e m e n t T y p e = " C o l u m n "   E l e m e n t I d = " 1 2 3 5 5 5 5 7 0 5 "   D a t a T y p e = " D e c i m a l " > A g i n g B a n d B u f C o l 4 A m t < / A g i n g B a n d B u f C o l 4 A m t > + 
+                     < A g i n g B a n d B u f C o l 5 A m t   E l e m e n t T y p e = " C o l u m n "   E l e m e n t I d = " 4 2 4 7 8 1 3 0 2 "   D a t a T y p e = " D e c i m a l " > A g i n g B a n d B u f C o l 5 A m t < / A g i n g B a n d B u f C o l 5 A m t > + 
+                     < A g i n g B a n d C u r r e n c y C o d e   E l e m e n t T y p e = " C o l u m n "   E l e m e n t I d = " 1 3 1 1 1 3 8 9 6 8 "   D a t a T y p e = " C o d e " > A g i n g B a n d C u r r e n c y C o d e < / A g i n g B a n d C u r r e n c y C o d e > + 
+                     < A g i n g B a n d E n d i n g D a t e   E l e m e n t T y p e = " C o l u m n "   E l e m e n t I d = " 1 3 9 0 8 7 6 8 7 "   D a t a T y p e = " S t r i n g " > A g i n g B a n d E n d i n g D a t e < / A g i n g B a n d E n d i n g D a t e > + 
+                     < A g i n g D a t e 1   E l e m e n t T y p e = " C o l u m n "   E l e m e n t I d = " 4 7 9 6 0 6 2 6 6 "   D a t a T y p e = " S t r i n g " > A g i n g D a t e 1 < / A g i n g D a t e 1 > + 
+                     < A g i n g D a t e 2   E l e m e n t T y p e = " C o l u m n "   E l e m e n t I d = " 1 1 1 7 3 0 2 8 8 3 "   D a t a T y p e = " S t r i n g " > A g i n g D a t e 2 < / A g i n g D a t e 2 > + 
+                     < A g i n g D a t e 2 1   E l e m e n t T y p e = " C o l u m n "   E l e m e n t I d = " 3 1 3 5 0 1 0 6 8 "   D a t a T y p e = " S t r i n g " > A g i n g D a t e 2 1 < / A g i n g D a t e 2 1 > + 
+                     < A g i n g D a t e 3   E l e m e n t T y p e = " C o l u m n "   E l e m e n t I d = " 1 7 5 4 9 9 9 5 0 0 "   D a t a T y p e = " S t r i n g " > A g i n g D a t e 3 < / A g i n g D a t e 3 > + 
+                     < A g i n g D a t e 3 1   E l e m e n t T y p e = " C o l u m n "   E l e m e n t I d = " 1 9 1 4 0 6 0 5 3 1 "   D a t a T y p e = " S t r i n g " > A g i n g D a t e 3 1 < / A g i n g D a t e 3 1 > + 
+                     < A g i n g D a t e 4   E l e m e n t T y p e = " C o l u m n "   E l e m e n t I d = " 1 9 0 2 2 7 1 1 7 9 "   D a t a T y p e = " S t r i n g " > A g i n g D a t e 4 < / A g i n g D a t e 4 > + 
+                     < A g i n g D a t e 4 1   E l e m e n t T y p e = " C o l u m n "   E l e m e n t I d = " 8 4 9 7 6 9 6 1 0 "   D a t a T y p e = " S t r i n g " > A g i n g D a t e 4 1 < / A g i n g D a t e 4 1 > + 
+                     < A g i n g D a t e 5   E l e m e n t T y p e = " C o l u m n "   E l e m e n t I d = " 1 2 6 4 5 7 4 5 6 2 "   D a t a T y p e = " S t r i n g " > A g i n g D a t e 5 < / A g i n g D a t e 5 > + 
+                     < A g i n g D a t e H e a d e r 1   E l e m e n t T y p e = " C o l u m n "   E l e m e n t I d = " 2 8 6 3 5 0 7 5 9 "   D a t a T y p e = " T e x t " > A g i n g D a t e H e a d e r 1 < / A g i n g D a t e H e a d e r 1 > + 
+                     < A g i n g D a t e H e a d e r 2   E l e m e n t T y p e = " C o l u m n "   E l e m e n t I d = " 3 5 1 3 4 5 8 5 8 "   D a t a T y p e = " T e x t " > A g i n g D a t e H e a d e r 2 < / A g i n g D a t e H e a d e r 2 > + 
+                     < A g i n g D a t e H e a d e r 3   E l e m e n t T y p e = " C o l u m n "   E l e m e n t I d = " 9 8 9 0 4 2 4 7 5 "   D a t a T y p e = " T e x t " > A g i n g D a t e H e a d e r 3 < / A g i n g D a t e H e a d e r 3 > + 
+                     < A g i n g D a t e H e a d e r 4   E l e m e n t T y p e = " C o l u m n "   E l e m e n t I d = " 1 6 2 6 7 3 9 0 9 2 "   D a t a T y p e = " T e x t " > A g i n g D a t e H e a d e r 4 < / A g i n g D a t e H e a d e r 4 > + 
+                     < b e f o r e C a p t i o n   E l e m e n t T y p e = " C o l u m n "   E l e m e n t I d = " 1 0 1 3 0 1 9 7 1 8 "   D a t a T y p e = " L a b e l " > b e f o r e C a p t i o n < / b e f o r e C a p t i o n >   
                  < / A g i n g B a n d L o o p >   
@@ -7036,13 +7038,13 @@
  
          < / I n t e g e r >   
-         < L e t t e r T e x t > - 
-             < B o d y T e x t > B o d y T e x t < / B o d y T e x t > - 
-             < C l o s i n g T e x t > C l o s i n g T e x t < / C l o s i n g T e x t > - 
-             < G r e e t i n g T e x t > G r e e t i n g T e x t < / G r e e t i n g T e x t > +         < L e t t e r T e x t   E l e m e n t T y p e = " D a t a I t e m "   E l e m e n t I d = " 1 5 1 0 3 5 3 8 3 4 " > + 
+             < B o d y T e x t   E l e m e n t T y p e = " C o l u m n "   E l e m e n t I d = " 1 4 9 7 5 9 8 0 8 "   D a t a T y p e = " L a b e l " > B o d y T e x t < / B o d y T e x t > + 
+             < C l o s i n g T e x t   E l e m e n t T y p e = " C o l u m n "   E l e m e n t I d = " 5 1 2 1 3 5 9 0 9 "   D a t a T y p e = " L a b e l " > C l o s i n g T e x t < / C l o s i n g T e x t > + 
+             < G r e e t i n g T e x t   E l e m e n t T y p e = " C o l u m n "   E l e m e n t I d = " 1 1 7 5 2 7 9 2 8 9 "   D a t a T y p e = " L a b e l " > G r e e t i n g T e x t < / G r e e t i n g T e x t >   
          < / L e t t e r T e x t >   
@@ -7051,237 +7053,235 @@
  < / N a v W o r d R e p o r t X m l P a r t > 
 </file>
 
-<file path=customXml/item4.xml>��< ? x m l   v e r s i o n = " 1 . 0 "   e n c o d i n g = " u t f - 1 6 " ? > - 
- < N a v W o r d R e p o r t X m l P a r t   x m l n s = " u r n : m i c r o s o f t - d y n a m i c s - b u s i n e s s c e n t r a l / i n t e r n a l / e x t e n d e d / r e p o r t s / C u s t o m e r S t a t e m e n t _ F a i r m o n t / 6 7 1 4 8 / " > - 
-     < T o o l t i p s   / > - 
-     < C u s t o m e r   E l e m e n t T y p e = " D a t a I t e m "   E l e m e n t I d = " 1 5 2 5 1 9 1 9 9 " > - 
-         < N o _ C u s t   E l e m e n t T y p e = " C o l u m n "   E l e m e n t I d = " 6 0 3 9 7 0 8 4 6 "   D a t a T y p e = " C o d e " > N o _ C u s t < / N o _ C u s t > - 
-         < I n t e g e r   E l e m e n t T y p e = " D a t a I t e m "   E l e m e n t I d = " 1 7 3 5 6 9 8 6 1 9 " > - 
-             < B a n k A c c N o _ C o m p a n y I n f o   E l e m e n t T y p e = " C o l u m n "   E l e m e n t I d = " 8 6 4 5 4 5 9 0 7 "   D a t a T y p e = " T e x t " > B a n k A c c N o _ C o m p a n y I n f o < / B a n k A c c N o _ C o m p a n y I n f o > - 
-             < B a n k A c c N o _ C o m p a n y I n f o C a p t i o n   E l e m e n t T y p e = " C o l u m n "   E l e m e n t I d = " 1 9 1 8 8 5 3 8 1 3 "   D a t a T y p e = " L a b e l " > B a n k A c c N o _ C o m p a n y I n f o C a p t i o n < / B a n k A c c N o _ C o m p a n y I n f o C a p t i o n > - 
-             < B a n k N a m e _ C o m p a n y I n f o   E l e m e n t T y p e = " C o l u m n "   E l e m e n t I d = " 1 9 1 7 2 0 2 0 4 2 "   D a t a T y p e = " T e x t " > B a n k N a m e _ C o m p a n y I n f o < / B a n k N a m e _ C o m p a n y I n f o > - 
-             < B a n k N a m e _ C o m p a n y I n f o C a p t i o n   E l e m e n t T y p e = " C o l u m n "   E l e m e n t I d = " 1 6 0 4 3 0 7 5 8 8 "   D a t a T y p e = " L a b e l " > B a n k N a m e _ C o m p a n y I n f o C a p t i o n < / B a n k N a m e _ C o m p a n y I n f o C a p t i o n > - 
-             < C o m p a n y A d d r 1   E l e m e n t T y p e = " C o l u m n "   E l e m e n t I d = " 8 8 5 0 9 6 1 0 4 "   D a t a T y p e = " T e x t " > C o m p a n y A d d r 1 < / C o m p a n y A d d r 1 > - 
-             < C o m p a n y A d d r 2   E l e m e n t T y p e = " C o l u m n "   E l e m e n t I d = " 1 0 2 7 9 9 3 7 4 7 "   D a t a T y p e = " T e x t " > C o m p a n y A d d r 2 < / C o m p a n y A d d r 2 > - 
-             < C o m p a n y A d d r 3   E l e m e n t T y p e = " C o l u m n "   E l e m e n t I d = " 3 9 0 2 9 7 1 3 0 "   D a t a T y p e = " T e x t " > C o m p a n y A d d r 3 < / C o m p a n y A d d r 3 > - 
-             < C o m p a n y A d d r 4   E l e m e n t T y p e = " C o l u m n "   E l e m e n t I d = " 1 9 9 1 5 8 0 3 1 5 "   D a t a T y p e = " T e x t " > C o m p a n y A d d r 4 < / C o m p a n y A d d r 4 > - 
-             < C o m p a n y A d d r 5   E l e m e n t T y p e = " C o l u m n "   E l e m e n t I d = " 1 6 6 5 6 9 0 3 6 4 "   D a t a T y p e = " T e x t " > C o m p a n y A d d r 5 < / C o m p a n y A d d r 5 > - 
-             < C o m p a n y A d d r 6   E l e m e n t T y p e = " C o l u m n "   E l e m e n t I d = " 7 1 6 1 8 7 0 8 1 "   D a t a T y p e = " T e x t " > C o m p a n y A d d r 6 < / C o m p a n y A d d r 6 > - 
-             < C o m p a n y A d d r 7   E l e m e n t T y p e = " C o l u m n "   E l e m e n t I d = " 1 3 5 3 8 8 3 6 9 8 "   D a t a T y p e = " T e x t " > C o m p a n y A d d r 7 < / C o m p a n y A d d r 7 > - 
-             < C o m p a n y A d d r 8   E l e m e n t T y p e = " C o l u m n "   E l e m e n t I d = " 1 0 5 4 0 0 5 1 2 7 "   D a t a T y p e = " T e x t " > C o m p a n y A d d r 8 < / C o m p a n y A d d r 8 > - 
-             < C o m p a n y I n f o 1 P i c t u r e   E l e m e n t T y p e = " C o l u m n "   E l e m e n t I d = " 1 0 1 8 2 0 6 5 0 3 "   D a t a T y p e = " B l o b "   / > - 
-             < C o m p a n y I n f o 2 P i c t u r e   E l e m e n t T y p e = " C o l u m n "   E l e m e n t I d = " 9 8 9 6 7 0 4 7 4 "   D a t a T y p e = " B l o b "   / > - 
-             < C o m p a n y I n f o 3 P i c t u r e   E l e m e n t T y p e = " C o l u m n "   E l e m e n t I d = " 5 7 9 7 0 4 0 5 9 "   D a t a T y p e = " B l o b "   / > - 
-             < C o m p a n y I n f o E m a i l   E l e m e n t T y p e = " C o l u m n "   E l e m e n t I d = " 9 1 4 8 1 2 2 4 0 "   D a t a T y p e = " T e x t " > C o m p a n y I n f o E m a i l < / C o m p a n y I n f o E m a i l > - 
-             < C o m p a n y I n f o E m a i l C a p t i o n   E l e m e n t T y p e = " C o l u m n "   E l e m e n t I d = " 1 5 5 2 1 6 7 2 3 0 "   D a t a T y p e = " L a b e l " > C o m p a n y I n f o E m a i l C a p t i o n < / C o m p a n y I n f o E m a i l C a p t i o n > - 
-             < C o m p a n y I n f o H o m e P a g e   E l e m e n t T y p e = " C o l u m n "   E l e m e n t I d = " 1 5 3 0 3 1 7 4 4 0 "   D a t a T y p e = " T e x t " > C o m p a n y I n f o H o m e P a g e < / C o m p a n y I n f o H o m e P a g e > - 
-             < C o m p a n y I n f o H o m e p a g e C a p t i o n   E l e m e n t T y p e = " C o l u m n "   E l e m e n t I d = " 1 5 2 9 8 2 3 8 6 "   D a t a T y p e = " L a b e l " > C o m p a n y I n f o H o m e p a g e C a p t i o n < / C o m p a n y I n f o H o m e p a g e C a p t i o n > - 
-             < C o m p a n y L e g a l O f f i c e   E l e m e n t T y p e = " C o l u m n "   E l e m e n t I d = " 7 1 4 2 5 8 1 1 1 "   D a t a T y p e = " T e x t " > C o m p a n y L e g a l O f f i c e < / C o m p a n y L e g a l O f f i c e > - 
-             < C o m p a n y L e g a l O f f i c e _ L b l   E l e m e n t T y p e = " C o l u m n "   E l e m e n t I d = " 1 5 3 3 1 7 5 1 0 8 "   D a t a T y p e = " T e x t " > C o m p a n y L e g a l O f f i c e _ L b l < / C o m p a n y L e g a l O f f i c e _ L b l > - 
-             < C o m p a n y P i c t u r e   E l e m e n t T y p e = " C o l u m n "   E l e m e n t I d = " 1 3 9 7 4 1 1 0 7 4 "   D a t a T y p e = " B l o b "   / > - 
-             < C u r r R e p o r t P a g e N o C a p t i o n   E l e m e n t T y p e = " C o l u m n "   E l e m e n t I d = " 2 0 2 2 2 2 5 3 5 1 "   D a t a T y p e = " L a b e l " > C u r r R e p o r t P a g e N o C a p t i o n < / C u r r R e p o r t P a g e N o C a p t i o n > - 
-             < C u s t A d d r 1   E l e m e n t T y p e = " C o l u m n "   E l e m e n t I d = " 1 3 6 8 0 2 7 5 2 2 "   D a t a T y p e = " T e x t " > C u s t A d d r 1 < / C u s t A d d r 1 > - 
-             < C u s t A d d r 2   E l e m e n t T y p e = " C o l u m n "   E l e m e n t I d = " 2 0 0 5 7 2 4 1 3 9 "   D a t a T y p e = " T e x t " > C u s t A d d r 2 < / C u s t A d d r 2 > - 
-             < C u s t A d d r 3   E l e m e n t T y p e = " C o l u m n "   E l e m e n t I d = " 1 6 5 1 5 4 6 5 4 0 "   D a t a T y p e = " T e x t " > C u s t A d d r 3 < / C u s t A d d r 3 > - 
-             < C u s t A d d r 4   E l e m e n t T y p e = " C o l u m n "   E l e m e n t I d = " 1 0 1 3 8 4 9 9 2 3 "   D a t a T y p e = " T e x t " > C u s t A d d r 4 < / C u s t A d d r 4 > - 
-             < C u s t A d d r 5   E l e m e n t T y p e = " C o l u m n "   E l e m e n t I d = " 3 7 6 1 5 3 3 0 6 "   D a t a T y p e = " T e x t " > C u s t A d d r 5 < / C u s t A d d r 5 > - 
-             < C u s t A d d r 6   E l e m e n t T y p e = " C o l u m n "   E l e m e n t I d = " 2 6 1 5 4 3 3 1 1 "   D a t a T y p e = " T e x t " > C u s t A d d r 6 < / C u s t A d d r 6 > - 
-             < C u s t A d d r 7   E l e m e n t T y p e = " C o l u m n "   E l e m e n t I d = " 8 9 9 2 3 9 9 2 8 "   D a t a T y p e = " T e x t " > C u s t A d d r 7 < / C u s t A d d r 7 > - 
-             < C u s t A d d r 8   E l e m e n t T y p e = " C o l u m n "   E l e m e n t I d = " 1 5 3 6 9 3 6 5 4 5 "   D a t a T y p e = " T e x t " > C u s t A d d r 8 < / C u s t A d d r 8 > - 
-             < C u s t B a l a n c e C a p t i o n   E l e m e n t T y p e = " C o l u m n "   E l e m e n t I d = " 6 0 8 6 6 1 8 8 4 "   D a t a T y p e = " L a b e l " > C u s t B a l a n c e C a p t i o n < / C u s t B a l a n c e C a p t i o n > - 
-             < D e s c _ C u s t L e d g E n t r y 2 C a p t i o n   E l e m e n t T y p e = " C o l u m n "   E l e m e n t I d = " 1 8 7 4 4 3 7 6 7 2 "   D a t a T y p e = " S t r i n g " > D e s c _ C u s t L e d g E n t r y 2 C a p t i o n < / D e s c _ C u s t L e d g E n t r y 2 C a p t i o n > - 
-             < D o c D a t e C a p t i o n   E l e m e n t T y p e = " C o l u m n "   E l e m e n t I d = " 1 1 5 7 6 2 1 5 3 7 "   D a t a T y p e = " L a b e l " > D o c D a t e C a p t i o n < / D o c D a t e C a p t i o n > - 
-             < D o c N o _ D t l d C u s t L e d g E n t r i e s C a p t i o n   E l e m e n t T y p e = " C o l u m n "   E l e m e n t I d = " 6 0 1 5 1 5 5 5 6 "   D a t a T y p e = " S t r i n g " > D o c N o _ D t l d C u s t L e d g E n t r i e s C a p t i o n < / D o c N o _ D t l d C u s t L e d g E n t r i e s C a p t i o n > - 
-             < D u e D a t e _ C u s t L e d g E n t r y 2 C a p t i o n   E l e m e n t T y p e = " C o l u m n "   E l e m e n t I d = " 8 1 9 2 8 5 8 5 "   D a t a T y p e = " L a b e l " > D u e D a t e _ C u s t L e d g E n t r y 2 C a p t i o n < / D u e D a t e _ C u s t L e d g E n t r y 2 C a p t i o n > - 
-             < E n d D a t e   E l e m e n t T y p e = " C o l u m n "   E l e m e n t I d = " 1 3 0 2 0 8 2 6 1 0 "   D a t a T y p e = " S t r i n g " > E n d D a t e < / E n d D a t e > - 
-             < E n d D a t e C a p t i o n   E l e m e n t T y p e = " C o l u m n "   E l e m e n t I d = " 1 3 5 3 1 9 2 8 0 "   D a t a T y p e = " L a b e l " > E n d D a t e C a p t i o n < / E n d D a t e C a p t i o n > - 
-             < G i r o N o _ C o m p a n y I n f o   E l e m e n t T y p e = " C o l u m n "   E l e m e n t I d = " 5 6 5 4 8 5 5 1 9 "   D a t a T y p e = " T e x t " > G i r o N o _ C o m p a n y I n f o < / G i r o N o _ C o m p a n y I n f o > - 
-             < G i r o N o _ C o m p a n y I n f o C a p t i o n   E l e m e n t T y p e = " C o l u m n "   E l e m e n t I d = " 1 6 5 8 5 3 3 3 6 9 "   D a t a T y p e = " L a b e l " > G i r o N o _ C o m p a n y I n f o C a p t i o n < / G i r o N o _ C o m p a n y I n f o C a p t i o n > - 
-             < L a s t S t a t m n t N o _ C u s t   E l e m e n t T y p e = " C o l u m n "   E l e m e n t I d = " 1 3 8 8 0 8 0 0 2 9 "   D a t a T y p e = " S t r i n g " > L a s t S t a t m n t N o _ C u s t < / L a s t S t a t m n t N o _ C u s t > - 
-             < L a s t S t a t m n t N o _ C u s t C a p t i o n   E l e m e n t T y p e = " C o l u m n "   E l e m e n t I d = " 8 9 2 5 6 7 8 3 5 "   D a t a T y p e = " L a b e l " > L a s t S t a t m n t N o _ C u s t C a p t i o n < / L a s t S t a t m n t N o _ C u s t C a p t i o n > - 
-             < N o 1 _ C u s t   E l e m e n t T y p e = " C o l u m n "   E l e m e n t I d = " 9 1 2 7 7 0 5 0 9 "   D a t a T y p e = " C o d e " > N o 1 _ C u s t < / N o 1 _ C u s t > - 
-             < N o 1 _ C u s t C a p t i o n   E l e m e n t T y p e = " C o l u m n "   E l e m e n t I d = " 1 6 6 1 8 9 3 3 9 7 "   D a t a T y p e = " L a b e l " > N o 1 _ C u s t C a p t i o n < / N o 1 _ C u s t C a p t i o n > - 
-             < O r i g i n a l A m t _ C u s t L e d g E n t r y 2 C a p t i o n   E l e m e n t T y p e = " C o l u m n "   E l e m e n t I d = " 8 4 8 8 4 4 3 9 2 "   D a t a T y p e = " S t r i n g " > O r i g i n a l A m t _ C u s t L e d g E n t r y 2 C a p t i o n < / O r i g i n a l A m t _ C u s t L e d g E n t r y 2 C a p t i o n > - 
-             < P h o n e N o _ C o m p a n y I n f o   E l e m e n t T y p e = " C o l u m n "   E l e m e n t I d = " 1 6 0 6 4 2 8 3 9 4 "   D a t a T y p e = " T e x t " > P h o n e N o _ C o m p a n y I n f o < / P h o n e N o _ C o m p a n y I n f o > - 
-             < P h o n e N o _ C o m p a n y I n f o C a p t i o n   E l e m e n t T y p e = " C o l u m n "   E l e m e n t I d = " 1 8 7 6 0 4 7 7 0 4 "   D a t a T y p e = " L a b e l " > P h o n e N o _ C o m p a n y I n f o C a p t i o n < / P h o n e N o _ C o m p a n y I n f o C a p t i o n > - 
-             < P o s t D a t e _ D t l d C u s t L e d g E n t r i e s C a p t i o n   E l e m e n t T y p e = " C o l u m n "   E l e m e n t I d = " 1 0 3 3 1 2 5 4 2 5 "   D a t a T y p e = " L a b e l " > P o s t D a t e _ D t l d C u s t L e d g E n t r i e s C a p t i o n < / P o s t D a t e _ D t l d C u s t L e d g E n t r i e s C a p t i o n > - 
-             < R e m a i n A m t C u s t L e d g E n t r y 2 C a p t i o n   E l e m e n t T y p e = " C o l u m n "   E l e m e n t I d = " 1 6 3 2 7 0 6 4 0 6 "   D a t a T y p e = " S t r i n g " > R e m a i n A m t C u s t L e d g E n t r y 2 C a p t i o n < / R e m a i n A m t C u s t L e d g E n t r y 2 C a p t i o n > - 
-             < S t a r t D a t e   E l e m e n t T y p e = " C o l u m n "   E l e m e n t I d = " 1 4 5 7 6 6 9 4 1 7 "   D a t a T y p e = " S t r i n g " > S t a r t D a t e < / S t a r t D a t e > - 
-             < S t a r t D a t e C a p t i o n   E l e m e n t T y p e = " C o l u m n "   E l e m e n t I d = " 1 9 8 0 7 4 5 8 7 1 "   D a t a T y p e = " L a b e l " > S t a r t D a t e C a p t i o n < / S t a r t D a t e C a p t i o n > - 
-             < S t a t e m e n t C a p t i o n   E l e m e n t T y p e = " C o l u m n "   E l e m e n t I d = " 2 3 9 3 8 2 "   D a t a T y p e = " L a b e l " > S t a t e m e n t C a p t i o n < / S t a t e m e n t C a p t i o n > - 
-             < T o d a y F o r m a t t e d   E l e m e n t T y p e = " C o l u m n "   E l e m e n t I d = " 2 7 0 4 5 1 4 0 "   D a t a T y p e = " S t r i n g " > T o d a y F o r m a t t e d < / T o d a y F o r m a t t e d > - 
-             < V A T R e g N o _ C o m p a n y I n f o   E l e m e n t T y p e = " C o l u m n "   E l e m e n t I d = " 9 4 4 0 2 9 3 7 7 "   D a t a T y p e = " T e x t " > V A T R e g N o _ C o m p a n y I n f o < / V A T R e g N o _ C o m p a n y I n f o > - 
-             < V A T R e g N o _ C o m p a n y I n f o C a p t i o n   E l e m e n t T y p e = " C o l u m n "   E l e m e n t I d = " 1 1 9 3 2 7 6 3 7 5 "   D a t a T y p e = " L a b e l " > V A T R e g N o _ C o m p a n y I n f o C a p t i o n < / V A T R e g N o _ C o m p a n y I n f o C a p t i o n > - 
-             < C u r r e n c y L o o p   E l e m e n t T y p e = " D a t a I t e m "   E l e m e n t I d = " 1 3 0 4 5 2 2 1 9 8 " > - 
-                 < T o t a l _ C a p t i o n 2   E l e m e n t T y p e = " C o l u m n "   E l e m e n t I d = " 1 9 9 1 3 0 2 6 0 "   D a t a T y p e = " L a b e l " > T o t a l _ C a p t i o n 2 < / T o t a l _ C a p t i o n 2 > - 
-                 < C u s t L e d g E n t r y H d r   E l e m e n t T y p e = " D a t a I t e m "   E l e m e n t I d = " 9 4 2 7 0 7 9 3 2 " > - 
-                     < C u r r e n c y 2 C o d e _ C u s t L e d g E n t r y H d r   E l e m e n t T y p e = " C o l u m n "   E l e m e n t I d = " 1 3 4 9 2 7 9 6 1 1 "   D a t a T y p e = " S t r i n g " > C u r r e n c y 2 C o d e _ C u s t L e d g E n t r y H d r < / C u r r e n c y 2 C o d e _ C u s t L e d g E n t r y H d r > - 
-                     < C u r r e n c y C o d e 3   E l e m e n t T y p e = " C o l u m n "   E l e m e n t I d = " 6 1 8 1 4 2 9 0 8 "   D a t a T y p e = " C o d e " > C u r r e n c y C o d e 3 < / C u r r e n c y C o d e 3 > - 
-                     < C u s t B a l a n c e _ C u s t L e d g E n t r y H d r   E l e m e n t T y p e = " C o l u m n "   E l e m e n t I d = " 4 9 7 1 9 1 3 5 6 "   D a t a T y p e = " D e c i m a l " > C u s t B a l a n c e _ C u s t L e d g E n t r y H d r < / C u s t B a l a n c e _ C u s t L e d g E n t r y H d r > - 
-                     < D t l d C u s t L e d g E n t r y T y p e   E l e m e n t T y p e = " C o l u m n "   E l e m e n t I d = " 8 9 2 0 6 7 4 8 6 "   D a t a T y p e = " S t r i n g " > D t l d C u s t L e d g E n t r y T y p e < / D t l d C u s t L e d g E n t r y T y p e > - 
-                     < E n t r i e s E x i s t s   E l e m e n t T y p e = " C o l u m n "   E l e m e n t I d = " 1 8 9 9 2 2 0 4 1 "   D a t a T y p e = " B o o l e a n " > E n t r i e s E x i s t s < / E n t r i e s E x i s t s > - 
-                     < I s N e w C u s t C u r r e n c y G r o u p   E l e m e n t T y p e = " C o l u m n "   E l e m e n t I d = " 1 1 6 2 5 3 5 5 3 8 "   D a t a T y p e = " B o o l e a n " > I s N e w C u s t C u r r e n c y G r o u p < / I s N e w C u s t C u r r e n c y G r o u p > - 
-                     < P r i n t L i n e   E l e m e n t T y p e = " C o l u m n "   E l e m e n t I d = " 5 9 8 4 7 9 9 9 0 "   D a t a T y p e = " B o o l e a n " > P r i n t L i n e < / P r i n t L i n e > - 
-                     < S t a r t B a l a n c e   E l e m e n t T y p e = " C o l u m n "   E l e m e n t I d = " 3 2 9 4 8 3 5 7 9 "   D a t a T y p e = " D e c i m a l " > S t a r t B a l a n c e < / S t a r t B a l a n c e > - 
-                     < D t l d C u s t L e d g E n t r i e s   E l e m e n t T y p e = " D a t a I t e m "   E l e m e n t I d = " 1 1 1 1 4 6 3 1 7 2 " > - 
-                         < A m t _ D t l d C u s t L e d g E n t r i e s   E l e m e n t T y p e = " C o l u m n "   E l e m e n t I d = " 8 9 7 9 8 5 1 7 9 "   D a t a T y p e = " D e c i m a l " > A m t _ D t l d C u s t L e d g E n t r i e s < / A m t _ D t l d C u s t L e d g E n t r i e s > - 
-                         < C u r r C o d e _ D t l d C u s t L e d g E n t r i e s   E l e m e n t T y p e = " C o l u m n "   E l e m e n t I d = " 3 2 7 0 9 9 9 8 4 "   D a t a T y p e = " C o d e " > C u r r C o d e _ D t l d C u s t L e d g E n t r i e s < / C u r r C o d e _ D t l d C u s t L e d g E n t r i e s > - 
-                         < C u r r e n c y 2 C o d e   E l e m e n t T y p e = " C o l u m n "   E l e m e n t I d = " 4 6 5 9 9 3 8 2 7 "   D a t a T y p e = " C o d e " > C u r r e n c y 2 C o d e < / C u r r e n c y 2 C o d e > - 
-                         < C u s t B a l a n c e   E l e m e n t T y p e = " C o l u m n "   E l e m e n t I d = " 1 4 1 3 7 0 1 5 0 2 "   D a t a T y p e = " D e c i m a l " > C u s t B a l a n c e < / C u s t B a l a n c e > - 
-                         < D e s c r i p t i o n   E l e m e n t T y p e = " C o l u m n "   E l e m e n t I d = " 1 3 1 4 3 5 1 3 0 7 "   D a t a T y p e = " T e x t " > D e s c r i p t i o n < / D e s c r i p t i o n > - 
-                         < D o c N o _ D t l d C u s t L e d g E n t r i e s   E l e m e n t T y p e = " C o l u m n "   E l e m e n t I d = " 2 2 4 2 9 8 6 5 4 "   D a t a T y p e = " C o d e " > D o c N o _ D t l d C u s t L e d g E n t r i e s < / D o c N o _ D t l d C u s t L e d g E n t r i e s > - 
-                         < D u e D a t e _ D t l d C u s t L e d g E n t r i e s   E l e m e n t T y p e = " C o l u m n "   E l e m e n t I d = " 1 4 1 7 8 6 1 6 0 3 "   D a t a T y p e = " S t r i n g " > D u e D a t e _ D t l d C u s t L e d g E n t r i e s < / D u e D a t e _ D t l d C u s t L e d g E n t r i e s > - 
-                         < P o s t D a t e _ D t l d C u s t L e d g E n t r i e s   E l e m e n t T y p e = " C o l u m n "   E l e m e n t I d = " 1 6 8 8 2 9 9 9 1 3 "   D a t a T y p e = " S t r i n g " > P o s t D a t e _ D t l d C u s t L e d g E n t r i e s < / P o s t D a t e _ D t l d C u s t L e d g E n t r i e s > - 
-                         < R e m a i n A m t _ D t l d C u s t L e d g E n t r i e s   E l e m e n t T y p e = " C o l u m n "   E l e m e n t I d = " 1 4 5 7 2 4 8 8 2 5 "   D a t a T y p e = " D e c i m a l " > R e m a i n A m t _ D t l d C u s t L e d g E n t r i e s < / R e m a i n A m t _ D t l d C u s t L e d g E n t r i e s > - 
-                         < Y o u r R e f e r e n c e _ D t l d C u s t L e d g E n t r i e s   E l e m e n t T y p e = " C o l u m n "   E l e m e n t I d = " 6 7 5 1 3 6 1 6 7 "   D a t a T y p e = " T e x t " > Y o u r R e f e r e n c e _ D t l d C u s t L e d g E n t r i e s < / Y o u r R e f e r e n c e _ D t l d C u s t L e d g E n t r i e s > +<file path=customXml/item5.xml>��< ? x m l   v e r s i o n = " 1 . 0 "   e n c o d i n g = " u t f - 1 6 " ? > + 
+ < N a v W o r d R e p o r t X m l P a r t   x m l n s = " u r n : m i c r o s o f t - d y n a m i c s - n a v / r e p o r t s / C u s t o m e r S t a t e m e n t _ F a i r m o n t / 5 0 0 9 1 / " > + 
+     < C u s t o m e r > + 
+         < N o _ C u s t > N o _ C u s t < / N o _ C u s t > + 
+         < I n t e g e r > + 
+             < B a n k A c c N o _ C o m p a n y I n f o > B a n k A c c N o _ C o m p a n y I n f o < / B a n k A c c N o _ C o m p a n y I n f o > + 
+             < B a n k A c c N o _ C o m p a n y I n f o C a p t i o n > B a n k A c c N o _ C o m p a n y I n f o C a p t i o n < / B a n k A c c N o _ C o m p a n y I n f o C a p t i o n > + 
+             < B a n k N a m e _ C o m p a n y I n f o > B a n k N a m e _ C o m p a n y I n f o < / B a n k N a m e _ C o m p a n y I n f o > + 
+             < B a n k N a m e _ C o m p a n y I n f o C a p t i o n > B a n k N a m e _ C o m p a n y I n f o C a p t i o n < / B a n k N a m e _ C o m p a n y I n f o C a p t i o n > + 
+             < C o m p a n y A d d r 1 > C o m p a n y A d d r 1 < / C o m p a n y A d d r 1 > + 
+             < C o m p a n y A d d r 2 > C o m p a n y A d d r 2 < / C o m p a n y A d d r 2 > + 
+             < C o m p a n y A d d r 3 > C o m p a n y A d d r 3 < / C o m p a n y A d d r 3 > + 
+             < C o m p a n y A d d r 4 > C o m p a n y A d d r 4 < / C o m p a n y A d d r 4 > + 
+             < C o m p a n y A d d r 5 > C o m p a n y A d d r 5 < / C o m p a n y A d d r 5 > + 
+             < C o m p a n y A d d r 6 > C o m p a n y A d d r 6 < / C o m p a n y A d d r 6 > + 
+             < C o m p a n y A d d r 7 > C o m p a n y A d d r 7 < / C o m p a n y A d d r 7 > + 
+             < C o m p a n y A d d r 8 > C o m p a n y A d d r 8 < / C o m p a n y A d d r 8 > + 
+             < C o m p a n y I n f o 1 P i c t u r e   / > + 
+             < C o m p a n y I n f o 2 P i c t u r e   / > + 
+             < C o m p a n y I n f o 3 P i c t u r e   / > + 
+             < C o m p a n y I n f o E m a i l > C o m p a n y I n f o E m a i l < / C o m p a n y I n f o E m a i l > + 
+             < C o m p a n y I n f o E m a i l C a p t i o n > C o m p a n y I n f o E m a i l C a p t i o n < / C o m p a n y I n f o E m a i l C a p t i o n > + 
+             < C o m p a n y I n f o H o m e P a g e > C o m p a n y I n f o H o m e P a g e < / C o m p a n y I n f o H o m e P a g e > + 
+             < C o m p a n y I n f o H o m e p a g e C a p t i o n > C o m p a n y I n f o H o m e p a g e C a p t i o n < / C o m p a n y I n f o H o m e p a g e C a p t i o n > + 
+             < C o m p a n y L e g a l O f f i c e > C o m p a n y L e g a l O f f i c e < / C o m p a n y L e g a l O f f i c e > + 
+             < C o m p a n y L e g a l O f f i c e _ L b l > C o m p a n y L e g a l O f f i c e _ L b l < / C o m p a n y L e g a l O f f i c e _ L b l > + 
+             < C o m p a n y P i c t u r e   / > + 
+             < C u r r R e p o r t P a g e N o C a p t i o n > C u r r R e p o r t P a g e N o C a p t i o n < / C u r r R e p o r t P a g e N o C a p t i o n > + 
+             < C u s t A d d r 1 > C u s t A d d r 1 < / C u s t A d d r 1 > + 
+             < C u s t A d d r 2 > C u s t A d d r 2 < / C u s t A d d r 2 > + 
+             < C u s t A d d r 3 > C u s t A d d r 3 < / C u s t A d d r 3 > + 
+             < C u s t A d d r 4 > C u s t A d d r 4 < / C u s t A d d r 4 > + 
+             < C u s t A d d r 5 > C u s t A d d r 5 < / C u s t A d d r 5 > + 
+             < C u s t A d d r 6 > C u s t A d d r 6 < / C u s t A d d r 6 > + 
+             < C u s t A d d r 7 > C u s t A d d r 7 < / C u s t A d d r 7 > + 
+             < C u s t A d d r 8 > C u s t A d d r 8 < / C u s t A d d r 8 > + 
+             < C u s t B a l a n c e C a p t i o n > C u s t B a l a n c e C a p t i o n < / C u s t B a l a n c e C a p t i o n > + 
+             < D e s c _ C u s t L e d g E n t r y 2 C a p t i o n > D e s c _ C u s t L e d g E n t r y 2 C a p t i o n < / D e s c _ C u s t L e d g E n t r y 2 C a p t i o n > + 
+             < D o c D a t e C a p t i o n > D o c D a t e C a p t i o n < / D o c D a t e C a p t i o n > + 
+             < D o c N o _ D t l d C u s t L e d g E n t r i e s C a p t i o n > D o c N o _ D t l d C u s t L e d g E n t r i e s C a p t i o n < / D o c N o _ D t l d C u s t L e d g E n t r i e s C a p t i o n > + 
+             < D u e D a t e _ C u s t L e d g E n t r y 2 C a p t i o n > D u e D a t e _ C u s t L e d g E n t r y 2 C a p t i o n < / D u e D a t e _ C u s t L e d g E n t r y 2 C a p t i o n > + 
+             < E n d D a t e > E n d D a t e < / E n d D a t e > + 
+             < E n d D a t e C a p t i o n > E n d D a t e C a p t i o n < / E n d D a t e C a p t i o n > + 
+             < G i r o N o _ C o m p a n y I n f o > G i r o N o _ C o m p a n y I n f o < / G i r o N o _ C o m p a n y I n f o > + 
+             < G i r o N o _ C o m p a n y I n f o C a p t i o n > G i r o N o _ C o m p a n y I n f o C a p t i o n < / G i r o N o _ C o m p a n y I n f o C a p t i o n > + 
+             < L a s t S t a t m n t N o _ C u s t > L a s t S t a t m n t N o _ C u s t < / L a s t S t a t m n t N o _ C u s t > + 
+             < L a s t S t a t m n t N o _ C u s t C a p t i o n > L a s t S t a t m n t N o _ C u s t C a p t i o n < / L a s t S t a t m n t N o _ C u s t C a p t i o n > + 
+             < N o 1 _ C u s t > N o 1 _ C u s t < / N o 1 _ C u s t > + 
+             < N o 1 _ C u s t C a p t i o n > N o 1 _ C u s t C a p t i o n < / N o 1 _ C u s t C a p t i o n > + 
+             < O r i g i n a l A m t _ C u s t L e d g E n t r y 2 C a p t i o n > O r i g i n a l A m t _ C u s t L e d g E n t r y 2 C a p t i o n < / O r i g i n a l A m t _ C u s t L e d g E n t r y 2 C a p t i o n > + 
+             < P h o n e N o _ C o m p a n y I n f o > P h o n e N o _ C o m p a n y I n f o < / P h o n e N o _ C o m p a n y I n f o > + 
+             < P h o n e N o _ C o m p a n y I n f o C a p t i o n > P h o n e N o _ C o m p a n y I n f o C a p t i o n < / P h o n e N o _ C o m p a n y I n f o C a p t i o n > + 
+             < P o s t D a t e _ D t l d C u s t L e d g E n t r i e s C a p t i o n > P o s t D a t e _ D t l d C u s t L e d g E n t r i e s C a p t i o n < / P o s t D a t e _ D t l d C u s t L e d g E n t r i e s C a p t i o n > + 
+             < R e m a i n A m t C u s t L e d g E n t r y 2 C a p t i o n > R e m a i n A m t C u s t L e d g E n t r y 2 C a p t i o n < / R e m a i n A m t C u s t L e d g E n t r y 2 C a p t i o n > + 
+             < S t a r t D a t e > S t a r t D a t e < / S t a r t D a t e > + 
+             < S t a r t D a t e C a p t i o n > S t a r t D a t e C a p t i o n < / S t a r t D a t e C a p t i o n > + 
+             < S t a t e m e n t C a p t i o n > S t a t e m e n t C a p t i o n < / S t a t e m e n t C a p t i o n > + 
+             < T o d a y F o r m a t t e d > T o d a y F o r m a t t e d < / T o d a y F o r m a t t e d > + 
+             < V A T R e g N o _ C o m p a n y I n f o > V A T R e g N o _ C o m p a n y I n f o < / V A T R e g N o _ C o m p a n y I n f o > + 
+             < V A T R e g N o _ C o m p a n y I n f o C a p t i o n > V A T R e g N o _ C o m p a n y I n f o C a p t i o n < / V A T R e g N o _ C o m p a n y I n f o C a p t i o n > + 
+             < C u r r e n c y L o o p > + 
+                 < T o t a l _ C a p t i o n 2 > T o t a l _ C a p t i o n 2 < / T o t a l _ C a p t i o n 2 > + 
+                 < C u s t L e d g E n t r y H d r > + 
+                     < C u r r e n c y 2 C o d e _ C u s t L e d g E n t r y H d r > C u r r e n c y 2 C o d e _ C u s t L e d g E n t r y H d r < / C u r r e n c y 2 C o d e _ C u s t L e d g E n t r y H d r > + 
+                     < C u r r e n c y C o d e 3 > C u r r e n c y C o d e 3 < / C u r r e n c y C o d e 3 > + 
+                     < C u s t B a l a n c e _ C u s t L e d g E n t r y H d r > C u s t B a l a n c e _ C u s t L e d g E n t r y H d r < / C u s t B a l a n c e _ C u s t L e d g E n t r y H d r > + 
+                     < D t l d C u s t L e d g E n t r y T y p e > D t l d C u s t L e d g E n t r y T y p e < / D t l d C u s t L e d g E n t r y T y p e > + 
+                     < E n t r i e s E x i s t s > E n t r i e s E x i s t s < / E n t r i e s E x i s t s > + 
+                     < I s N e w C u s t C u r r e n c y G r o u p > I s N e w C u s t C u r r e n c y G r o u p < / I s N e w C u s t C u r r e n c y G r o u p > + 
+                     < P r i n t L i n e > P r i n t L i n e < / P r i n t L i n e > + 
+                     < S t a r t B a l a n c e > S t a r t B a l a n c e < / S t a r t B a l a n c e > + 
+                     < D t l d C u s t L e d g E n t r i e s > + 
+                         < A m t _ D t l d C u s t L e d g E n t r i e s > A m t _ D t l d C u s t L e d g E n t r i e s < / A m t _ D t l d C u s t L e d g E n t r i e s > + 
+                         < C u r r C o d e _ D t l d C u s t L e d g E n t r i e s > C u r r C o d e _ D t l d C u s t L e d g E n t r i e s < / C u r r C o d e _ D t l d C u s t L e d g E n t r i e s > + 
+                         < C u r r e n c y 2 C o d e > C u r r e n c y 2 C o d e < / C u r r e n c y 2 C o d e > + 
+                         < C u s t B a l a n c e > C u s t B a l a n c e < / C u s t B a l a n c e > + 
+                         < D e s c r i p t i o n > D e s c r i p t i o n < / D e s c r i p t i o n > + 
+                         < D o c N o _ D t l d C u s t L e d g E n t r i e s > D o c N o _ D t l d C u s t L e d g E n t r i e s < / D o c N o _ D t l d C u s t L e d g E n t r i e s > + 
+                         < D u e D a t e _ D t l d C u s t L e d g E n t r i e s > D u e D a t e _ D t l d C u s t L e d g E n t r i e s < / D u e D a t e _ D t l d C u s t L e d g E n t r i e s > + 
+                         < P o s t D a t e _ D t l d C u s t L e d g E n t r i e s > P o s t D a t e _ D t l d C u s t L e d g E n t r i e s < / P o s t D a t e _ D t l d C u s t L e d g E n t r i e s > + 
+                         < R e m a i n A m t _ D t l d C u s t L e d g E n t r i e s > R e m a i n A m t _ D t l d C u s t L e d g E n t r i e s < / R e m a i n A m t _ D t l d C u s t L e d g E n t r i e s > + 
+                         < Y o u r R e f e r e n c e _ D t l d C u s t L e d g E n t r i e s > Y o u r R e f e r e n c e _ D t l d C u s t L e d g E n t r i e s < / Y o u r R e f e r e n c e _ D t l d C u s t L e d g E n t r i e s >   
                      < / D t l d C u s t L e d g E n t r i e s >   
                  < / C u s t L e d g E n t r y H d r >   
-                 < C u s t L e d g E n t r y F o o t e r   E l e m e n t T y p e = " D a t a I t e m "   E l e m e n t I d = " 9 2 5 1 1 8 7 3 5 " > - 
-                     < C u r r e n c y C o d e 3 _ C u s t L e d g E n t r y F o o t e r   E l e m e n t T y p e = " C o l u m n "   E l e m e n t I d = " 1 7 6 5 6 9 2 8 1 "   D a t a T y p e = " C o d e " > C u r r e n c y C o d e 3 _ C u s t L e d g E n t r y F o o t e r < / C u r r e n c y C o d e 3 _ C u s t L e d g E n t r y F o o t e r > - 
-                     < C u s t B a l a n c e _ C u s t L e d g E n t r y H d r F o o t e r   E l e m e n t T y p e = " C o l u m n "   E l e m e n t I d = " 1 3 6 7 2 1 4 5 9 3 "   D a t a T y p e = " D e c i m a l " > C u s t B a l a n c e _ C u s t L e d g E n t r y H d r F o o t e r < / C u s t B a l a n c e _ C u s t L e d g E n t r y H d r F o o t e r > - 
-                     < E n t r i e s E x i s t s l _ C u s t L e d g E n t r y F o o t e r C a p t i o n   E l e m e n t T y p e = " C o l u m n "   E l e m e n t I d = " 1 1 7 7 0 6 9 2 3 2 "   D a t a T y p e = " B o o l e a n " > E n t r i e s E x i s t s l _ C u s t L e d g E n t r y F o o t e r C a p t i o n < / E n t r i e s E x i s t s l _ C u s t L e d g E n t r y F o o t e r C a p t i o n > - 
-                     < T o t a l _ C a p t i o n   E l e m e n t T y p e = " C o l u m n "   E l e m e n t I d = " 6 1 1 5 9 7 6 3 4 "   D a t a T y p e = " L a b e l " > T o t a l _ C a p t i o n < / T o t a l _ C a p t i o n > +                 < C u s t L e d g E n t r y F o o t e r > + 
+                     < C u r r e n c y C o d e 3 _ C u s t L e d g E n t r y F o o t e r > C u r r e n c y C o d e 3 _ C u s t L e d g E n t r y F o o t e r < / C u r r e n c y C o d e 3 _ C u s t L e d g E n t r y F o o t e r > + 
+                     < C u s t B a l a n c e _ C u s t L e d g E n t r y H d r F o o t e r > C u s t B a l a n c e _ C u s t L e d g E n t r y H d r F o o t e r < / C u s t B a l a n c e _ C u s t L e d g E n t r y H d r F o o t e r > + 
+                     < E n t r i e s E x i s t s l _ C u s t L e d g E n t r y F o o t e r C a p t i o n > E n t r i e s E x i s t s l _ C u s t L e d g E n t r y F o o t e r C a p t i o n < / E n t r i e s E x i s t s l _ C u s t L e d g E n t r y F o o t e r C a p t i o n > + 
+                     < T o t a l _ C a p t i o n > T o t a l _ C a p t i o n < / T o t a l _ C a p t i o n >   
                  < / C u s t L e d g E n t r y F o o t e r >   
-                 < O v e r d u e V i s i b l e   E l e m e n t T y p e = " D a t a I t e m "   E l e m e n t I d = " 1 4 2 6 6 4 4 0 8 7 " > - 
-                     < C u r r e n c y C o d e 3 _ C u s t L e d g E n t r y 2   E l e m e n t T y p e = " C o l u m n "   E l e m e n t I d = " 1 4 9 4 2 9 8 6 2 2 "   D a t a T y p e = " C o d e " > C u r r e n c y C o d e 3 _ C u s t L e d g E n t r y 2 < / C u r r e n c y C o d e 3 _ C u s t L e d g E n t r y 2 > - 
-                     < D e s c _ C u s t L e d g E n t r y 2 C a p t i o n 2   E l e m e n t T y p e = " C o l u m n "   E l e m e n t I d = " 1 9 5 4 6 4 5 1 6 2 "   D a t a T y p e = " S t r i n g " > D e s c _ C u s t L e d g E n t r y 2 C a p t i o n 2 < / D e s c _ C u s t L e d g E n t r y 2 C a p t i o n 2 > - 
-                     < D o c N o _ D t l d C u s t L e d g E n t r i e s C a p t i o n 2   E l e m e n t T y p e = " C o l u m n "   E l e m e n t I d = " 1 0 9 6 5 7 7 3 7 8 "   D a t a T y p e = " S t r i n g " > D o c N o _ D t l d C u s t L e d g E n t r i e s C a p t i o n 2 < / D o c N o _ D t l d C u s t L e d g E n t r i e s C a p t i o n 2 > - 
-                     < D u e D a t e _ C u s t L e d g E n t r y 2 C a p t i o n 2   E l e m e n t T y p e = " C o l u m n "   E l e m e n t I d = " 9 0 1 1 8 8 6 8 5 "   D a t a T y p e = " L a b e l " > D u e D a t e _ C u s t L e d g E n t r y 2 C a p t i o n 2 < / D u e D a t e _ C u s t L e d g E n t r y 2 C a p t i o n 2 > - 
-                     < O r i g i n a l A m t _ C u s t L e d g E n t r y 2 C a p t i o n 2   E l e m e n t T y p e = " C o l u m n "   E l e m e n t I d = " 1 6 4 9 8 2 3 4 6 6 "   D a t a T y p e = " S t r i n g " > O r i g i n a l A m t _ C u s t L e d g E n t r y 2 C a p t i o n 2 < / O r i g i n a l A m t _ C u s t L e d g E n t r y 2 C a p t i o n 2 > - 
-                     < O v e r D u e E n t r i e s   E l e m e n t T y p e = " C o l u m n "   E l e m e n t I d = " 2 3 9 2 5 5 2 1 3 "   D a t a T y p e = " S t r i n g " > O v e r D u e E n t r i e s < / O v e r D u e E n t r i e s > - 
-                     < P o s t D a t e _ D t l d C u s t L e d g E n t r i e s C a p t i o n 2   E l e m e n t T y p e = " C o l u m n "   E l e m e n t I d = " 7 1 5 0 7 2 1 9 7 "   D a t a T y p e = " L a b e l " > P o s t D a t e _ D t l d C u s t L e d g E n t r i e s C a p t i o n 2 < / P o s t D a t e _ D t l d C u s t L e d g E n t r i e s C a p t i o n 2 > - 
-                     < R e m a i n A m t C u s t L e d g E n t r y 2 C a p t i o n 2   E l e m e n t T y p e = " C o l u m n "   E l e m e n t I d = " 5 0 5 0 3 3 9 6 0 "   D a t a T y p e = " S t r i n g " > R e m a i n A m t C u s t L e d g E n t r y 2 C a p t i o n 2 < / R e m a i n A m t C u s t L e d g E n t r y 2 C a p t i o n 2 > - 
-                     < T o t a l _ C a p t i o n 3   E l e m e n t T y p e = " C o l u m n "   E l e m e n t I d = " 4 3 8 5 6 6 3 5 7 "   D a t a T y p e = " L a b e l " > T o t a l _ C a p t i o n 3 < / T o t a l _ C a p t i o n 3 > - 
-                     < C u s t L e d g E n t r y 2   E l e m e n t T y p e = " D a t a I t e m "   E l e m e n t I d = " 1 3 7 2 6 3 7 0 0 8 " > - 
-                         < C u r r C o d e _ C u s t L e d g E n t r y 2   E l e m e n t T y p e = " C o l u m n "   E l e m e n t I d = " 1 5 8 9 5 4 6 2 6 8 "   D a t a T y p e = " C o d e " > C u r r C o d e _ C u s t L e d g E n t r y 2 < / C u r r C o d e _ C u s t L e d g E n t r y 2 > - 
-                         < C u r r e n c y 2 C o d e _ C u s t L e d g E n t r y 2   E l e m e n t T y p e = " C o l u m n "   E l e m e n t I d = " 1 4 2 6 8 6 9 3 0 3 "   D a t a T y p e = " C o d e " > C u r r e n c y 2 C o d e _ C u s t L e d g E n t r y 2 < / C u r r e n c y 2 C o d e _ C u s t L e d g E n t r y 2 > - 
-                         < C u s t N o _ C u s t L e d g E n t r y 2   E l e m e n t T y p e = " C o l u m n "   E l e m e n t I d = " 1 3 5 3 0 8 9 7 4 5 "   D a t a T y p e = " C o d e " > C u s t N o _ C u s t L e d g E n t r y 2 < / C u s t N o _ C u s t L e d g E n t r y 2 > - 
-                         < D e s c _ C u s t L e d g E n t r y 2   E l e m e n t T y p e = " C o l u m n "   E l e m e n t I d = " 4 0 4 4 4 3 7 9 8 "   D a t a T y p e = " T e x t " > D e s c _ C u s t L e d g E n t r y 2 < / D e s c _ C u s t L e d g E n t r y 2 > - 
-                         < D o c N o _ C u s t L e d g E n t r y 2   E l e m e n t T y p e = " C o l u m n "   E l e m e n t I d = " 5 1 0 9 1 4 9 4 "   D a t a T y p e = " C o d e " > D o c N o _ C u s t L e d g E n t r y 2 < / D o c N o _ C u s t L e d g E n t r y 2 > - 
-                         < D u e D a t e _ C u s t L e d g E n t r y 2   E l e m e n t T y p e = " C o l u m n "   E l e m e n t I d = " 1 6 3 5 3 6 3 6 4 7 "   D a t a T y p e = " S t r i n g " > D u e D a t e _ C u s t L e d g E n t r y 2 < / D u e D a t e _ C u s t L e d g E n t r y 2 > - 
-                         < O r i g i n a l A m t _ C u s t L e d g E n t r y 2   E l e m e n t T y p e = " C o l u m n "   E l e m e n t I d = " 6 5 4 0 4 5 0 9 8 "   D a t a T y p e = " D e c i m a l " > O r i g i n a l A m t _ C u s t L e d g E n t r y 2 < / O r i g i n a l A m t _ C u s t L e d g E n t r y 2 > - 
-                         < P o s t D a t e _ C u s t L e d g E n t r y 2   E l e m e n t T y p e = " C o l u m n "   E l e m e n t I d = " 1 8 1 7 1 9 2 0 4 3 "   D a t a T y p e = " S t r i n g " > P o s t D a t e _ C u s t L e d g E n t r y 2 < / P o s t D a t e _ C u s t L e d g E n t r y 2 > - 
-                         < P r i n t E n t r i e s D u e   E l e m e n t T y p e = " C o l u m n "   E l e m e n t I d = " 6 9 3 7 0 0 1 2 6 "   D a t a T y p e = " B o o l e a n " > P r i n t E n t r i e s D u e < / P r i n t E n t r i e s D u e > - 
-                         < R e m a i n A m t _ C u s t L e d g E n t r y 2   E l e m e n t T y p e = " C o l u m n "   E l e m e n t I d = " 7 5 6 3 4 5 4 1 3 "   D a t a T y p e = " D e c i m a l " > R e m a i n A m t _ C u s t L e d g E n t r y 2 < / R e m a i n A m t _ C u s t L e d g E n t r y 2 > - 
-                         < Y o u r R e f e r e n c e _ C u s t L e d g E n t r y 2   E l e m e n t T y p e = " C o l u m n "   E l e m e n t I d = " 2 0 5 5 4 0 4 3 9 5 "   D a t a T y p e = " T e x t " > Y o u r R e f e r e n c e _ C u s t L e d g E n t r y 2 < / Y o u r R e f e r e n c e _ C u s t L e d g E n t r y 2 > +                 < O v e r d u e V i s i b l e > + 
+                     < C u r r e n c y C o d e 3 _ C u s t L e d g E n t r y 2 > C u r r e n c y C o d e 3 _ C u s t L e d g E n t r y 2 < / C u r r e n c y C o d e 3 _ C u s t L e d g E n t r y 2 > + 
+                     < D e s c _ C u s t L e d g E n t r y 2 C a p t i o n 2 > D e s c _ C u s t L e d g E n t r y 2 C a p t i o n 2 < / D e s c _ C u s t L e d g E n t r y 2 C a p t i o n 2 > + 
+                     < D o c N o _ D t l d C u s t L e d g E n t r i e s C a p t i o n 2 > D o c N o _ D t l d C u s t L e d g E n t r i e s C a p t i o n 2 < / D o c N o _ D t l d C u s t L e d g E n t r i e s C a p t i o n 2 > + 
+                     < D u e D a t e _ C u s t L e d g E n t r y 2 C a p t i o n 2 > D u e D a t e _ C u s t L e d g E n t r y 2 C a p t i o n 2 < / D u e D a t e _ C u s t L e d g E n t r y 2 C a p t i o n 2 > + 
+                     < O r i g i n a l A m t _ C u s t L e d g E n t r y 2 C a p t i o n 2 > O r i g i n a l A m t _ C u s t L e d g E n t r y 2 C a p t i o n 2 < / O r i g i n a l A m t _ C u s t L e d g E n t r y 2 C a p t i o n 2 > + 
+                     < O v e r D u e E n t r i e s > O v e r D u e E n t r i e s < / O v e r D u e E n t r i e s > + 
+                     < P o s t D a t e _ D t l d C u s t L e d g E n t r i e s C a p t i o n 2 > P o s t D a t e _ D t l d C u s t L e d g E n t r i e s C a p t i o n 2 < / P o s t D a t e _ D t l d C u s t L e d g E n t r i e s C a p t i o n 2 > + 
+                     < R e m a i n A m t C u s t L e d g E n t r y 2 C a p t i o n 2 > R e m a i n A m t C u s t L e d g E n t r y 2 C a p t i o n 2 < / R e m a i n A m t C u s t L e d g E n t r y 2 C a p t i o n 2 > + 
+                     < T o t a l _ C a p t i o n 3 > T o t a l _ C a p t i o n 3 < / T o t a l _ C a p t i o n 3 > + 
+                     < C u s t L e d g E n t r y 2 > + 
+                         < C u r r C o d e _ C u s t L e d g E n t r y 2 > C u r r C o d e _ C u s t L e d g E n t r y 2 < / C u r r C o d e _ C u s t L e d g E n t r y 2 > + 
+                         < C u r r e n c y 2 C o d e _ C u s t L e d g E n t r y 2 > C u r r e n c y 2 C o d e _ C u s t L e d g E n t r y 2 < / C u r r e n c y 2 C o d e _ C u s t L e d g E n t r y 2 > + 
+                         < C u s t N o _ C u s t L e d g E n t r y 2 > C u s t N o _ C u s t L e d g E n t r y 2 < / C u s t N o _ C u s t L e d g E n t r y 2 > + 
+                         < D e s c _ C u s t L e d g E n t r y 2 > D e s c _ C u s t L e d g E n t r y 2 < / D e s c _ C u s t L e d g E n t r y 2 > + 
+                         < D o c N o _ C u s t L e d g E n t r y 2 > D o c N o _ C u s t L e d g E n t r y 2 < / D o c N o _ C u s t L e d g E n t r y 2 > + 
+                         < D u e D a t e _ C u s t L e d g E n t r y 2 > D u e D a t e _ C u s t L e d g E n t r y 2 < / D u e D a t e _ C u s t L e d g E n t r y 2 > + 
+                         < O r i g i n a l A m t _ C u s t L e d g E n t r y 2 > O r i g i n a l A m t _ C u s t L e d g E n t r y 2 < / O r i g i n a l A m t _ C u s t L e d g E n t r y 2 > + 
+                         < P o s t D a t e _ C u s t L e d g E n t r y 2 > P o s t D a t e _ C u s t L e d g E n t r y 2 < / P o s t D a t e _ C u s t L e d g E n t r y 2 > + 
+                         < P r i n t E n t r i e s D u e > P r i n t E n t r i e s D u e < / P r i n t E n t r i e s D u e > + 
+                         < R e m a i n A m t _ C u s t L e d g E n t r y 2 > R e m a i n A m t _ C u s t L e d g E n t r y 2 < / R e m a i n A m t _ C u s t L e d g E n t r y 2 > + 
+                         < Y o u r R e f e r e n c e _ C u s t L e d g E n t r y 2 > Y o u r R e f e r e n c e _ C u s t L e d g E n t r y 2 < / Y o u r R e f e r e n c e _ C u s t L e d g E n t r y 2 >   
                      < / C u s t L e d g E n t r y 2 >   
-                     < O v e r d u e E n t r y F o o d e r   E l e m e n t T y p e = " D a t a I t e m "   E l e m e n t I d = " 1 6 5 9 2 3 5 9 3 4 " > - 
-                         < O v e r d u e B a l a n c e   E l e m e n t T y p e = " C o l u m n "   E l e m e n t I d = " 1 1 8 6 1 4 8 4 3 9 "   D a t a T y p e = " D e c i m a l " > O v e r d u e B a l a n c e < / O v e r d u e B a l a n c e > +                     < O v e r d u e E n t r y F o o d e r > + 
+                         < O v e r d u e B a l a n c e > O v e r d u e B a l a n c e < / O v e r d u e B a l a n c e >   
                      < / O v e r d u e E n t r y F o o d e r >   
@@ -7289,51 +7289,51 @@
  
              < / C u r r e n c y L o o p >   
-             < A g i n g B a n d V i s i b l e   E l e m e n t T y p e = " D a t a I t e m "   E l e m e n t I d = " 1 9 4 1 7 6 5 1 4 0 " > - 
-                 < A g i n g C u s t L e d g E n t r y   E l e m e n t T y p e = " D a t a I t e m "   E l e m e n t I d = " 7 0 4 1 6 5 1 3 2 "   / > - 
-                 < A g i n g B a n d L o o p   E l e m e n t T y p e = " D a t a I t e m "   E l e m e n t I d = " 1 5 2 9 3 9 4 0 2 2 " > - 
-                     < A g i n g B a n d B u f C o l 1 A m t   E l e m e n t T y p e = " C o l u m n "   E l e m e n t I d = " 1 9 4 8 7 4 9 4 5 4 "   D a t a T y p e = " D e c i m a l " > A g i n g B a n d B u f C o l 1 A m t < / A g i n g B a n d B u f C o l 1 A m t > - 
-                     < A g i n g B a n d B u f C o l 2 A m t   E l e m e n t T y p e = " C o l u m n "   E l e m e n t I d = " 1 9 5 6 4 3 5 6 1 5 "   D a t a T y p e = " D e c i m a l " > A g i n g B a n d B u f C o l 2 A m t < / A g i n g B a n d B u f C o l 2 A m t > - 
-                     < A g i n g B a n d B u f C o l 3 A m t   E l e m e n t T y p e = " C o l u m n "   E l e m e n t I d = " 9 7 5 6 7 9 1 5 2 "   D a t a T y p e = " D e c i m a l " > A g i n g B a n d B u f C o l 3 A m t < / A g i n g B a n d B u f C o l 3 A m t > - 
-                     < A g i n g B a n d B u f C o l 4 A m t   E l e m e n t T y p e = " C o l u m n "   E l e m e n t I d = " 1 2 3 5 5 5 5 7 0 5 "   D a t a T y p e = " D e c i m a l " > A g i n g B a n d B u f C o l 4 A m t < / A g i n g B a n d B u f C o l 4 A m t > - 
-                     < A g i n g B a n d B u f C o l 5 A m t   E l e m e n t T y p e = " C o l u m n "   E l e m e n t I d = " 4 2 4 7 8 1 3 0 2 "   D a t a T y p e = " D e c i m a l " > A g i n g B a n d B u f C o l 5 A m t < / A g i n g B a n d B u f C o l 5 A m t > - 
-                     < A g i n g B a n d C u r r e n c y C o d e   E l e m e n t T y p e = " C o l u m n "   E l e m e n t I d = " 1 3 1 1 1 3 8 9 6 8 "   D a t a T y p e = " C o d e " > A g i n g B a n d C u r r e n c y C o d e < / A g i n g B a n d C u r r e n c y C o d e > - 
-                     < A g i n g B a n d E n d i n g D a t e   E l e m e n t T y p e = " C o l u m n "   E l e m e n t I d = " 1 3 9 0 8 7 6 8 7 "   D a t a T y p e = " S t r i n g " > A g i n g B a n d E n d i n g D a t e < / A g i n g B a n d E n d i n g D a t e > - 
-                     < A g i n g D a t e 1   E l e m e n t T y p e = " C o l u m n "   E l e m e n t I d = " 4 7 9 6 0 6 2 6 6 "   D a t a T y p e = " S t r i n g " > A g i n g D a t e 1 < / A g i n g D a t e 1 > - 
-                     < A g i n g D a t e 2   E l e m e n t T y p e = " C o l u m n "   E l e m e n t I d = " 1 1 1 7 3 0 2 8 8 3 "   D a t a T y p e = " S t r i n g " > A g i n g D a t e 2 < / A g i n g D a t e 2 > - 
-                     < A g i n g D a t e 2 1   E l e m e n t T y p e = " C o l u m n "   E l e m e n t I d = " 3 1 3 5 0 1 0 6 8 "   D a t a T y p e = " S t r i n g " > A g i n g D a t e 2 1 < / A g i n g D a t e 2 1 > - 
-                     < A g i n g D a t e 3   E l e m e n t T y p e = " C o l u m n "   E l e m e n t I d = " 1 7 5 4 9 9 9 5 0 0 "   D a t a T y p e = " S t r i n g " > A g i n g D a t e 3 < / A g i n g D a t e 3 > - 
-                     < A g i n g D a t e 3 1   E l e m e n t T y p e = " C o l u m n "   E l e m e n t I d = " 1 9 1 4 0 6 0 5 3 1 "   D a t a T y p e = " S t r i n g " > A g i n g D a t e 3 1 < / A g i n g D a t e 3 1 > - 
-                     < A g i n g D a t e 4   E l e m e n t T y p e = " C o l u m n "   E l e m e n t I d = " 1 9 0 2 2 7 1 1 7 9 "   D a t a T y p e = " S t r i n g " > A g i n g D a t e 4 < / A g i n g D a t e 4 > - 
-                     < A g i n g D a t e 4 1   E l e m e n t T y p e = " C o l u m n "   E l e m e n t I d = " 8 4 9 7 6 9 6 1 0 "   D a t a T y p e = " S t r i n g " > A g i n g D a t e 4 1 < / A g i n g D a t e 4 1 > - 
-                     < A g i n g D a t e 5   E l e m e n t T y p e = " C o l u m n "   E l e m e n t I d = " 1 2 6 4 5 7 4 5 6 2 "   D a t a T y p e = " S t r i n g " > A g i n g D a t e 5 < / A g i n g D a t e 5 > - 
-                     < A g i n g D a t e H e a d e r 1   E l e m e n t T y p e = " C o l u m n "   E l e m e n t I d = " 2 8 6 3 5 0 7 5 9 "   D a t a T y p e = " T e x t " > A g i n g D a t e H e a d e r 1 < / A g i n g D a t e H e a d e r 1 > - 
-                     < A g i n g D a t e H e a d e r 2   E l e m e n t T y p e = " C o l u m n "   E l e m e n t I d = " 3 5 1 3 4 5 8 5 8 "   D a t a T y p e = " T e x t " > A g i n g D a t e H e a d e r 2 < / A g i n g D a t e H e a d e r 2 > - 
-                     < A g i n g D a t e H e a d e r 3   E l e m e n t T y p e = " C o l u m n "   E l e m e n t I d = " 9 8 9 0 4 2 4 7 5 "   D a t a T y p e = " T e x t " > A g i n g D a t e H e a d e r 3 < / A g i n g D a t e H e a d e r 3 > - 
-                     < A g i n g D a t e H e a d e r 4   E l e m e n t T y p e = " C o l u m n "   E l e m e n t I d = " 1 6 2 6 7 3 9 0 9 2 "   D a t a T y p e = " T e x t " > A g i n g D a t e H e a d e r 4 < / A g i n g D a t e H e a d e r 4 > - 
-                     < b e f o r e C a p t i o n   E l e m e n t T y p e = " C o l u m n "   E l e m e n t I d = " 1 0 1 3 0 1 9 7 1 8 "   D a t a T y p e = " L a b e l " > b e f o r e C a p t i o n < / b e f o r e C a p t i o n > +             < A g i n g B a n d V i s i b l e > + 
+                 < A g i n g C u s t L e d g E n t r y   / > + 
+                 < A g i n g B a n d L o o p > + 
+                     < A g i n g B a n d B u f C o l 1 A m t > A g i n g B a n d B u f C o l 1 A m t < / A g i n g B a n d B u f C o l 1 A m t > + 
+                     < A g i n g B a n d B u f C o l 2 A m t > A g i n g B a n d B u f C o l 2 A m t < / A g i n g B a n d B u f C o l 2 A m t > + 
+                     < A g i n g B a n d B u f C o l 3 A m t > A g i n g B a n d B u f C o l 3 A m t < / A g i n g B a n d B u f C o l 3 A m t > + 
+                     < A g i n g B a n d B u f C o l 4 A m t > A g i n g B a n d B u f C o l 4 A m t < / A g i n g B a n d B u f C o l 4 A m t > + 
+                     < A g i n g B a n d B u f C o l 5 A m t > A g i n g B a n d B u f C o l 5 A m t < / A g i n g B a n d B u f C o l 5 A m t > + 
+                     < A g i n g B a n d C u r r e n c y C o d e > A g i n g B a n d C u r r e n c y C o d e < / A g i n g B a n d C u r r e n c y C o d e > + 
+                     < A g i n g B a n d E n d i n g D a t e > A g i n g B a n d E n d i n g D a t e < / A g i n g B a n d E n d i n g D a t e > + 
+                     < A g i n g D a t e 1 > A g i n g D a t e 1 < / A g i n g D a t e 1 > + 
+                     < A g i n g D a t e 2 > A g i n g D a t e 2 < / A g i n g D a t e 2 > + 
+                     < A g i n g D a t e 2 1 > A g i n g D a t e 2 1 < / A g i n g D a t e 2 1 > + 
+                     < A g i n g D a t e 3 > A g i n g D a t e 3 < / A g i n g D a t e 3 > + 
+                     < A g i n g D a t e 3 1 > A g i n g D a t e 3 1 < / A g i n g D a t e 3 1 > + 
+                     < A g i n g D a t e 4 > A g i n g D a t e 4 < / A g i n g D a t e 4 > + 
+                     < A g i n g D a t e 4 1 > A g i n g D a t e 4 1 < / A g i n g D a t e 4 1 > + 
+                     < A g i n g D a t e 5 > A g i n g D a t e 5 < / A g i n g D a t e 5 > + 
+                     < A g i n g D a t e H e a d e r 1 > A g i n g D a t e H e a d e r 1 < / A g i n g D a t e H e a d e r 1 > + 
+                     < A g i n g D a t e H e a d e r 2 > A g i n g D a t e H e a d e r 2 < / A g i n g D a t e H e a d e r 2 > + 
+                     < A g i n g D a t e H e a d e r 3 > A g i n g D a t e H e a d e r 3 < / A g i n g D a t e H e a d e r 3 > + 
+                     < A g i n g D a t e H e a d e r 4 > A g i n g D a t e H e a d e r 4 < / A g i n g D a t e H e a d e r 4 > + 
+                     < b e f o r e C a p t i o n > b e f o r e C a p t i o n < / b e f o r e C a p t i o n >   
                  < / A g i n g B a n d L o o p >   
@@ -7341,13 +7341,13 @@
  
          < / I n t e g e r >   
-         < L e t t e r T e x t   E l e m e n t T y p e = " D a t a I t e m "   E l e m e n t I d = " 1 5 1 0 3 5 3 8 3 4 " > - 
-             < B o d y T e x t   E l e m e n t T y p e = " C o l u m n "   E l e m e n t I d = " 1 4 9 7 5 9 8 0 8 "   D a t a T y p e = " L a b e l " > B o d y T e x t < / B o d y T e x t > - 
-             < C l o s i n g T e x t   E l e m e n t T y p e = " C o l u m n "   E l e m e n t I d = " 5 1 2 1 3 5 9 0 9 "   D a t a T y p e = " L a b e l " > C l o s i n g T e x t < / C l o s i n g T e x t > - 
-             < G r e e t i n g T e x t   E l e m e n t T y p e = " C o l u m n "   E l e m e n t I d = " 1 1 7 5 2 7 9 2 8 9 "   D a t a T y p e = " L a b e l " > G r e e t i n g T e x t < / G r e e t i n g T e x t > +         < L e t t e r T e x t > + 
+             < B o d y T e x t > B o d y T e x t < / B o d y T e x t > + 
+             < C l o s i n g T e x t > C l o s i n g T e x t < / C l o s i n g T e x t > + 
+             < G r e e t i n g T e x t > G r e e t i n g T e x t < / G r e e t i n g T e x t >   
          < / L e t t e r T e x t >   

</xml_diff>

<commit_message>
Update Scan QR Function v2.0
</commit_message>
<xml_diff>
--- a/ReportLayout/CustomerStatement.docx
+++ b/ReportLayout/CustomerStatement.docx
@@ -6980,6 +6980,8 @@
  
                          < O v e r d u e B a l a n c e   E l e m e n t T y p e = " C o l u m n "   E l e m e n t I d = " 1 1 8 6 1 4 8 4 3 9 "   D a t a T y p e = " D e c i m a l " > O v e r d u e B a l a n c e < / O v e r d u e B a l a n c e >   
+                         < O v e r d u e B a l a n c e L C Y   E l e m e n t T y p e = " C o l u m n "   E l e m e n t I d = " 6 3 0 8 5 2 0 6 3 "   D a t a T y p e = " D e c i m a l " > O v e r d u e B a l a n c e L C Y < / O v e r d u e B a l a n c e L C Y > + 
                      < / O v e r d u e E n t r y F o o d e r >   
                  < / O v e r d u e V i s i b l e > @@ -7282,6 +7284,8 @@
                      < O v e r d u e E n t r y F o o d e r >   
                          < O v e r d u e B a l a n c e > O v e r d u e B a l a n c e < / O v e r d u e B a l a n c e > + 
+                         < O v e r d u e B a l a n c e L C Y > O v e r d u e B a l a n c e L C Y < / O v e r d u e B a l a n c e L C Y >   
                      < / O v e r d u e E n t r y F o o d e r >   

</xml_diff>